<commit_message>
Add metrics and test predictions for tuberculosis detection
- Created a new JSON file `metriques.json` containing metrics related to tuberculosis detection, including precision, recall, specificity, F1 score, and AUC.
- Added a new CSV file `predictions_test.csv` with test predictions for tuberculosis, including image paths, patient IDs, actual labels, predicted probabilities, and predictions.
</commit_message>
<xml_diff>
--- a/Fichiers/PROJET MEMOIRE-ALAWO Adeshina Néhémiah.docx
+++ b/Fichiers/PROJET MEMOIRE-ALAWO Adeshina Néhémiah.docx
@@ -1,6 +1,6 @@
 
 <file path=word/document.xml><?xml version="1.0" encoding="utf-8"?>
-<w:document xmlns:wpc="http://schemas.microsoft.com/office/word/2010/wordprocessingCanvas" xmlns:cx="http://schemas.microsoft.com/office/drawing/2014/chartex" xmlns:mc="http://schemas.openxmlformats.org/markup-compatibility/2006" xmlns:o="urn:schemas-microsoft-com:office:office" xmlns:r="http://schemas.openxmlformats.org/officeDocument/2006/relationships" xmlns:m="http://schemas.openxmlformats.org/officeDocument/2006/math" xmlns:v="urn:schemas-microsoft-com:vml" xmlns:wp14="http://schemas.microsoft.com/office/word/2010/wordprocessingDrawing" xmlns:wp="http://schemas.openxmlformats.org/drawingml/2006/wordprocessingDrawing" xmlns:w10="urn:schemas-microsoft-com:office:word" xmlns:w="http://schemas.openxmlformats.org/wordprocessingml/2006/main" xmlns:w14="http://schemas.microsoft.com/office/word/2010/wordml" xmlns:w15="http://schemas.microsoft.com/office/word/2012/wordml" xmlns:w16se="http://schemas.microsoft.com/office/word/2015/wordml/symex" xmlns:wpg="http://schemas.microsoft.com/office/word/2010/wordprocessingGroup" xmlns:wpi="http://schemas.microsoft.com/office/word/2010/wordprocessingInk" xmlns:wne="http://schemas.microsoft.com/office/word/2006/wordml" xmlns:wps="http://schemas.microsoft.com/office/word/2010/wordprocessingShape" mc:Ignorable="w14 w15 w16se wp14">
+<w:document xmlns:wpc="http://schemas.microsoft.com/office/word/2010/wordprocessingCanvas" xmlns:cx="http://schemas.microsoft.com/office/drawing/2014/chartex" xmlns:cx1="http://schemas.microsoft.com/office/drawing/2015/9/8/chartex" xmlns:cx2="http://schemas.microsoft.com/office/drawing/2015/10/21/chartex" xmlns:cx3="http://schemas.microsoft.com/office/drawing/2016/5/9/chartex" xmlns:cx4="http://schemas.microsoft.com/office/drawing/2016/5/10/chartex" xmlns:cx5="http://schemas.microsoft.com/office/drawing/2016/5/11/chartex" xmlns:cx6="http://schemas.microsoft.com/office/drawing/2016/5/12/chartex" xmlns:cx7="http://schemas.microsoft.com/office/drawing/2016/5/13/chartex" xmlns:cx8="http://schemas.microsoft.com/office/drawing/2016/5/14/chartex" xmlns:mc="http://schemas.openxmlformats.org/markup-compatibility/2006" xmlns:aink="http://schemas.microsoft.com/office/drawing/2016/ink" xmlns:am3d="http://schemas.microsoft.com/office/drawing/2017/model3d" xmlns:o="urn:schemas-microsoft-com:office:office" xmlns:oel="http://schemas.microsoft.com/office/2019/extlst" xmlns:r="http://schemas.openxmlformats.org/officeDocument/2006/relationships" xmlns:m="http://schemas.openxmlformats.org/officeDocument/2006/math" xmlns:v="urn:schemas-microsoft-com:vml" xmlns:wp14="http://schemas.microsoft.com/office/word/2010/wordprocessingDrawing" xmlns:wp="http://schemas.openxmlformats.org/drawingml/2006/wordprocessingDrawing" xmlns:w10="urn:schemas-microsoft-com:office:word" xmlns:w="http://schemas.openxmlformats.org/wordprocessingml/2006/main" xmlns:w14="http://schemas.microsoft.com/office/word/2010/wordml" xmlns:w15="http://schemas.microsoft.com/office/word/2012/wordml" xmlns:w16cex="http://schemas.microsoft.com/office/word/2018/wordml/cex" xmlns:w16cid="http://schemas.microsoft.com/office/word/2016/wordml/cid" xmlns:w16="http://schemas.microsoft.com/office/word/2018/wordml" xmlns:w16du="http://schemas.microsoft.com/office/word/2023/wordml/word16du" xmlns:w16sdtdh="http://schemas.microsoft.com/office/word/2020/wordml/sdtdatahash" xmlns:w16sdtfl="http://schemas.microsoft.com/office/word/2024/wordml/sdtformatlock" xmlns:w16se="http://schemas.microsoft.com/office/word/2015/wordml/symex" xmlns:wpg="http://schemas.microsoft.com/office/word/2010/wordprocessingGroup" xmlns:wpi="http://schemas.microsoft.com/office/word/2010/wordprocessingInk" xmlns:wne="http://schemas.microsoft.com/office/word/2006/wordml" xmlns:wps="http://schemas.microsoft.com/office/word/2010/wordprocessingShape" mc:Ignorable="w14 w15 w16se w16cid w16 w16cex w16sdtdh w16sdtfl w16du wp14">
   <w:body>
     <w:p>
       <w:pPr>
@@ -112,7 +112,7 @@
     </w:p>
     <w:p>
       <w:pPr>
-        <w:pStyle w:val="Heading1"/>
+        <w:pStyle w:val="Titre1"/>
         <w:rPr>
           <w:lang w:val="fr-FR"/>
         </w:rPr>
@@ -128,7 +128,7 @@
     </w:p>
     <w:p>
       <w:pPr>
-        <w:pStyle w:val="Heading1"/>
+        <w:pStyle w:val="Titre1"/>
       </w:pPr>
       <w:bookmarkStart w:id="1" w:name="_Toc185448557"/>
       <w:bookmarkStart w:id="2" w:name="_Toc185448577"/>
@@ -157,7 +157,7 @@
     </w:p>
     <w:p>
       <w:pPr>
-        <w:pStyle w:val="Heading1"/>
+        <w:pStyle w:val="Titre1"/>
       </w:pPr>
       <w:bookmarkStart w:id="3" w:name="_Toc185448558"/>
       <w:bookmarkStart w:id="4" w:name="_Toc185448578"/>
@@ -186,7 +186,7 @@
     </w:p>
     <w:p>
       <w:pPr>
-        <w:pStyle w:val="Heading1"/>
+        <w:pStyle w:val="Titre1"/>
       </w:pPr>
       <w:bookmarkStart w:id="5" w:name="_Toc185448559"/>
       <w:bookmarkStart w:id="6" w:name="_Toc185448579"/>
@@ -205,7 +205,7 @@
     </w:p>
     <w:p>
       <w:pPr>
-        <w:pStyle w:val="TOC1"/>
+        <w:pStyle w:val="TM1"/>
         <w:tabs>
           <w:tab w:val="right" w:leader="underscore" w:pos="9396"/>
         </w:tabs>
@@ -232,7 +232,7 @@
       <w:hyperlink w:anchor="_Toc185448557" w:history="1">
         <w:r>
           <w:rPr>
-            <w:rStyle w:val="Hyperlink"/>
+            <w:rStyle w:val="Lienhypertexte"/>
             <w:noProof/>
           </w:rPr>
           <w:t>Dédicaces</w:t>
@@ -289,7 +289,7 @@
     </w:p>
     <w:p>
       <w:pPr>
-        <w:pStyle w:val="TOC1"/>
+        <w:pStyle w:val="TM1"/>
         <w:tabs>
           <w:tab w:val="right" w:leader="underscore" w:pos="9396"/>
         </w:tabs>
@@ -307,7 +307,7 @@
       <w:hyperlink w:anchor="_Toc185448558" w:history="1">
         <w:r>
           <w:rPr>
-            <w:rStyle w:val="Hyperlink"/>
+            <w:rStyle w:val="Lienhypertexte"/>
             <w:noProof/>
           </w:rPr>
           <w:t>Remerciements</w:t>
@@ -364,7 +364,7 @@
     </w:p>
     <w:p>
       <w:pPr>
-        <w:pStyle w:val="TOC1"/>
+        <w:pStyle w:val="TM1"/>
         <w:tabs>
           <w:tab w:val="right" w:leader="underscore" w:pos="9396"/>
         </w:tabs>
@@ -382,7 +382,7 @@
       <w:hyperlink w:anchor="_Toc185448559" w:history="1">
         <w:r>
           <w:rPr>
-            <w:rStyle w:val="Hyperlink"/>
+            <w:rStyle w:val="Lienhypertexte"/>
             <w:noProof/>
           </w:rPr>
           <w:t>Sommaire</w:t>
@@ -439,7 +439,7 @@
     </w:p>
     <w:p>
       <w:pPr>
-        <w:pStyle w:val="TOC1"/>
+        <w:pStyle w:val="TM1"/>
         <w:tabs>
           <w:tab w:val="right" w:leader="underscore" w:pos="9396"/>
         </w:tabs>
@@ -457,7 +457,7 @@
       <w:hyperlink w:anchor="_Toc185448560" w:history="1">
         <w:r>
           <w:rPr>
-            <w:rStyle w:val="Hyperlink"/>
+            <w:rStyle w:val="Lienhypertexte"/>
             <w:noProof/>
           </w:rPr>
           <w:t>Liste des figures</w:t>
@@ -514,7 +514,7 @@
     </w:p>
     <w:p>
       <w:pPr>
-        <w:pStyle w:val="TOC1"/>
+        <w:pStyle w:val="TM1"/>
         <w:tabs>
           <w:tab w:val="right" w:leader="underscore" w:pos="9396"/>
         </w:tabs>
@@ -532,7 +532,7 @@
       <w:hyperlink w:anchor="_Toc185448561" w:history="1">
         <w:r>
           <w:rPr>
-            <w:rStyle w:val="Hyperlink"/>
+            <w:rStyle w:val="Lienhypertexte"/>
             <w:noProof/>
           </w:rPr>
           <w:t>Liste des tableaux</w:t>
@@ -589,7 +589,7 @@
     </w:p>
     <w:p>
       <w:pPr>
-        <w:pStyle w:val="TOC1"/>
+        <w:pStyle w:val="TM1"/>
         <w:tabs>
           <w:tab w:val="right" w:leader="underscore" w:pos="9396"/>
         </w:tabs>
@@ -607,7 +607,7 @@
       <w:hyperlink w:anchor="_Toc185448562" w:history="1">
         <w:r>
           <w:rPr>
-            <w:rStyle w:val="Hyperlink"/>
+            <w:rStyle w:val="Lienhypertexte"/>
             <w:noProof/>
           </w:rPr>
           <w:t>Liste des sigles et des abreviations</w:t>
@@ -664,7 +664,7 @@
     </w:p>
     <w:p>
       <w:pPr>
-        <w:pStyle w:val="TOC1"/>
+        <w:pStyle w:val="TM1"/>
         <w:tabs>
           <w:tab w:val="right" w:leader="underscore" w:pos="9396"/>
         </w:tabs>
@@ -682,7 +682,7 @@
       <w:hyperlink w:anchor="_Toc185448563" w:history="1">
         <w:r>
           <w:rPr>
-            <w:rStyle w:val="Hyperlink"/>
+            <w:rStyle w:val="Lienhypertexte"/>
             <w:noProof/>
           </w:rPr>
           <w:t>Résumé</w:t>
@@ -739,7 +739,7 @@
     </w:p>
     <w:p>
       <w:pPr>
-        <w:pStyle w:val="TOC1"/>
+        <w:pStyle w:val="TM1"/>
         <w:tabs>
           <w:tab w:val="right" w:leader="underscore" w:pos="9396"/>
         </w:tabs>
@@ -757,7 +757,7 @@
       <w:hyperlink w:anchor="_Toc185448564" w:history="1">
         <w:r>
           <w:rPr>
-            <w:rStyle w:val="Hyperlink"/>
+            <w:rStyle w:val="Lienhypertexte"/>
             <w:noProof/>
           </w:rPr>
           <w:t>Abstract</w:t>
@@ -814,7 +814,7 @@
     </w:p>
     <w:p>
       <w:pPr>
-        <w:pStyle w:val="TOC1"/>
+        <w:pStyle w:val="TM1"/>
         <w:tabs>
           <w:tab w:val="right" w:leader="underscore" w:pos="9396"/>
         </w:tabs>
@@ -832,7 +832,7 @@
       <w:hyperlink w:anchor="_Toc185448565" w:history="1">
         <w:r>
           <w:rPr>
-            <w:rStyle w:val="Hyperlink"/>
+            <w:rStyle w:val="Lienhypertexte"/>
             <w:noProof/>
           </w:rPr>
           <w:t>Introduction Générale</w:t>
@@ -889,7 +889,7 @@
     </w:p>
     <w:p>
       <w:pPr>
-        <w:pStyle w:val="TOC2"/>
+        <w:pStyle w:val="TM2"/>
         <w:tabs>
           <w:tab w:val="right" w:leader="underscore" w:pos="9396"/>
         </w:tabs>
@@ -907,7 +907,7 @@
       <w:hyperlink w:anchor="_Toc185448566" w:history="1">
         <w:r>
           <w:rPr>
-            <w:rStyle w:val="Hyperlink"/>
+            <w:rStyle w:val="Lienhypertexte"/>
             <w:noProof/>
           </w:rPr>
           <w:t>1. Chapitre1</w:t>
@@ -964,7 +964,7 @@
     </w:p>
     <w:p>
       <w:pPr>
-        <w:pStyle w:val="TOC3"/>
+        <w:pStyle w:val="TM3"/>
         <w:tabs>
           <w:tab w:val="right" w:leader="underscore" w:pos="9396"/>
         </w:tabs>
@@ -980,7 +980,7 @@
       <w:hyperlink w:anchor="_Toc185448567" w:history="1">
         <w:r>
           <w:rPr>
-            <w:rStyle w:val="Hyperlink"/>
+            <w:rStyle w:val="Lienhypertexte"/>
             <w:noProof/>
           </w:rPr>
           <w:t>1.1. Introduction du chapitre</w:t>
@@ -1037,7 +1037,7 @@
     </w:p>
     <w:p>
       <w:pPr>
-        <w:pStyle w:val="TOC3"/>
+        <w:pStyle w:val="TM3"/>
         <w:tabs>
           <w:tab w:val="right" w:leader="underscore" w:pos="9396"/>
         </w:tabs>
@@ -1053,14 +1053,14 @@
       <w:hyperlink w:anchor="_Toc185448568" w:history="1">
         <w:r>
           <w:rPr>
-            <w:rStyle w:val="Hyperlink"/>
+            <w:rStyle w:val="Lienhypertexte"/>
             <w:noProof/>
           </w:rPr>
           <w:t>1.2. Sous chapitr</w:t>
         </w:r>
         <w:r>
           <w:rPr>
-            <w:rStyle w:val="Hyperlink"/>
+            <w:rStyle w:val="Lienhypertexte"/>
             <w:noProof/>
           </w:rPr>
           <w:t>e</w:t>
@@ -1117,7 +1117,7 @@
     </w:p>
     <w:p>
       <w:pPr>
-        <w:pStyle w:val="TOC3"/>
+        <w:pStyle w:val="TM3"/>
         <w:tabs>
           <w:tab w:val="right" w:leader="underscore" w:pos="9396"/>
         </w:tabs>
@@ -1133,7 +1133,7 @@
       <w:hyperlink w:anchor="_Toc185448569" w:history="1">
         <w:r>
           <w:rPr>
-            <w:rStyle w:val="Hyperlink"/>
+            <w:rStyle w:val="Lienhypertexte"/>
             <w:noProof/>
           </w:rPr>
           <w:t>1.3. Sous chapitre</w:t>
@@ -1190,7 +1190,7 @@
     </w:p>
     <w:p>
       <w:pPr>
-        <w:pStyle w:val="TOC3"/>
+        <w:pStyle w:val="TM3"/>
         <w:tabs>
           <w:tab w:val="right" w:leader="underscore" w:pos="9396"/>
         </w:tabs>
@@ -1206,7 +1206,7 @@
       <w:hyperlink w:anchor="_Toc185448570" w:history="1">
         <w:r>
           <w:rPr>
-            <w:rStyle w:val="Hyperlink"/>
+            <w:rStyle w:val="Lienhypertexte"/>
             <w:noProof/>
           </w:rPr>
           <w:t>1.4. Conclusion du chapitre</w:t>
@@ -1263,7 +1263,7 @@
     </w:p>
     <w:p>
       <w:pPr>
-        <w:pStyle w:val="TOC2"/>
+        <w:pStyle w:val="TM2"/>
         <w:tabs>
           <w:tab w:val="right" w:leader="underscore" w:pos="9396"/>
         </w:tabs>
@@ -1281,7 +1281,7 @@
       <w:hyperlink w:anchor="_Toc185448571" w:history="1">
         <w:r>
           <w:rPr>
-            <w:rStyle w:val="Hyperlink"/>
+            <w:rStyle w:val="Lienhypertexte"/>
             <w:noProof/>
           </w:rPr>
           <w:t>2. Chapitre2</w:t>
@@ -1338,7 +1338,7 @@
     </w:p>
     <w:p>
       <w:pPr>
-        <w:pStyle w:val="TOC2"/>
+        <w:pStyle w:val="TM2"/>
         <w:tabs>
           <w:tab w:val="right" w:leader="underscore" w:pos="9396"/>
         </w:tabs>
@@ -1356,7 +1356,7 @@
       <w:hyperlink w:anchor="_Toc185448572" w:history="1">
         <w:r>
           <w:rPr>
-            <w:rStyle w:val="Hyperlink"/>
+            <w:rStyle w:val="Lienhypertexte"/>
             <w:noProof/>
           </w:rPr>
           <w:t>3. Chapitre3</w:t>
@@ -1413,7 +1413,7 @@
     </w:p>
     <w:p>
       <w:pPr>
-        <w:pStyle w:val="TOC1"/>
+        <w:pStyle w:val="TM1"/>
         <w:tabs>
           <w:tab w:val="right" w:leader="underscore" w:pos="9396"/>
         </w:tabs>
@@ -1431,7 +1431,7 @@
       <w:hyperlink w:anchor="_Toc185448573" w:history="1">
         <w:r>
           <w:rPr>
-            <w:rStyle w:val="Hyperlink"/>
+            <w:rStyle w:val="Lienhypertexte"/>
             <w:noProof/>
           </w:rPr>
           <w:t>Conclusion Générale</w:t>
@@ -1488,7 +1488,7 @@
     </w:p>
     <w:p>
       <w:pPr>
-        <w:pStyle w:val="TOC1"/>
+        <w:pStyle w:val="TM1"/>
         <w:tabs>
           <w:tab w:val="right" w:leader="underscore" w:pos="9396"/>
         </w:tabs>
@@ -1506,7 +1506,7 @@
       <w:hyperlink w:anchor="_Toc185448574" w:history="1">
         <w:r>
           <w:rPr>
-            <w:rStyle w:val="Hyperlink"/>
+            <w:rStyle w:val="Lienhypertexte"/>
             <w:noProof/>
           </w:rPr>
           <w:t>Bibliographie</w:t>
@@ -1563,7 +1563,7 @@
     </w:p>
     <w:p>
       <w:pPr>
-        <w:pStyle w:val="TOC1"/>
+        <w:pStyle w:val="TM1"/>
         <w:tabs>
           <w:tab w:val="right" w:leader="underscore" w:pos="9396"/>
         </w:tabs>
@@ -1581,7 +1581,7 @@
       <w:hyperlink w:anchor="_Toc185448575" w:history="1">
         <w:r>
           <w:rPr>
-            <w:rStyle w:val="Hyperlink"/>
+            <w:rStyle w:val="Lienhypertexte"/>
             <w:noProof/>
           </w:rPr>
           <w:t>Table des matières</w:t>
@@ -1638,7 +1638,7 @@
     </w:p>
     <w:p>
       <w:pPr>
-        <w:pStyle w:val="TOC1"/>
+        <w:pStyle w:val="TM1"/>
         <w:tabs>
           <w:tab w:val="right" w:leader="underscore" w:pos="9396"/>
         </w:tabs>
@@ -1656,7 +1656,7 @@
       <w:hyperlink w:anchor="_Toc185448576" w:history="1">
         <w:r>
           <w:rPr>
-            <w:rStyle w:val="Hyperlink"/>
+            <w:rStyle w:val="Lienhypertexte"/>
             <w:noProof/>
           </w:rPr>
           <w:t>Annexes</w:t>
@@ -1734,7 +1734,7 @@
     </w:p>
     <w:p>
       <w:pPr>
-        <w:pStyle w:val="Heading1"/>
+        <w:pStyle w:val="Titre1"/>
       </w:pPr>
       <w:bookmarkStart w:id="7" w:name="_Toc185448560"/>
       <w:bookmarkStart w:id="8" w:name="_Toc185448580"/>
@@ -1747,7 +1747,7 @@
     </w:p>
     <w:p>
       <w:pPr>
-        <w:pStyle w:val="TableofFigures"/>
+        <w:pStyle w:val="Tabledesillustrations"/>
         <w:tabs>
           <w:tab w:val="right" w:leader="underscore" w:pos="9396"/>
         </w:tabs>
@@ -1774,14 +1774,14 @@
       <w:hyperlink w:anchor="_Toc185447588" w:history="1">
         <w:r>
           <w:rPr>
-            <w:rStyle w:val="Hyperlink"/>
+            <w:rStyle w:val="Lienhypertexte"/>
             <w:noProof/>
           </w:rPr>
           <w:t>Figure 1</w:t>
         </w:r>
         <w:r>
           <w:rPr>
-            <w:rStyle w:val="Hyperlink"/>
+            <w:rStyle w:val="Lienhypertexte"/>
             <w:noProof/>
           </w:rPr>
           <w:noBreakHyphen/>
@@ -1839,7 +1839,7 @@
     </w:p>
     <w:p>
       <w:pPr>
-        <w:pStyle w:val="TableofFigures"/>
+        <w:pStyle w:val="Tabledesillustrations"/>
         <w:tabs>
           <w:tab w:val="right" w:leader="underscore" w:pos="9396"/>
         </w:tabs>
@@ -1857,14 +1857,14 @@
       <w:hyperlink w:anchor="_Toc185447589" w:history="1">
         <w:r>
           <w:rPr>
-            <w:rStyle w:val="Hyperlink"/>
+            <w:rStyle w:val="Lienhypertexte"/>
             <w:noProof/>
           </w:rPr>
           <w:t>Figure 1</w:t>
         </w:r>
         <w:r>
           <w:rPr>
-            <w:rStyle w:val="Hyperlink"/>
+            <w:rStyle w:val="Lienhypertexte"/>
             <w:noProof/>
           </w:rPr>
           <w:noBreakHyphen/>
@@ -1922,7 +1922,7 @@
     </w:p>
     <w:p>
       <w:pPr>
-        <w:pStyle w:val="TableofFigures"/>
+        <w:pStyle w:val="Tabledesillustrations"/>
         <w:tabs>
           <w:tab w:val="right" w:leader="underscore" w:pos="9396"/>
         </w:tabs>
@@ -1940,14 +1940,14 @@
       <w:hyperlink w:anchor="_Toc185447590" w:history="1">
         <w:r>
           <w:rPr>
-            <w:rStyle w:val="Hyperlink"/>
+            <w:rStyle w:val="Lienhypertexte"/>
             <w:noProof/>
           </w:rPr>
           <w:t>Figure 1</w:t>
         </w:r>
         <w:r>
           <w:rPr>
-            <w:rStyle w:val="Hyperlink"/>
+            <w:rStyle w:val="Lienhypertexte"/>
             <w:noProof/>
           </w:rPr>
           <w:noBreakHyphen/>
@@ -2005,7 +2005,7 @@
     </w:p>
     <w:p>
       <w:pPr>
-        <w:pStyle w:val="TableofFigures"/>
+        <w:pStyle w:val="Tabledesillustrations"/>
         <w:tabs>
           <w:tab w:val="right" w:leader="underscore" w:pos="9396"/>
         </w:tabs>
@@ -2023,14 +2023,14 @@
       <w:hyperlink w:anchor="_Toc185447591" w:history="1">
         <w:r>
           <w:rPr>
-            <w:rStyle w:val="Hyperlink"/>
+            <w:rStyle w:val="Lienhypertexte"/>
             <w:noProof/>
           </w:rPr>
           <w:t>Figure 3</w:t>
         </w:r>
         <w:r>
           <w:rPr>
-            <w:rStyle w:val="Hyperlink"/>
+            <w:rStyle w:val="Lienhypertexte"/>
             <w:noProof/>
           </w:rPr>
           <w:noBreakHyphen/>
@@ -2109,7 +2109,7 @@
     </w:p>
     <w:p>
       <w:pPr>
-        <w:pStyle w:val="Heading1"/>
+        <w:pStyle w:val="Titre1"/>
       </w:pPr>
       <w:bookmarkStart w:id="9" w:name="_Toc185448561"/>
       <w:bookmarkStart w:id="10" w:name="_Toc185448581"/>
@@ -2122,7 +2122,7 @@
     </w:p>
     <w:p>
       <w:pPr>
-        <w:pStyle w:val="TableofFigures"/>
+        <w:pStyle w:val="Tabledesillustrations"/>
         <w:tabs>
           <w:tab w:val="right" w:leader="underscore" w:pos="9396"/>
         </w:tabs>
@@ -2149,7 +2149,7 @@
       <w:hyperlink w:anchor="_Toc185448215" w:history="1">
         <w:r>
           <w:rPr>
-            <w:rStyle w:val="Hyperlink"/>
+            <w:rStyle w:val="Lienhypertexte"/>
             <w:noProof/>
           </w:rPr>
           <w:t>Table 1:Tableau3</w:t>
@@ -2206,7 +2206,7 @@
     </w:p>
     <w:p>
       <w:pPr>
-        <w:pStyle w:val="TableofFigures"/>
+        <w:pStyle w:val="Tabledesillustrations"/>
         <w:tabs>
           <w:tab w:val="right" w:leader="underscore" w:pos="9396"/>
         </w:tabs>
@@ -2224,7 +2224,7 @@
       <w:hyperlink w:anchor="_Toc185448216" w:history="1">
         <w:r>
           <w:rPr>
-            <w:rStyle w:val="Hyperlink"/>
+            <w:rStyle w:val="Lienhypertexte"/>
             <w:noProof/>
           </w:rPr>
           <w:t>Table 2:Tableau 1</w:t>
@@ -2281,7 +2281,7 @@
     </w:p>
     <w:p>
       <w:pPr>
-        <w:pStyle w:val="TableofFigures"/>
+        <w:pStyle w:val="Tabledesillustrations"/>
         <w:tabs>
           <w:tab w:val="right" w:leader="underscore" w:pos="9396"/>
         </w:tabs>
@@ -2299,7 +2299,7 @@
       <w:hyperlink w:anchor="_Toc185448217" w:history="1">
         <w:r>
           <w:rPr>
-            <w:rStyle w:val="Hyperlink"/>
+            <w:rStyle w:val="Lienhypertexte"/>
             <w:noProof/>
           </w:rPr>
           <w:t>Table 3:Tableau2</w:t>
@@ -2377,7 +2377,7 @@
     </w:p>
     <w:p>
       <w:pPr>
-        <w:pStyle w:val="Heading1"/>
+        <w:pStyle w:val="Titre1"/>
         <w:rPr>
           <w:lang w:val="fr-FR"/>
         </w:rPr>
@@ -2422,7 +2422,7 @@
     </w:p>
     <w:p>
       <w:pPr>
-        <w:pStyle w:val="Heading1"/>
+        <w:pStyle w:val="Titre1"/>
       </w:pPr>
       <w:bookmarkStart w:id="13" w:name="_Toc185448563"/>
       <w:bookmarkStart w:id="14" w:name="_Toc185448583"/>
@@ -2451,7 +2451,7 @@
     </w:p>
     <w:p>
       <w:pPr>
-        <w:pStyle w:val="Heading1"/>
+        <w:pStyle w:val="Titre1"/>
       </w:pPr>
       <w:bookmarkStart w:id="15" w:name="_Toc185448564"/>
       <w:bookmarkStart w:id="16" w:name="_Toc185448584"/>
@@ -2464,7 +2464,7 @@
     </w:p>
     <w:p>
       <w:pPr>
-        <w:pStyle w:val="Heading1"/>
+        <w:pStyle w:val="Titre1"/>
         <w:sectPr>
           <w:headerReference w:type="default" r:id="rId11"/>
           <w:footerReference w:type="default" r:id="rId12"/>
@@ -2478,7 +2478,7 @@
     </w:p>
     <w:p>
       <w:pPr>
-        <w:pStyle w:val="Heading1"/>
+        <w:pStyle w:val="Titre1"/>
       </w:pPr>
       <w:bookmarkStart w:id="17" w:name="_Toc185448565"/>
       <w:bookmarkStart w:id="18" w:name="_Toc185448585"/>
@@ -2517,12 +2517,12 @@
     <w:p>
       <w:pPr>
         <w:rPr>
-          <w:lang w:val="fr-FR"/>
-        </w:rPr>
-      </w:pPr>
-      <w:r>
-        <w:rPr>
-          <w:lang w:val="fr-FR"/>
+          <w:lang w:val="fr-TG"/>
+        </w:rPr>
+      </w:pPr>
+      <w:r>
+        <w:rPr>
+          <w:lang w:val="fr-TG"/>
         </w:rPr>
         <w:t>Chaque année, des millions de personnes meurent de maladies pulmonaires dont le diagnostic aurait pu être posé plus tôt. En 2023, la tuberculose a tué 1,25 million de personnes — pour 10,8 millions de nouveaux cas recensés dans le monde (OMS, 2024a) — tandis que la pneumonie emportait 610 000 enfants de moins de cinq ans, dont plus de la moitié en Afrique subsaharienne (OMS, 2024b). Ces données ne sont pas des abstractions statistiques : elles traduisent une réalité clinique brutale, celle de systèmes de santé débordés, souvent incapables d'assurer un dépistage précoce dans des délais compatibles avec une prise en charge efficace. La pandémie de COVID-19 n'a fait qu'accentuer cette fragilité, révélant à quel point les infrastructures diagnostiques restent insuffisantes là où le besoin est le plus urgent.</w:t>
       </w:r>
@@ -2530,110 +2530,96 @@
     <w:p>
       <w:pPr>
         <w:rPr>
-          <w:lang w:val="fr-FR"/>
-        </w:rPr>
-      </w:pPr>
-    </w:p>
-    <w:p>
-      <w:pPr>
-        <w:rPr>
-          <w:lang w:val="fr-FR"/>
-        </w:rPr>
-      </w:pPr>
-      <w:r>
-        <w:rPr>
-          <w:lang w:val="fr-FR"/>
-        </w:rPr>
-        <w:t>La radiographie thoracique est, dans ce tableau, l'outil de premier recours. Accessible, relativement peu coûteuse, elle permet de visualiser les anomalies parenchymateuses caractéristiques de la plupart des affections pulmonaires — et c'est précisément ce qui en fait une ressource précieuse dans les environnements à faibles ressources. Mais son utilité se heurte à une contrainte difficilement contournable : l'interprétation d'un cliché exige un radiologue qualifié. Or, en Afrique subsaharienne, on compte à peine 0,9 radiologue par million d'habitants, contre 47 à 110 en Europe (Auteurs à confirmer, 2023) [À VALIDER — référence [10]]. De fait, les images s'accumulent, les rapports tardent, et des patients attendent un diagnostic que personne n'est disponible pour formuler.</w:t>
-      </w:r>
-    </w:p>
-    <w:p>
-      <w:pPr>
-        <w:rPr>
-          <w:lang w:val="fr-FR"/>
-        </w:rPr>
-      </w:pPr>
-    </w:p>
-    <w:p>
-      <w:pPr>
-        <w:rPr>
-          <w:lang w:val="fr-FR"/>
-        </w:rPr>
-      </w:pPr>
-      <w:r>
-        <w:rPr>
-          <w:lang w:val="fr-FR"/>
+          <w:lang w:val="fr-TG"/>
+        </w:rPr>
+      </w:pPr>
+      <w:r>
+        <w:rPr>
+          <w:lang w:val="fr-TG"/>
+        </w:rPr>
+        <w:t>La radiographie thoracique est, dans ce tableau, l'outil de premier recours. Accessible, relativement peu coûteuse, elle permet de visualiser les anomalies parenchymateuses caractéristiques de la plupart des affections pulmonaires — et c'est précisément ce qui en fait une ressource précieuse dans les environnements à faibles ressources. Mais son utilité se heurte à une contrainte difficilement contournable : l'interprétation d'un cliché exige un radiologue qualifié. Or, en Afrique subsaharienne, on compte à peine 0,9 radiologue par million d'habitants, contre 47 à 110 en Europe (Karera et al., 2024). De fait, les images s'accumulent, les rapports tardent, et des patients attendent un diagnostic que personne n'est disponible pour formuler.</w:t>
+      </w:r>
+    </w:p>
+    <w:p>
+      <w:pPr>
+        <w:rPr>
+          <w:lang w:val="fr-TG"/>
+        </w:rPr>
+      </w:pPr>
+      <w:r>
+        <w:rPr>
+          <w:lang w:val="fr-TG"/>
         </w:rPr>
         <w:t xml:space="preserve">C'est face à ce goulot d'étranglement que l'intelligence artificielle — les réseaux de neurones </w:t>
       </w:r>
       <w:proofErr w:type="spellStart"/>
       <w:r>
         <w:rPr>
-          <w:lang w:val="fr-FR"/>
+          <w:lang w:val="fr-TG"/>
         </w:rPr>
         <w:t>convolutionnels</w:t>
       </w:r>
       <w:proofErr w:type="spellEnd"/>
       <w:r>
         <w:rPr>
-          <w:lang w:val="fr-FR"/>
+          <w:lang w:val="fr-TG"/>
         </w:rPr>
         <w:t xml:space="preserve"> (CNN) en particulier — a commencé à s'imposer comme une réponse plausible, sinon incontournable. </w:t>
       </w:r>
       <w:proofErr w:type="spellStart"/>
       <w:r>
         <w:rPr>
-          <w:lang w:val="fr-FR"/>
+          <w:lang w:val="fr-TG"/>
         </w:rPr>
         <w:t>LeCun</w:t>
       </w:r>
       <w:proofErr w:type="spellEnd"/>
       <w:r>
         <w:rPr>
-          <w:lang w:val="fr-FR"/>
+          <w:lang w:val="fr-TG"/>
         </w:rPr>
         <w:t xml:space="preserve"> et al. (2015) ont montré que ces architectures sont capables d'extraire, directement depuis les pixels, des représentations hiérarchiques que nul ingénieur n'aurait su formaliser à la main. Quelques années plus tard, </w:t>
       </w:r>
       <w:proofErr w:type="spellStart"/>
       <w:r>
         <w:rPr>
-          <w:lang w:val="fr-FR"/>
+          <w:lang w:val="fr-TG"/>
         </w:rPr>
         <w:t>Rajpurkar</w:t>
       </w:r>
       <w:proofErr w:type="spellEnd"/>
       <w:r>
         <w:rPr>
-          <w:lang w:val="fr-FR"/>
+          <w:lang w:val="fr-TG"/>
         </w:rPr>
         <w:t xml:space="preserve"> et al. (2017) franchissaient un seuil symbolique avec </w:t>
       </w:r>
       <w:proofErr w:type="spellStart"/>
       <w:r>
         <w:rPr>
-          <w:lang w:val="fr-FR"/>
+          <w:lang w:val="fr-TG"/>
         </w:rPr>
         <w:t>CheXNet</w:t>
       </w:r>
       <w:proofErr w:type="spellEnd"/>
       <w:r>
         <w:rPr>
-          <w:lang w:val="fr-FR"/>
-        </w:rPr>
-        <w:t xml:space="preserve"> : ce modèle fondé </w:t>
-      </w:r>
-      <w:r>
-        <w:rPr>
-          <w:lang w:val="fr-FR"/>
+          <w:lang w:val="fr-TG"/>
+        </w:rPr>
+        <w:t xml:space="preserve"> : ce modèle fondé sur l'architecture DenseNet-121, entraîné sur plus de 100 000 radiographies, surpassait en score F1 la performance diagnostique moyenne de quatre radiologues humains sur la </w:t>
+      </w:r>
+      <w:r>
+        <w:rPr>
+          <w:lang w:val="fr-TG"/>
         </w:rPr>
         <w:lastRenderedPageBreak/>
-        <w:t>sur l'architecture DenseNet-121, entraîné sur plus de 100 000 radiographies, surpassait en score F1 la performance diagnostique moyenne de quatre radiologues humains sur la détection de pneumonie. Ces avancées soulèvent cependant autant de questions qu'elles n'en résolvent.</w:t>
-      </w:r>
-    </w:p>
-    <w:p>
-      <w:pPr>
-        <w:rPr>
-          <w:lang w:val="fr-FR"/>
+        <w:t>détection de pneumonie. Ces avancées soulèvent cependant autant de questions qu'elles n'en résolvent.</w:t>
+      </w:r>
+    </w:p>
+    <w:p>
+      <w:pPr>
+        <w:rPr>
+          <w:lang w:val="fr-TG"/>
         </w:rPr>
       </w:pPr>
     </w:p>
@@ -2727,7 +2713,69 @@
         <w:rPr>
           <w:lang w:val="fr-FR"/>
         </w:rPr>
-        <w:t xml:space="preserve">Nous faisons l'hypothèse qu'un CNN correctement dimensionné et entraîné sur un jeu de données suffisamment diversifié peut atteindre — voire dépasser — les performances diagnostiques de radiologues humains pour la détection des maladies pulmonaires à partir de radiographies thoraciques. Cette position n'est pas spéculative : elle s'ancre dans les preuves empiriques apportées par </w:t>
+        <w:t xml:space="preserve">Nous faisons l'hypothèse qu'un CNN correctement dimensionné et entraîné sur un jeu de données suffisamment diversifié peut atteindre — voire dépasser — les performances diagnostiques de radiologues humains pour la détection des maladies pulmonaires à partir de radiographies thoraciques. Cette position n'est pas spéculative : elle s'ancre dans les preuves empiriques apportées par Rajpurkar et al. (2017), dont les résultats constituent, pour ce travail, à la fois un point de départ et un étalon de comparaison. C'est cette hypothèse que les chapitres suivants s'attacheront à éprouver, à travers des métriques </w:t>
+      </w:r>
+      <w:r>
+        <w:rPr>
+          <w:lang w:val="fr-FR"/>
+        </w:rPr>
+        <w:lastRenderedPageBreak/>
+        <w:t>standardisées et une comparaison rigoureuse avec l'état de l'art. C'est à cette vérification que les objectifs suivants sont consacrés.</w:t>
+      </w:r>
+    </w:p>
+    <w:p>
+      <w:pPr>
+        <w:rPr>
+          <w:lang w:val="fr-FR"/>
+        </w:rPr>
+      </w:pPr>
+    </w:p>
+    <w:p>
+      <w:pPr>
+        <w:rPr>
+          <w:b/>
+          <w:lang w:val="fr-FR"/>
+        </w:rPr>
+      </w:pPr>
+      <w:r>
+        <w:rPr>
+          <w:b/>
+          <w:lang w:val="fr-FR"/>
+        </w:rPr>
+        <w:t>But et objectifs</w:t>
+      </w:r>
+    </w:p>
+    <w:p>
+      <w:pPr>
+        <w:rPr>
+          <w:lang w:val="fr-FR"/>
+        </w:rPr>
+      </w:pPr>
+      <w:r>
+        <w:rPr>
+          <w:lang w:val="fr-FR"/>
+        </w:rPr>
+        <w:t>Ce mémoire a pour ambition de concevoir et d'évaluer un modèle CNN dédié à la détection automatique des maladies pulmonaires à partir de radiographies thoraciques, dans une perspective d'amélioration de l'accès au diagnostic dans les zones sous-médicalisées. Cinq objectifs jalonnent cette démarche :</w:t>
+      </w:r>
+    </w:p>
+    <w:p>
+      <w:pPr>
+        <w:rPr>
+          <w:lang w:val="fr-FR"/>
+        </w:rPr>
+      </w:pPr>
+    </w:p>
+    <w:p>
+      <w:pPr>
+        <w:rPr>
+          <w:lang w:val="fr-FR"/>
+        </w:rPr>
+      </w:pPr>
+      <w:r>
+        <w:rPr>
+          <w:lang w:val="fr-FR"/>
+        </w:rPr>
+        <w:t xml:space="preserve">Constituer et prétraiter un corpus d'images radiographiques à partir de bases de données de référence (Wang et al., 2017 ; </w:t>
       </w:r>
       <w:proofErr w:type="spellStart"/>
       <w:r>
@@ -2741,182 +2789,92 @@
         <w:rPr>
           <w:lang w:val="fr-FR"/>
         </w:rPr>
-        <w:t xml:space="preserve"> et al. (2017), dont les résultats constituent, </w:t>
+        <w:t xml:space="preserve"> et al., 2017) ;</w:t>
+      </w:r>
+    </w:p>
+    <w:p>
+      <w:pPr>
+        <w:rPr>
+          <w:lang w:val="fr-FR"/>
+        </w:rPr>
+      </w:pPr>
+      <w:r>
+        <w:rPr>
+          <w:lang w:val="fr-FR"/>
+        </w:rPr>
+        <w:t>Définir et optimiser une architecture CNN répondant aux exigences de précision et de robustesse propres au contexte médical ;</w:t>
+      </w:r>
+    </w:p>
+    <w:p>
+      <w:pPr>
+        <w:rPr>
+          <w:lang w:val="fr-FR"/>
+        </w:rPr>
+      </w:pPr>
+      <w:r>
+        <w:rPr>
+          <w:lang w:val="fr-FR"/>
+        </w:rPr>
+        <w:t>Mesurer les performances du modèle sur les indicateurs usuels — précision, rappel, F1-score et aire sous la courbe ROC (AUC, Area Under the Curve) — afin d'en quantifier l'efficacité diagnostique ;</w:t>
+      </w:r>
+    </w:p>
+    <w:p>
+      <w:pPr>
+        <w:rPr>
+          <w:lang w:val="fr-FR"/>
+        </w:rPr>
+      </w:pPr>
+      <w:r>
+        <w:rPr>
+          <w:lang w:val="fr-FR"/>
+        </w:rPr>
+        <w:t>Situer ces résultats par rapport aux performances d'experts humains et aux modèles publiés dans la littérature récente ;</w:t>
+      </w:r>
+    </w:p>
+    <w:p>
+      <w:pPr>
+        <w:rPr>
+          <w:lang w:val="fr-FR"/>
+        </w:rPr>
+      </w:pPr>
+      <w:r>
+        <w:rPr>
+          <w:lang w:val="fr-FR"/>
+        </w:rPr>
+        <w:t>Dégager les limites de l'approche retenue et formuler des recommandations à l'intention des praticiens et décideurs concernés par un éventuel déploiement clinique.</w:t>
+      </w:r>
+    </w:p>
+    <w:p>
+      <w:pPr>
+        <w:rPr>
+          <w:lang w:val="fr-FR"/>
+        </w:rPr>
+      </w:pPr>
+      <w:r>
+        <w:rPr>
+          <w:lang w:val="fr-FR"/>
+        </w:rPr>
+        <w:t>Démarche et plan du mémoire</w:t>
+      </w:r>
+    </w:p>
+    <w:p>
+      <w:pPr>
+        <w:rPr>
+          <w:lang w:val="fr-FR"/>
+        </w:rPr>
+      </w:pPr>
+      <w:r>
+        <w:rPr>
+          <w:lang w:val="fr-FR"/>
+        </w:rPr>
+        <w:t xml:space="preserve">La progression du mémoire suit une logique hypothético-déductive en trois temps. Le premier chapitre installe le cadre théorique : épidémiologie des maladies pulmonaires, place de la radiographie thoracique dans la pratique clinique, fondements des CNN et panorama des travaux qui ont posé les jalons de ce champ. Le deuxième chapitre entre dans le concret de la mise en œuvre — choix des données, procédures de prétraitement, architecture du modèle, protocole d'entraînement et métriques retenues. Le troisième chapitre présente et discute les résultats, les confronte à la littérature, et interroge leurs implications cliniques </w:t>
       </w:r>
       <w:r>
         <w:rPr>
           <w:lang w:val="fr-FR"/>
         </w:rPr>
         <w:lastRenderedPageBreak/>
-        <w:t>pour ce travail, à la fois un point de départ et un étalon de comparaison. C'est cette hypothèse que les chapitres suivants s'attacheront à éprouver, à travers des métriques standardisées et une comparaison rigoureuse avec l'état de l'art. C'est à cette vérification que les objectifs suivants sont consacrés.</w:t>
-      </w:r>
-    </w:p>
-    <w:p>
-      <w:pPr>
-        <w:rPr>
-          <w:lang w:val="fr-FR"/>
-        </w:rPr>
-      </w:pPr>
-    </w:p>
-    <w:p>
-      <w:pPr>
-        <w:rPr>
-          <w:b/>
-          <w:lang w:val="fr-FR"/>
-        </w:rPr>
-      </w:pPr>
-      <w:r>
-        <w:rPr>
-          <w:b/>
-          <w:lang w:val="fr-FR"/>
-        </w:rPr>
-        <w:t>But et objectifs</w:t>
-      </w:r>
-    </w:p>
-    <w:p>
-      <w:pPr>
-        <w:rPr>
-          <w:lang w:val="fr-FR"/>
-        </w:rPr>
-      </w:pPr>
-      <w:r>
-        <w:rPr>
-          <w:lang w:val="fr-FR"/>
-        </w:rPr>
-        <w:t>Ce mémoire a pour ambition de concevoir et d'évaluer un modèle CNN dédié à la détection automatique des maladies pulmonaires à partir de radiographies thoraciques, dans une perspective d'amélioration de l'accès au diagnostic dans les zones sous-médicalisées. Cinq objectifs jalonnent cette démarche :</w:t>
-      </w:r>
-    </w:p>
-    <w:p>
-      <w:pPr>
-        <w:rPr>
-          <w:lang w:val="fr-FR"/>
-        </w:rPr>
-      </w:pPr>
-    </w:p>
-    <w:p>
-      <w:pPr>
-        <w:rPr>
-          <w:lang w:val="fr-FR"/>
-        </w:rPr>
-      </w:pPr>
-      <w:r>
-        <w:rPr>
-          <w:lang w:val="fr-FR"/>
-        </w:rPr>
-        <w:t xml:space="preserve">Constituer et prétraiter un corpus d'images radiographiques à partir de bases de données de référence (Wang et al., 2017 ; </w:t>
-      </w:r>
-      <w:proofErr w:type="spellStart"/>
-      <w:r>
-        <w:rPr>
-          <w:lang w:val="fr-FR"/>
-        </w:rPr>
-        <w:t>Rajpurkar</w:t>
-      </w:r>
-      <w:proofErr w:type="spellEnd"/>
-      <w:r>
-        <w:rPr>
-          <w:lang w:val="fr-FR"/>
-        </w:rPr>
-        <w:t xml:space="preserve"> et al., 2017) ;</w:t>
-      </w:r>
-    </w:p>
-    <w:p>
-      <w:pPr>
-        <w:rPr>
-          <w:lang w:val="fr-FR"/>
-        </w:rPr>
-      </w:pPr>
-      <w:r>
-        <w:rPr>
-          <w:lang w:val="fr-FR"/>
-        </w:rPr>
-        <w:t>Définir et optimiser une architecture CNN répondant aux exigences de précision et de robustesse propres au contexte médical ;</w:t>
-      </w:r>
-    </w:p>
-    <w:p>
-      <w:pPr>
-        <w:rPr>
-          <w:lang w:val="fr-FR"/>
-        </w:rPr>
-      </w:pPr>
-      <w:r>
-        <w:rPr>
-          <w:lang w:val="fr-FR"/>
-        </w:rPr>
-        <w:t xml:space="preserve">Mesurer les performances du modèle sur les indicateurs usuels — précision, rappel, F1-score et aire sous la courbe ROC (AUC, Area Under the </w:t>
-      </w:r>
-      <w:proofErr w:type="spellStart"/>
-      <w:r>
-        <w:rPr>
-          <w:lang w:val="fr-FR"/>
-        </w:rPr>
-        <w:t>Curve</w:t>
-      </w:r>
-      <w:proofErr w:type="spellEnd"/>
-      <w:r>
-        <w:rPr>
-          <w:lang w:val="fr-FR"/>
-        </w:rPr>
-        <w:t>) — afin d'en quantifier l'efficacité diagnostique ;</w:t>
-      </w:r>
-    </w:p>
-    <w:p>
-      <w:pPr>
-        <w:rPr>
-          <w:lang w:val="fr-FR"/>
-        </w:rPr>
-      </w:pPr>
-      <w:r>
-        <w:rPr>
-          <w:lang w:val="fr-FR"/>
-        </w:rPr>
-        <w:t>Situer ces résultats par rapport aux performances d'experts humains et aux modèles publiés dans la littérature récente ;</w:t>
-      </w:r>
-    </w:p>
-    <w:p>
-      <w:pPr>
-        <w:rPr>
-          <w:lang w:val="fr-FR"/>
-        </w:rPr>
-      </w:pPr>
-      <w:r>
-        <w:rPr>
-          <w:lang w:val="fr-FR"/>
-        </w:rPr>
-        <w:t>Dégager les limites de l'approche retenue et formuler des recommandations à l'intention des praticiens et décideurs concernés par un éventuel déploiement clinique.</w:t>
-      </w:r>
-    </w:p>
-    <w:p>
-      <w:pPr>
-        <w:rPr>
-          <w:lang w:val="fr-FR"/>
-        </w:rPr>
-      </w:pPr>
-      <w:r>
-        <w:rPr>
-          <w:lang w:val="fr-FR"/>
-        </w:rPr>
-        <w:t>Démarche et plan du mémoire</w:t>
-      </w:r>
-    </w:p>
-    <w:p>
-      <w:pPr>
-        <w:rPr>
-          <w:lang w:val="fr-FR"/>
-        </w:rPr>
-      </w:pPr>
-      <w:r>
-        <w:rPr>
-          <w:lang w:val="fr-FR"/>
-        </w:rPr>
-        <w:t xml:space="preserve">La progression du mémoire suit une logique hypothético-déductive en trois temps. Le premier chapitre installe le cadre théorique : épidémiologie des maladies pulmonaires, place de la radiographie thoracique dans la pratique clinique, fondements des CNN et panorama des travaux qui ont posé les jalons de ce champ. Le deuxième chapitre entre dans le concret de la mise en œuvre — choix des données, procédures de prétraitement, architecture du </w:t>
-      </w:r>
-      <w:r>
-        <w:rPr>
-          <w:lang w:val="fr-FR"/>
-        </w:rPr>
-        <w:lastRenderedPageBreak/>
-        <w:t>modèle, protocole d'entraînement et métriques retenues. Le troisième chapitre présente et discute les résultats, les confronte à la littérature, et interroge leurs implications cliniques et éthiques. Une conclusion générale vient clore l'ensemble, en synthétisant les apports de ce travail et en ouvrant sur les perspectives qu'il dessine.</w:t>
+        <w:t>et éthiques. Une conclusion générale vient clore l'ensemble, en synthétisant les apports de ce travail et en ouvrant sur les perspectives qu'il dessine.</w:t>
       </w:r>
     </w:p>
     <w:p>
@@ -2941,15 +2899,13 @@
           <w:docGrid w:linePitch="360"/>
         </w:sectPr>
       </w:pPr>
-      <w:bookmarkStart w:id="19" w:name="_GoBack"/>
-      <w:bookmarkEnd w:id="19"/>
-    </w:p>
-    <w:p>
-      <w:pPr>
-        <w:pStyle w:val="Heading2"/>
-      </w:pPr>
-      <w:bookmarkStart w:id="20" w:name="_Toc185448566"/>
-      <w:bookmarkStart w:id="21" w:name="_Toc185448586"/>
+    </w:p>
+    <w:p>
+      <w:pPr>
+        <w:pStyle w:val="Titre2"/>
+      </w:pPr>
+      <w:bookmarkStart w:id="19" w:name="_Toc185448566"/>
+      <w:bookmarkStart w:id="20" w:name="_Toc185448586"/>
       <w:r>
         <w:lastRenderedPageBreak/>
         <w:t>Chapitre1</w:t>
@@ -2957,58 +2913,63 @@
       <w:r>
         <w:t xml:space="preserve">: </w:t>
       </w:r>
+      <w:bookmarkEnd w:id="19"/>
       <w:bookmarkEnd w:id="20"/>
+      <w:r>
+        <w:t>REVUE LITTERAIRE</w:t>
+      </w:r>
+    </w:p>
+    <w:p>
+      <w:pPr>
+        <w:pStyle w:val="Titre3"/>
+      </w:pPr>
+      <w:bookmarkStart w:id="21" w:name="_Toc185448567"/>
+      <w:bookmarkStart w:id="22" w:name="_Toc185448587"/>
+      <w:r>
+        <w:t xml:space="preserve">Introduction du </w:t>
+      </w:r>
+      <w:proofErr w:type="spellStart"/>
+      <w:r>
+        <w:t>chapit</w:t>
+      </w:r>
       <w:bookmarkEnd w:id="21"/>
-      <w:r>
-        <w:t>REVUE LITTERAIRE</w:t>
-      </w:r>
-    </w:p>
-    <w:p>
-      <w:pPr>
-        <w:pStyle w:val="Heading3"/>
-      </w:pPr>
-      <w:bookmarkStart w:id="22" w:name="_Toc185448567"/>
-      <w:bookmarkStart w:id="23" w:name="_Toc185448587"/>
-      <w:r>
-        <w:t xml:space="preserve">Introduction du </w:t>
-      </w:r>
+      <w:bookmarkEnd w:id="22"/>
+      <w:r>
+        <w:t>re</w:t>
+      </w:r>
+      <w:proofErr w:type="spellEnd"/>
+    </w:p>
+    <w:p>
+      <w:pPr>
+        <w:pStyle w:val="Titre3"/>
+        <w:rPr>
+          <w:lang w:val="fr-FR"/>
+        </w:rPr>
+      </w:pPr>
+      <w:r>
+        <w:rPr>
+          <w:lang w:val="fr-FR"/>
+        </w:rPr>
+        <w:t>Les maladies pulmonaires et leur diagnosti</w:t>
+      </w:r>
+      <w:r>
+        <w:rPr>
+          <w:lang w:val="fr-FR"/>
+        </w:rPr>
+        <w:t>c</w:t>
+      </w:r>
+    </w:p>
+    <w:p>
+      <w:pPr>
+        <w:pStyle w:val="Titre4"/>
+      </w:pPr>
       <w:proofErr w:type="spellStart"/>
       <w:r>
-        <w:t>chapit</w:t>
-      </w:r>
-      <w:bookmarkEnd w:id="22"/>
-      <w:bookmarkEnd w:id="23"/>
-      <w:r>
-        <w:t>re</w:t>
+        <w:t>Présentation</w:t>
       </w:r>
       <w:proofErr w:type="spellEnd"/>
-    </w:p>
-    <w:p>
-      <w:pPr>
-        <w:pStyle w:val="Heading3"/>
-        <w:rPr>
-          <w:lang w:val="fr-FR"/>
-        </w:rPr>
-      </w:pPr>
-      <w:r>
-        <w:rPr>
-          <w:lang w:val="fr-FR"/>
-        </w:rPr>
-        <w:t>Les maladies pulmonaires et leur diagnosti</w:t>
-      </w:r>
-      <w:r>
-        <w:rPr>
-          <w:lang w:val="fr-FR"/>
-        </w:rPr>
-        <w:t>c</w:t>
-      </w:r>
-    </w:p>
-    <w:p>
-      <w:pPr>
-        <w:pStyle w:val="Heading4"/>
-      </w:pPr>
-      <w:r>
-        <w:t xml:space="preserve">Présentation des </w:t>
+      <w:r>
+        <w:t xml:space="preserve"> des </w:t>
       </w:r>
       <w:proofErr w:type="spellStart"/>
       <w:r>
@@ -3026,7 +2987,7 @@
     </w:p>
     <w:p>
       <w:pPr>
-        <w:pStyle w:val="Heading4"/>
+        <w:pStyle w:val="Titre4"/>
         <w:rPr>
           <w:lang w:val="fr-FR"/>
         </w:rPr>
@@ -3040,7 +3001,7 @@
     </w:p>
     <w:p>
       <w:pPr>
-        <w:pStyle w:val="Heading4"/>
+        <w:pStyle w:val="Titre4"/>
         <w:rPr>
           <w:lang w:val="fr-FR"/>
         </w:rPr>
@@ -3054,7 +3015,7 @@
     </w:p>
     <w:p>
       <w:pPr>
-        <w:pStyle w:val="Heading3"/>
+        <w:pStyle w:val="Titre3"/>
       </w:pPr>
       <w:r>
         <w:t xml:space="preserve">Intelligence </w:t>
@@ -3073,7 +3034,7 @@
     </w:p>
     <w:p>
       <w:pPr>
-        <w:pStyle w:val="Heading4"/>
+        <w:pStyle w:val="Titre4"/>
         <w:rPr>
           <w:lang w:val="fr-FR"/>
         </w:rPr>
@@ -3101,7 +3062,7 @@
     </w:p>
     <w:p>
       <w:pPr>
-        <w:pStyle w:val="Heading4"/>
+        <w:pStyle w:val="Titre4"/>
         <w:rPr>
           <w:lang w:val="fr-FR"/>
         </w:rPr>
@@ -3115,7 +3076,7 @@
     </w:p>
     <w:p>
       <w:pPr>
-        <w:pStyle w:val="Heading4"/>
+        <w:pStyle w:val="Titre4"/>
         <w:rPr>
           <w:lang w:val="fr-FR"/>
         </w:rPr>
@@ -3129,7 +3090,7 @@
     </w:p>
     <w:p>
       <w:pPr>
-        <w:pStyle w:val="Heading2"/>
+        <w:pStyle w:val="Titre2"/>
       </w:pPr>
       <w:r>
         <w:t>Chapitre</w:t>
@@ -3158,223 +3119,215 @@
     </w:p>
     <w:p>
       <w:pPr>
-        <w:pStyle w:val="Heading3"/>
-      </w:pPr>
+        <w:pStyle w:val="Titre3"/>
+      </w:pPr>
+      <w:r>
+        <w:t xml:space="preserve">Données et </w:t>
+      </w:r>
       <w:proofErr w:type="spellStart"/>
       <w:r>
-        <w:t>Données</w:t>
+        <w:t>prétraitement</w:t>
       </w:r>
       <w:proofErr w:type="spellEnd"/>
+    </w:p>
+    <w:p>
+      <w:pPr>
+        <w:pStyle w:val="Titre4"/>
+      </w:pPr>
+      <w:r>
+        <w:t xml:space="preserve">Sources des données </w:t>
+      </w:r>
+      <w:proofErr w:type="spellStart"/>
+      <w:r>
+        <w:t>d’imagerie</w:t>
+      </w:r>
+      <w:proofErr w:type="spellEnd"/>
+      <w:r>
+        <w:t xml:space="preserve"> </w:t>
+      </w:r>
+      <w:proofErr w:type="spellStart"/>
+      <w:r>
+        <w:t>radiographique</w:t>
+      </w:r>
+      <w:proofErr w:type="spellEnd"/>
+    </w:p>
+    <w:p>
+      <w:pPr>
+        <w:pStyle w:val="Titre4"/>
+        <w:rPr>
+          <w:lang w:val="fr-FR"/>
+        </w:rPr>
+      </w:pPr>
+      <w:r>
+        <w:rPr>
+          <w:lang w:val="fr-FR"/>
+        </w:rPr>
+        <w:t>Techniques de prétraitement (redimensionnement, normalisation, augmentation des données)</w:t>
+      </w:r>
+    </w:p>
+    <w:p>
+      <w:pPr>
+        <w:pStyle w:val="Titre3"/>
+      </w:pPr>
+      <w:r>
+        <w:t xml:space="preserve">Conception du </w:t>
+      </w:r>
+      <w:proofErr w:type="spellStart"/>
+      <w:r>
+        <w:t>modèle</w:t>
+      </w:r>
+      <w:proofErr w:type="spellEnd"/>
+      <w:r>
+        <w:t xml:space="preserve"> CNN</w:t>
+      </w:r>
+    </w:p>
+    <w:p>
+      <w:pPr>
+        <w:pStyle w:val="Titre4"/>
+      </w:pPr>
+      <w:r>
+        <w:t xml:space="preserve">Architecture du </w:t>
+      </w:r>
+      <w:proofErr w:type="spellStart"/>
+      <w:r>
+        <w:t>modèle</w:t>
+      </w:r>
+      <w:proofErr w:type="spellEnd"/>
+      <w:r>
+        <w:t xml:space="preserve"> CNN </w:t>
+      </w:r>
+      <w:proofErr w:type="spellStart"/>
+      <w:r>
+        <w:t>choisi</w:t>
+      </w:r>
+      <w:proofErr w:type="spellEnd"/>
+    </w:p>
+    <w:p>
+      <w:pPr>
+        <w:pStyle w:val="Titre4"/>
+        <w:rPr>
+          <w:lang w:val="fr-FR"/>
+        </w:rPr>
+      </w:pPr>
+      <w:r>
+        <w:rPr>
+          <w:lang w:val="fr-FR"/>
+        </w:rPr>
+        <w:t>Justification des choix techniques (nombre de couches, fonctions d’activation, etc.)</w:t>
+      </w:r>
+    </w:p>
+    <w:p>
+      <w:pPr>
+        <w:pStyle w:val="Titre4"/>
+        <w:rPr>
+          <w:lang w:val="fr-FR"/>
+        </w:rPr>
+      </w:pPr>
+      <w:proofErr w:type="spellStart"/>
+      <w:r>
+        <w:t>Entraînement</w:t>
+      </w:r>
+      <w:proofErr w:type="spellEnd"/>
+      <w:r>
+        <w:t xml:space="preserve"> du </w:t>
+      </w:r>
+      <w:proofErr w:type="spellStart"/>
+      <w:r>
+        <w:t>modèle</w:t>
+      </w:r>
+      <w:proofErr w:type="spellEnd"/>
       <w:r>
         <w:t xml:space="preserve"> et </w:t>
       </w:r>
       <w:proofErr w:type="spellStart"/>
       <w:r>
-        <w:t>prétraitement</w:t>
+        <w:t>optimisation</w:t>
       </w:r>
       <w:proofErr w:type="spellEnd"/>
     </w:p>
     <w:p>
       <w:pPr>
-        <w:pStyle w:val="Heading4"/>
-      </w:pPr>
-      <w:r>
-        <w:t xml:space="preserve">Sources des </w:t>
-      </w:r>
+        <w:pStyle w:val="Titre3"/>
+      </w:pPr>
       <w:proofErr w:type="spellStart"/>
       <w:r>
-        <w:t>données</w:t>
+        <w:t>Outils</w:t>
       </w:r>
       <w:proofErr w:type="spellEnd"/>
       <w:r>
-        <w:t xml:space="preserve"> </w:t>
+        <w:t xml:space="preserve"> et </w:t>
       </w:r>
       <w:proofErr w:type="spellStart"/>
       <w:r>
-        <w:t>d’imagerie</w:t>
+        <w:t>environnement</w:t>
       </w:r>
       <w:proofErr w:type="spellEnd"/>
       <w:r>
-        <w:t xml:space="preserve"> </w:t>
+        <w:t xml:space="preserve"> de </w:t>
       </w:r>
       <w:proofErr w:type="spellStart"/>
       <w:r>
-        <w:t>radiographique</w:t>
+        <w:t>développement</w:t>
       </w:r>
       <w:proofErr w:type="spellEnd"/>
     </w:p>
     <w:p>
       <w:pPr>
-        <w:pStyle w:val="Heading4"/>
-        <w:rPr>
-          <w:lang w:val="fr-FR"/>
-        </w:rPr>
-      </w:pPr>
-      <w:r>
-        <w:rPr>
-          <w:lang w:val="fr-FR"/>
-        </w:rPr>
-        <w:t>Techniques de prétraitement (redimensionnement, normalisation, augmentation des données)</w:t>
-      </w:r>
-    </w:p>
-    <w:p>
-      <w:pPr>
-        <w:pStyle w:val="Heading3"/>
-      </w:pPr>
-      <w:r>
-        <w:t xml:space="preserve">Conception du </w:t>
+        <w:pStyle w:val="Titre4"/>
+        <w:rPr>
+          <w:lang w:val="fr-FR"/>
+        </w:rPr>
+      </w:pPr>
+      <w:r>
+        <w:rPr>
+          <w:lang w:val="fr-FR"/>
+        </w:rPr>
+        <w:t xml:space="preserve">Langages et bibliothèques utilisés (Python, </w:t>
       </w:r>
       <w:proofErr w:type="spellStart"/>
       <w:r>
-        <w:t>modèle</w:t>
+        <w:rPr>
+          <w:lang w:val="fr-FR"/>
+        </w:rPr>
+        <w:t>TensorFlow</w:t>
       </w:r>
       <w:proofErr w:type="spellEnd"/>
       <w:r>
-        <w:t xml:space="preserve"> CNN</w:t>
-      </w:r>
-    </w:p>
-    <w:p>
-      <w:pPr>
-        <w:pStyle w:val="Heading4"/>
-      </w:pPr>
-      <w:r>
-        <w:t xml:space="preserve">Architecture du </w:t>
+        <w:rPr>
+          <w:lang w:val="fr-FR"/>
+        </w:rPr>
+        <w:t xml:space="preserve">, </w:t>
       </w:r>
       <w:proofErr w:type="spellStart"/>
       <w:r>
-        <w:t>modèle</w:t>
+        <w:rPr>
+          <w:lang w:val="fr-FR"/>
+        </w:rPr>
+        <w:t>PyTorch</w:t>
       </w:r>
       <w:proofErr w:type="spellEnd"/>
-      <w:r>
-        <w:t xml:space="preserve"> CNN </w:t>
+    </w:p>
+    <w:p>
+      <w:pPr>
+        <w:pStyle w:val="Titre4"/>
+        <w:rPr>
+          <w:lang w:val="fr-FR"/>
+        </w:rPr>
+      </w:pPr>
+      <w:r>
+        <w:rPr>
+          <w:lang w:val="fr-FR"/>
+        </w:rPr>
+        <w:t xml:space="preserve">Infrastructure matérielle (GPU, cloud </w:t>
       </w:r>
       <w:proofErr w:type="spellStart"/>
       <w:r>
-        <w:t>choisi</w:t>
+        <w:rPr>
+          <w:lang w:val="fr-FR"/>
+        </w:rPr>
+        <w:t>computing</w:t>
       </w:r>
       <w:proofErr w:type="spellEnd"/>
-    </w:p>
-    <w:p>
-      <w:pPr>
-        <w:pStyle w:val="Heading4"/>
-        <w:rPr>
-          <w:lang w:val="fr-FR"/>
-        </w:rPr>
-      </w:pPr>
-      <w:r>
-        <w:rPr>
-          <w:lang w:val="fr-FR"/>
-        </w:rPr>
-        <w:t>Justification des choix techniques (nombre de couches, fonctions d’activation, etc.)</w:t>
-      </w:r>
-    </w:p>
-    <w:p>
-      <w:pPr>
-        <w:pStyle w:val="Heading4"/>
-        <w:rPr>
-          <w:lang w:val="fr-FR"/>
-        </w:rPr>
-      </w:pPr>
-      <w:r>
-        <w:t xml:space="preserve">Entraînement du </w:t>
-      </w:r>
-      <w:proofErr w:type="spellStart"/>
-      <w:r>
-        <w:t>modèle</w:t>
-      </w:r>
-      <w:proofErr w:type="spellEnd"/>
-      <w:r>
-        <w:t xml:space="preserve"> et </w:t>
-      </w:r>
-      <w:proofErr w:type="spellStart"/>
-      <w:r>
-        <w:t>optimisation</w:t>
-      </w:r>
-      <w:proofErr w:type="spellEnd"/>
-    </w:p>
-    <w:p>
-      <w:pPr>
-        <w:pStyle w:val="Heading3"/>
-      </w:pPr>
-      <w:proofErr w:type="spellStart"/>
-      <w:r>
-        <w:t>Outils</w:t>
-      </w:r>
-      <w:proofErr w:type="spellEnd"/>
-      <w:r>
-        <w:t xml:space="preserve"> et </w:t>
-      </w:r>
-      <w:proofErr w:type="spellStart"/>
-      <w:r>
-        <w:t>environnement</w:t>
-      </w:r>
-      <w:proofErr w:type="spellEnd"/>
-      <w:r>
-        <w:t xml:space="preserve"> de </w:t>
-      </w:r>
-      <w:proofErr w:type="spellStart"/>
-      <w:r>
-        <w:t>développement</w:t>
-      </w:r>
-      <w:proofErr w:type="spellEnd"/>
-    </w:p>
-    <w:p>
-      <w:pPr>
-        <w:pStyle w:val="Heading4"/>
-        <w:rPr>
-          <w:lang w:val="fr-FR"/>
-        </w:rPr>
-      </w:pPr>
-      <w:r>
-        <w:rPr>
-          <w:lang w:val="fr-FR"/>
-        </w:rPr>
-        <w:t xml:space="preserve">Langages et bibliothèques utilisés (Python, </w:t>
-      </w:r>
-      <w:proofErr w:type="spellStart"/>
-      <w:r>
-        <w:rPr>
-          <w:lang w:val="fr-FR"/>
-        </w:rPr>
-        <w:t>TensorFlow</w:t>
-      </w:r>
-      <w:proofErr w:type="spellEnd"/>
-      <w:r>
-        <w:rPr>
-          <w:lang w:val="fr-FR"/>
-        </w:rPr>
-        <w:t xml:space="preserve">, </w:t>
-      </w:r>
-      <w:proofErr w:type="spellStart"/>
-      <w:r>
-        <w:rPr>
-          <w:lang w:val="fr-FR"/>
-        </w:rPr>
-        <w:t>PyTorch</w:t>
-      </w:r>
-      <w:proofErr w:type="spellEnd"/>
-    </w:p>
-    <w:p>
-      <w:pPr>
-        <w:pStyle w:val="Heading4"/>
-        <w:rPr>
-          <w:lang w:val="fr-FR"/>
-        </w:rPr>
-      </w:pPr>
-      <w:r>
-        <w:rPr>
-          <w:lang w:val="fr-FR"/>
-        </w:rPr>
-        <w:t xml:space="preserve">Infrastructure matérielle (GPU, cloud </w:t>
-      </w:r>
-      <w:proofErr w:type="spellStart"/>
-      <w:r>
-        <w:rPr>
-          <w:lang w:val="fr-FR"/>
-        </w:rPr>
-        <w:t>computing</w:t>
-      </w:r>
-      <w:proofErr w:type="spellEnd"/>
       <w:r>
         <w:rPr>
           <w:lang w:val="fr-FR"/>
@@ -3384,7 +3337,7 @@
     </w:p>
     <w:p>
       <w:pPr>
-        <w:pStyle w:val="Heading2"/>
+        <w:pStyle w:val="Titre2"/>
       </w:pPr>
       <w:r>
         <w:lastRenderedPageBreak/>
@@ -3409,7 +3362,7 @@
     </w:p>
     <w:p>
       <w:pPr>
-        <w:pStyle w:val="Heading3"/>
+        <w:pStyle w:val="Titre3"/>
       </w:pPr>
       <w:proofErr w:type="spellStart"/>
       <w:r>
@@ -3427,7 +3380,7 @@
     </w:p>
     <w:p>
       <w:pPr>
-        <w:pStyle w:val="Heading4"/>
+        <w:pStyle w:val="Titre4"/>
         <w:rPr>
           <w:lang w:val="fr-FR"/>
         </w:rPr>
@@ -3441,16 +3394,21 @@
     </w:p>
     <w:p>
       <w:pPr>
-        <w:pStyle w:val="Heading4"/>
-        <w:rPr>
-          <w:lang w:val="fr-FR"/>
-        </w:rPr>
-      </w:pPr>
-      <w:r>
-        <w:t xml:space="preserve">Comparaison avec </w:t>
-      </w:r>
+        <w:pStyle w:val="Titre4"/>
+        <w:rPr>
+          <w:lang w:val="fr-FR"/>
+        </w:rPr>
+      </w:pPr>
       <w:proofErr w:type="spellStart"/>
       <w:r>
+        <w:t>Comparaison</w:t>
+      </w:r>
+      <w:proofErr w:type="spellEnd"/>
+      <w:r>
+        <w:t xml:space="preserve"> avec </w:t>
+      </w:r>
+      <w:proofErr w:type="spellStart"/>
+      <w:r>
         <w:t>d’autres</w:t>
       </w:r>
       <w:proofErr w:type="spellEnd"/>
@@ -3473,7 +3431,7 @@
     </w:p>
     <w:p>
       <w:pPr>
-        <w:pStyle w:val="Heading3"/>
+        <w:pStyle w:val="Titre3"/>
       </w:pPr>
       <w:proofErr w:type="spellStart"/>
       <w:r>
@@ -3486,7 +3444,7 @@
     </w:p>
     <w:p>
       <w:pPr>
-        <w:pStyle w:val="Heading4"/>
+        <w:pStyle w:val="Titre4"/>
         <w:rPr>
           <w:lang w:val="fr-FR"/>
         </w:rPr>
@@ -3500,16 +3458,21 @@
     </w:p>
     <w:p>
       <w:pPr>
-        <w:pStyle w:val="Heading4"/>
-        <w:rPr>
-          <w:lang w:val="fr-FR"/>
-        </w:rPr>
-      </w:pPr>
-      <w:r>
-        <w:t xml:space="preserve">Erreurs </w:t>
-      </w:r>
+        <w:pStyle w:val="Titre4"/>
+        <w:rPr>
+          <w:lang w:val="fr-FR"/>
+        </w:rPr>
+      </w:pPr>
       <w:proofErr w:type="spellStart"/>
       <w:r>
+        <w:t>Erreurs</w:t>
+      </w:r>
+      <w:proofErr w:type="spellEnd"/>
+      <w:r>
+        <w:t xml:space="preserve"> </w:t>
+      </w:r>
+      <w:proofErr w:type="spellStart"/>
+      <w:r>
         <w:t>courantes</w:t>
       </w:r>
       <w:proofErr w:type="spellEnd"/>
@@ -3532,7 +3495,7 @@
     </w:p>
     <w:p>
       <w:pPr>
-        <w:pStyle w:val="Heading3"/>
+        <w:pStyle w:val="Titre3"/>
       </w:pPr>
       <w:r>
         <w:t xml:space="preserve">Perspectives </w:t>
@@ -3545,7 +3508,7 @@
     </w:p>
     <w:p>
       <w:pPr>
-        <w:pStyle w:val="Heading4"/>
+        <w:pStyle w:val="Titre4"/>
       </w:pPr>
       <w:proofErr w:type="spellStart"/>
       <w:r>
@@ -3563,7 +3526,7 @@
     </w:p>
     <w:p>
       <w:pPr>
-        <w:pStyle w:val="Heading4"/>
+        <w:pStyle w:val="Titre4"/>
         <w:rPr>
           <w:lang w:val="fr-FR"/>
         </w:rPr>
@@ -3577,7 +3540,7 @@
     </w:p>
     <w:p>
       <w:pPr>
-        <w:pStyle w:val="Heading4"/>
+        <w:pStyle w:val="Titre4"/>
         <w:rPr>
           <w:lang w:val="fr-FR"/>
         </w:rPr>
@@ -3591,26 +3554,26 @@
     </w:p>
     <w:p>
       <w:pPr>
-        <w:pStyle w:val="Heading1"/>
-        <w:rPr>
-          <w:lang w:val="fr-FR"/>
-        </w:rPr>
-      </w:pPr>
-    </w:p>
-    <w:p>
-      <w:pPr>
-        <w:pStyle w:val="Heading1"/>
-        <w:rPr>
-          <w:lang w:val="fr-FR"/>
-        </w:rPr>
-      </w:pPr>
-    </w:p>
-    <w:p>
-      <w:pPr>
-        <w:pStyle w:val="Caption"/>
+        <w:pStyle w:val="Titre1"/>
+        <w:rPr>
+          <w:lang w:val="fr-FR"/>
+        </w:rPr>
+      </w:pPr>
+    </w:p>
+    <w:p>
+      <w:pPr>
+        <w:pStyle w:val="Titre1"/>
+        <w:rPr>
+          <w:lang w:val="fr-FR"/>
+        </w:rPr>
+      </w:pPr>
+    </w:p>
+    <w:p>
+      <w:pPr>
+        <w:pStyle w:val="Lgende"/>
         <w:keepNext/>
       </w:pPr>
-      <w:bookmarkStart w:id="24" w:name="_Toc185448215"/>
+      <w:bookmarkStart w:id="23" w:name="_Toc185448215"/>
       <w:r>
         <w:t xml:space="preserve">Table </w:t>
       </w:r>
@@ -3635,11 +3598,11 @@
       <w:r>
         <w:t>:Tableau3</w:t>
       </w:r>
-      <w:bookmarkEnd w:id="24"/>
+      <w:bookmarkEnd w:id="23"/>
     </w:p>
     <w:tbl>
       <w:tblPr>
-        <w:tblStyle w:val="TableGrid"/>
+        <w:tblStyle w:val="Grilledutableau"/>
         <w:tblW w:w="0" w:type="auto"/>
         <w:tblLook w:val="04A0" w:firstRow="1" w:lastRow="0" w:firstColumn="1" w:lastColumn="0" w:noHBand="0" w:noVBand="1"/>
       </w:tblPr>
@@ -3733,10 +3696,10 @@
     <w:p/>
     <w:p>
       <w:pPr>
-        <w:pStyle w:val="Heading3"/>
-      </w:pPr>
-      <w:bookmarkStart w:id="25" w:name="_Toc185448570"/>
-      <w:bookmarkStart w:id="26" w:name="_Toc185448593"/>
+        <w:pStyle w:val="Titre3"/>
+      </w:pPr>
+      <w:bookmarkStart w:id="24" w:name="_Toc185448570"/>
+      <w:bookmarkStart w:id="25" w:name="_Toc185448593"/>
       <w:r>
         <w:lastRenderedPageBreak/>
         <w:t xml:space="preserve">Conclusion du </w:t>
@@ -3745,8 +3708,8 @@
       <w:r>
         <w:t>chapitre</w:t>
       </w:r>
+      <w:bookmarkEnd w:id="24"/>
       <w:bookmarkEnd w:id="25"/>
-      <w:bookmarkEnd w:id="26"/>
       <w:proofErr w:type="spellEnd"/>
     </w:p>
     <w:p/>
@@ -3768,52 +3731,52 @@
     </w:p>
     <w:p>
       <w:pPr>
-        <w:pStyle w:val="Heading2"/>
-      </w:pPr>
-      <w:bookmarkStart w:id="27" w:name="_Toc185448571"/>
-      <w:bookmarkStart w:id="28" w:name="_Toc185448594"/>
+        <w:pStyle w:val="Titre2"/>
+      </w:pPr>
+      <w:bookmarkStart w:id="26" w:name="_Toc185448571"/>
+      <w:bookmarkStart w:id="27" w:name="_Toc185448594"/>
       <w:r>
         <w:lastRenderedPageBreak/>
         <w:t>Chapitre2</w:t>
       </w:r>
+      <w:bookmarkEnd w:id="26"/>
       <w:bookmarkEnd w:id="27"/>
+    </w:p>
+    <w:p>
+      <w:pPr>
+        <w:pStyle w:val="Lgende"/>
+        <w:keepNext/>
+      </w:pPr>
+      <w:bookmarkStart w:id="28" w:name="_Toc185448216"/>
+      <w:r>
+        <w:t xml:space="preserve">Table </w:t>
+      </w:r>
+      <w:r>
+        <w:fldChar w:fldCharType="begin"/>
+      </w:r>
+      <w:r>
+        <w:instrText>SEQ Table \* ARABIC</w:instrText>
+      </w:r>
+      <w:r>
+        <w:fldChar w:fldCharType="separate"/>
+      </w:r>
+      <w:r>
+        <w:rPr>
+          <w:noProof/>
+        </w:rPr>
+        <w:t>2</w:t>
+      </w:r>
+      <w:r>
+        <w:fldChar w:fldCharType="end"/>
+      </w:r>
+      <w:r>
+        <w:t>:Tableau 1</w:t>
+      </w:r>
       <w:bookmarkEnd w:id="28"/>
-    </w:p>
-    <w:p>
-      <w:pPr>
-        <w:pStyle w:val="Caption"/>
-        <w:keepNext/>
-      </w:pPr>
-      <w:bookmarkStart w:id="29" w:name="_Toc185448216"/>
-      <w:r>
-        <w:t xml:space="preserve">Table </w:t>
-      </w:r>
-      <w:r>
-        <w:fldChar w:fldCharType="begin"/>
-      </w:r>
-      <w:r>
-        <w:instrText>SEQ Table \* ARABIC</w:instrText>
-      </w:r>
-      <w:r>
-        <w:fldChar w:fldCharType="separate"/>
-      </w:r>
-      <w:r>
-        <w:rPr>
-          <w:noProof/>
-        </w:rPr>
-        <w:t>2</w:t>
-      </w:r>
-      <w:r>
-        <w:fldChar w:fldCharType="end"/>
-      </w:r>
-      <w:r>
-        <w:t>:Tableau 1</w:t>
-      </w:r>
-      <w:bookmarkEnd w:id="29"/>
     </w:p>
     <w:tbl>
       <w:tblPr>
-        <w:tblStyle w:val="TableGrid"/>
+        <w:tblStyle w:val="Grilledutableau"/>
         <w:tblW w:w="0" w:type="auto"/>
         <w:tblLook w:val="04A0" w:firstRow="1" w:lastRow="0" w:firstColumn="1" w:lastColumn="0" w:noHBand="0" w:noVBand="1"/>
       </w:tblPr>
@@ -3933,52 +3896,52 @@
     </w:p>
     <w:p>
       <w:pPr>
-        <w:pStyle w:val="Heading2"/>
-      </w:pPr>
-      <w:bookmarkStart w:id="30" w:name="_Toc185448572"/>
-      <w:bookmarkStart w:id="31" w:name="_Toc185448595"/>
+        <w:pStyle w:val="Titre2"/>
+      </w:pPr>
+      <w:bookmarkStart w:id="29" w:name="_Toc185448572"/>
+      <w:bookmarkStart w:id="30" w:name="_Toc185448595"/>
       <w:r>
         <w:lastRenderedPageBreak/>
         <w:t>Chapitre3</w:t>
       </w:r>
+      <w:bookmarkEnd w:id="29"/>
       <w:bookmarkEnd w:id="30"/>
+    </w:p>
+    <w:p>
+      <w:pPr>
+        <w:pStyle w:val="Lgende"/>
+        <w:keepNext/>
+      </w:pPr>
+      <w:bookmarkStart w:id="31" w:name="_Toc185448217"/>
+      <w:r>
+        <w:t xml:space="preserve">Table </w:t>
+      </w:r>
+      <w:r>
+        <w:fldChar w:fldCharType="begin"/>
+      </w:r>
+      <w:r>
+        <w:instrText>SEQ Table \* ARABIC</w:instrText>
+      </w:r>
+      <w:r>
+        <w:fldChar w:fldCharType="separate"/>
+      </w:r>
+      <w:r>
+        <w:rPr>
+          <w:noProof/>
+        </w:rPr>
+        <w:t>3</w:t>
+      </w:r>
+      <w:r>
+        <w:fldChar w:fldCharType="end"/>
+      </w:r>
+      <w:r>
+        <w:t>:Tableau2</w:t>
+      </w:r>
       <w:bookmarkEnd w:id="31"/>
-    </w:p>
-    <w:p>
-      <w:pPr>
-        <w:pStyle w:val="Caption"/>
-        <w:keepNext/>
-      </w:pPr>
-      <w:bookmarkStart w:id="32" w:name="_Toc185448217"/>
-      <w:r>
-        <w:t xml:space="preserve">Table </w:t>
-      </w:r>
-      <w:r>
-        <w:fldChar w:fldCharType="begin"/>
-      </w:r>
-      <w:r>
-        <w:instrText>SEQ Table \* ARABIC</w:instrText>
-      </w:r>
-      <w:r>
-        <w:fldChar w:fldCharType="separate"/>
-      </w:r>
-      <w:r>
-        <w:rPr>
-          <w:noProof/>
-        </w:rPr>
-        <w:t>3</w:t>
-      </w:r>
-      <w:r>
-        <w:fldChar w:fldCharType="end"/>
-      </w:r>
-      <w:r>
-        <w:t>:Tableau2</w:t>
-      </w:r>
-      <w:bookmarkEnd w:id="32"/>
     </w:p>
     <w:tbl>
       <w:tblPr>
-        <w:tblStyle w:val="TableGrid"/>
+        <w:tblStyle w:val="Grilledutableau"/>
         <w:tblW w:w="0" w:type="auto"/>
         <w:tblLook w:val="04A0" w:firstRow="1" w:lastRow="0" w:firstColumn="1" w:lastColumn="0" w:noHBand="0" w:noVBand="1"/>
       </w:tblPr>
@@ -4071,18 +4034,18 @@
     <w:p/>
     <w:p>
       <w:pPr>
-        <w:pStyle w:val="NoSpacing"/>
+        <w:pStyle w:val="Sansinterligne"/>
         <w:keepNext/>
       </w:pPr>
     </w:p>
     <w:p>
       <w:pPr>
-        <w:pStyle w:val="Caption"/>
-        <w:rPr>
-          <w:lang w:val="fr-FR"/>
-        </w:rPr>
-      </w:pPr>
-      <w:bookmarkStart w:id="33" w:name="_Toc185447591"/>
+        <w:pStyle w:val="Lgende"/>
+        <w:rPr>
+          <w:lang w:val="fr-FR"/>
+        </w:rPr>
+      </w:pPr>
+      <w:bookmarkStart w:id="32" w:name="_Toc185447591"/>
       <w:r>
         <w:rPr>
           <w:lang w:val="fr-FR"/>
@@ -4151,25 +4114,25 @@
         </w:rPr>
         <w:t>: encore la  fête</w:t>
       </w:r>
-      <w:bookmarkEnd w:id="33"/>
-    </w:p>
-    <w:p>
-      <w:pPr>
-        <w:rPr>
-          <w:lang w:val="fr-FR"/>
-        </w:rPr>
-      </w:pPr>
-    </w:p>
-    <w:p>
-      <w:pPr>
-        <w:rPr>
-          <w:lang w:val="fr-FR"/>
-        </w:rPr>
-      </w:pPr>
-    </w:p>
-    <w:p>
-      <w:pPr>
-        <w:pStyle w:val="Heading1"/>
+      <w:bookmarkEnd w:id="32"/>
+    </w:p>
+    <w:p>
+      <w:pPr>
+        <w:rPr>
+          <w:lang w:val="fr-FR"/>
+        </w:rPr>
+      </w:pPr>
+    </w:p>
+    <w:p>
+      <w:pPr>
+        <w:rPr>
+          <w:lang w:val="fr-FR"/>
+        </w:rPr>
+      </w:pPr>
+    </w:p>
+    <w:p>
+      <w:pPr>
+        <w:pStyle w:val="Titre1"/>
         <w:rPr>
           <w:lang w:val="fr-FR"/>
         </w:rPr>
@@ -4185,16 +4148,16 @@
     </w:p>
     <w:p>
       <w:pPr>
-        <w:pStyle w:val="Heading1"/>
-      </w:pPr>
-      <w:bookmarkStart w:id="34" w:name="_Toc185448573"/>
-      <w:bookmarkStart w:id="35" w:name="_Toc185448596"/>
+        <w:pStyle w:val="Titre1"/>
+      </w:pPr>
+      <w:bookmarkStart w:id="33" w:name="_Toc185448573"/>
+      <w:bookmarkStart w:id="34" w:name="_Toc185448596"/>
       <w:r>
         <w:lastRenderedPageBreak/>
         <w:t>Conclusion Générale</w:t>
       </w:r>
+      <w:bookmarkEnd w:id="33"/>
       <w:bookmarkEnd w:id="34"/>
-      <w:bookmarkEnd w:id="35"/>
     </w:p>
     <w:p>
       <w:pPr>
@@ -4217,15 +4180,7 @@
         <w:pStyle w:val="NormalWeb"/>
       </w:pPr>
       <w:r>
-        <w:t>Les résultats obtenus montrent que l’intelligence artificielle peut constituer un outil puissant, capable d’assister les professionnels de santé en apportant une analyse rapide et fiable. Bien que notre modèle ait démontré des performances prometteuses, certaines limites subsistent, notamment en ce qui concerne la variabilité des données et l’</w:t>
-      </w:r>
-      <w:proofErr w:type="spellStart"/>
-      <w:r>
-        <w:t>interprétabilité</w:t>
-      </w:r>
-      <w:proofErr w:type="spellEnd"/>
-      <w:r>
-        <w:t xml:space="preserve"> des décisions de l’algorithme.</w:t>
+        <w:t>Les résultats obtenus montrent que l’intelligence artificielle peut constituer un outil puissant, capable d’assister les professionnels de santé en apportant une analyse rapide et fiable. Bien que notre modèle ait démontré des performances prometteuses, certaines limites subsistent, notamment en ce qui concerne la variabilité des données et l’interprétabilité des décisions de l’algorithme.</w:t>
       </w:r>
     </w:p>
     <w:p>
@@ -4266,16 +4221,16 @@
     </w:p>
     <w:p>
       <w:pPr>
-        <w:pStyle w:val="Heading1"/>
-      </w:pPr>
-      <w:bookmarkStart w:id="36" w:name="_Toc185448574"/>
-      <w:bookmarkStart w:id="37" w:name="_Toc185448597"/>
+        <w:pStyle w:val="Titre1"/>
+      </w:pPr>
+      <w:bookmarkStart w:id="35" w:name="_Toc185448574"/>
+      <w:bookmarkStart w:id="36" w:name="_Toc185448597"/>
       <w:r>
         <w:lastRenderedPageBreak/>
         <w:t>Bibliographie</w:t>
       </w:r>
+      <w:bookmarkEnd w:id="35"/>
       <w:bookmarkEnd w:id="36"/>
-      <w:bookmarkEnd w:id="37"/>
     </w:p>
     <w:sdt>
       <w:sdtPr>
@@ -4301,7 +4256,7 @@
       <w:sdtContent>
         <w:p>
           <w:pPr>
-            <w:pStyle w:val="Heading1"/>
+            <w:pStyle w:val="Titre1"/>
           </w:pPr>
           <w:r>
             <w:rPr>
@@ -4330,20 +4285,20 @@
     </w:p>
     <w:p>
       <w:pPr>
-        <w:pStyle w:val="Heading1"/>
-      </w:pPr>
-      <w:bookmarkStart w:id="38" w:name="_Toc185448575"/>
-      <w:bookmarkStart w:id="39" w:name="_Toc185448598"/>
+        <w:pStyle w:val="Titre1"/>
+      </w:pPr>
+      <w:bookmarkStart w:id="37" w:name="_Toc185448575"/>
+      <w:bookmarkStart w:id="38" w:name="_Toc185448598"/>
       <w:r>
         <w:lastRenderedPageBreak/>
         <w:t>Table des matières</w:t>
       </w:r>
+      <w:bookmarkEnd w:id="37"/>
       <w:bookmarkEnd w:id="38"/>
-      <w:bookmarkEnd w:id="39"/>
-    </w:p>
-    <w:p>
-      <w:pPr>
-        <w:pStyle w:val="TOC1"/>
+    </w:p>
+    <w:p>
+      <w:pPr>
+        <w:pStyle w:val="TM1"/>
         <w:tabs>
           <w:tab w:val="right" w:leader="underscore" w:pos="9396"/>
         </w:tabs>
@@ -4370,7 +4325,7 @@
       <w:hyperlink w:anchor="_Toc185448577" w:history="1">
         <w:r>
           <w:rPr>
-            <w:rStyle w:val="Hyperlink"/>
+            <w:rStyle w:val="Lienhypertexte"/>
             <w:noProof/>
           </w:rPr>
           <w:t>Dédicaces</w:t>
@@ -4427,7 +4382,7 @@
     </w:p>
     <w:p>
       <w:pPr>
-        <w:pStyle w:val="TOC1"/>
+        <w:pStyle w:val="TM1"/>
         <w:tabs>
           <w:tab w:val="right" w:leader="underscore" w:pos="9396"/>
         </w:tabs>
@@ -4445,7 +4400,7 @@
       <w:hyperlink w:anchor="_Toc185448578" w:history="1">
         <w:r>
           <w:rPr>
-            <w:rStyle w:val="Hyperlink"/>
+            <w:rStyle w:val="Lienhypertexte"/>
             <w:noProof/>
           </w:rPr>
           <w:t>Remerciements</w:t>
@@ -4502,7 +4457,7 @@
     </w:p>
     <w:p>
       <w:pPr>
-        <w:pStyle w:val="TOC1"/>
+        <w:pStyle w:val="TM1"/>
         <w:tabs>
           <w:tab w:val="right" w:leader="underscore" w:pos="9396"/>
         </w:tabs>
@@ -4520,7 +4475,7 @@
       <w:hyperlink w:anchor="_Toc185448579" w:history="1">
         <w:r>
           <w:rPr>
-            <w:rStyle w:val="Hyperlink"/>
+            <w:rStyle w:val="Lienhypertexte"/>
             <w:noProof/>
           </w:rPr>
           <w:t>Sommaire</w:t>
@@ -4577,7 +4532,7 @@
     </w:p>
     <w:p>
       <w:pPr>
-        <w:pStyle w:val="TOC1"/>
+        <w:pStyle w:val="TM1"/>
         <w:tabs>
           <w:tab w:val="right" w:leader="underscore" w:pos="9396"/>
         </w:tabs>
@@ -4595,7 +4550,7 @@
       <w:hyperlink w:anchor="_Toc185448580" w:history="1">
         <w:r>
           <w:rPr>
-            <w:rStyle w:val="Hyperlink"/>
+            <w:rStyle w:val="Lienhypertexte"/>
             <w:noProof/>
           </w:rPr>
           <w:t>Liste des figures</w:t>
@@ -4652,7 +4607,7 @@
     </w:p>
     <w:p>
       <w:pPr>
-        <w:pStyle w:val="TOC1"/>
+        <w:pStyle w:val="TM1"/>
         <w:tabs>
           <w:tab w:val="right" w:leader="underscore" w:pos="9396"/>
         </w:tabs>
@@ -4670,7 +4625,7 @@
       <w:hyperlink w:anchor="_Toc185448581" w:history="1">
         <w:r>
           <w:rPr>
-            <w:rStyle w:val="Hyperlink"/>
+            <w:rStyle w:val="Lienhypertexte"/>
             <w:noProof/>
           </w:rPr>
           <w:t>Liste des tableaux</w:t>
@@ -4727,7 +4682,7 @@
     </w:p>
     <w:p>
       <w:pPr>
-        <w:pStyle w:val="TOC1"/>
+        <w:pStyle w:val="TM1"/>
         <w:tabs>
           <w:tab w:val="right" w:leader="underscore" w:pos="9396"/>
         </w:tabs>
@@ -4745,7 +4700,7 @@
       <w:hyperlink w:anchor="_Toc185448582" w:history="1">
         <w:r>
           <w:rPr>
-            <w:rStyle w:val="Hyperlink"/>
+            <w:rStyle w:val="Lienhypertexte"/>
             <w:noProof/>
           </w:rPr>
           <w:t>Liste des sigles et des abreviations</w:t>
@@ -4802,7 +4757,7 @@
     </w:p>
     <w:p>
       <w:pPr>
-        <w:pStyle w:val="TOC1"/>
+        <w:pStyle w:val="TM1"/>
         <w:tabs>
           <w:tab w:val="right" w:leader="underscore" w:pos="9396"/>
         </w:tabs>
@@ -4820,7 +4775,7 @@
       <w:hyperlink w:anchor="_Toc185448583" w:history="1">
         <w:r>
           <w:rPr>
-            <w:rStyle w:val="Hyperlink"/>
+            <w:rStyle w:val="Lienhypertexte"/>
             <w:noProof/>
           </w:rPr>
           <w:t>Résumé</w:t>
@@ -4877,7 +4832,7 @@
     </w:p>
     <w:p>
       <w:pPr>
-        <w:pStyle w:val="TOC1"/>
+        <w:pStyle w:val="TM1"/>
         <w:tabs>
           <w:tab w:val="right" w:leader="underscore" w:pos="9396"/>
         </w:tabs>
@@ -4895,7 +4850,7 @@
       <w:hyperlink w:anchor="_Toc185448584" w:history="1">
         <w:r>
           <w:rPr>
-            <w:rStyle w:val="Hyperlink"/>
+            <w:rStyle w:val="Lienhypertexte"/>
             <w:noProof/>
           </w:rPr>
           <w:t>Abstract</w:t>
@@ -4952,7 +4907,7 @@
     </w:p>
     <w:p>
       <w:pPr>
-        <w:pStyle w:val="TOC1"/>
+        <w:pStyle w:val="TM1"/>
         <w:tabs>
           <w:tab w:val="right" w:leader="underscore" w:pos="9396"/>
         </w:tabs>
@@ -4970,7 +4925,7 @@
       <w:hyperlink w:anchor="_Toc185448585" w:history="1">
         <w:r>
           <w:rPr>
-            <w:rStyle w:val="Hyperlink"/>
+            <w:rStyle w:val="Lienhypertexte"/>
             <w:noProof/>
           </w:rPr>
           <w:t>Introduction Générale</w:t>
@@ -5027,7 +4982,7 @@
     </w:p>
     <w:p>
       <w:pPr>
-        <w:pStyle w:val="TOC2"/>
+        <w:pStyle w:val="TM2"/>
         <w:tabs>
           <w:tab w:val="right" w:leader="underscore" w:pos="9396"/>
         </w:tabs>
@@ -5045,7 +5000,7 @@
       <w:hyperlink w:anchor="_Toc185448586" w:history="1">
         <w:r>
           <w:rPr>
-            <w:rStyle w:val="Hyperlink"/>
+            <w:rStyle w:val="Lienhypertexte"/>
             <w:noProof/>
           </w:rPr>
           <w:t>1. Chapitre1: MACHINE LEARNING</w:t>
@@ -5102,7 +5057,7 @@
     </w:p>
     <w:p>
       <w:pPr>
-        <w:pStyle w:val="TOC3"/>
+        <w:pStyle w:val="TM3"/>
         <w:tabs>
           <w:tab w:val="right" w:leader="underscore" w:pos="9396"/>
         </w:tabs>
@@ -5118,7 +5073,7 @@
       <w:hyperlink w:anchor="_Toc185448587" w:history="1">
         <w:r>
           <w:rPr>
-            <w:rStyle w:val="Hyperlink"/>
+            <w:rStyle w:val="Lienhypertexte"/>
             <w:noProof/>
           </w:rPr>
           <w:t>1.1. Introduction du chapitre</w:t>
@@ -5175,7 +5130,7 @@
     </w:p>
     <w:p>
       <w:pPr>
-        <w:pStyle w:val="TOC3"/>
+        <w:pStyle w:val="TM3"/>
         <w:tabs>
           <w:tab w:val="right" w:leader="underscore" w:pos="9396"/>
         </w:tabs>
@@ -5191,7 +5146,7 @@
       <w:hyperlink w:anchor="_Toc185448588" w:history="1">
         <w:r>
           <w:rPr>
-            <w:rStyle w:val="Hyperlink"/>
+            <w:rStyle w:val="Lienhypertexte"/>
             <w:noProof/>
           </w:rPr>
           <w:t>1.2. Sous chapiter</w:t>
@@ -5248,7 +5203,7 @@
     </w:p>
     <w:p>
       <w:pPr>
-        <w:pStyle w:val="TOC4"/>
+        <w:pStyle w:val="TM4"/>
         <w:tabs>
           <w:tab w:val="right" w:leader="underscore" w:pos="9396"/>
         </w:tabs>
@@ -5264,7 +5219,7 @@
       <w:hyperlink w:anchor="_Toc185448589" w:history="1">
         <w:r>
           <w:rPr>
-            <w:rStyle w:val="Hyperlink"/>
+            <w:rStyle w:val="Lienhypertexte"/>
             <w:noProof/>
           </w:rPr>
           <w:t>1.2.1. Sous sous chapitre</w:t>
@@ -5321,7 +5276,7 @@
     </w:p>
     <w:p>
       <w:pPr>
-        <w:pStyle w:val="TOC4"/>
+        <w:pStyle w:val="TM4"/>
         <w:tabs>
           <w:tab w:val="right" w:leader="underscore" w:pos="9396"/>
         </w:tabs>
@@ -5337,7 +5292,7 @@
       <w:hyperlink w:anchor="_Toc185448590" w:history="1">
         <w:r>
           <w:rPr>
-            <w:rStyle w:val="Hyperlink"/>
+            <w:rStyle w:val="Lienhypertexte"/>
             <w:noProof/>
           </w:rPr>
           <w:t>1.2.2. Sous sous chapitre</w:t>
@@ -5394,7 +5349,7 @@
     </w:p>
     <w:p>
       <w:pPr>
-        <w:pStyle w:val="TOC4"/>
+        <w:pStyle w:val="TM4"/>
         <w:tabs>
           <w:tab w:val="right" w:leader="underscore" w:pos="9396"/>
         </w:tabs>
@@ -5410,7 +5365,7 @@
       <w:hyperlink w:anchor="_Toc185448591" w:history="1">
         <w:r>
           <w:rPr>
-            <w:rStyle w:val="Hyperlink"/>
+            <w:rStyle w:val="Lienhypertexte"/>
             <w:noProof/>
           </w:rPr>
           <w:t>1.2.3. Sous sous chapitre</w:t>
@@ -5467,7 +5422,7 @@
     </w:p>
     <w:p>
       <w:pPr>
-        <w:pStyle w:val="TOC3"/>
+        <w:pStyle w:val="TM3"/>
         <w:tabs>
           <w:tab w:val="right" w:leader="underscore" w:pos="9396"/>
         </w:tabs>
@@ -5483,7 +5438,7 @@
       <w:hyperlink w:anchor="_Toc185448592" w:history="1">
         <w:r>
           <w:rPr>
-            <w:rStyle w:val="Hyperlink"/>
+            <w:rStyle w:val="Lienhypertexte"/>
             <w:noProof/>
           </w:rPr>
           <w:t>1.3. Sous chapitre</w:t>
@@ -5540,7 +5495,7 @@
     </w:p>
     <w:p>
       <w:pPr>
-        <w:pStyle w:val="TOC3"/>
+        <w:pStyle w:val="TM3"/>
         <w:tabs>
           <w:tab w:val="right" w:leader="underscore" w:pos="9396"/>
         </w:tabs>
@@ -5556,7 +5511,7 @@
       <w:hyperlink w:anchor="_Toc185448593" w:history="1">
         <w:r>
           <w:rPr>
-            <w:rStyle w:val="Hyperlink"/>
+            <w:rStyle w:val="Lienhypertexte"/>
             <w:noProof/>
           </w:rPr>
           <w:t>1.4. Conclusion du chapitre</w:t>
@@ -5613,7 +5568,7 @@
     </w:p>
     <w:p>
       <w:pPr>
-        <w:pStyle w:val="TOC2"/>
+        <w:pStyle w:val="TM2"/>
         <w:tabs>
           <w:tab w:val="right" w:leader="underscore" w:pos="9396"/>
         </w:tabs>
@@ -5631,7 +5586,7 @@
       <w:hyperlink w:anchor="_Toc185448594" w:history="1">
         <w:r>
           <w:rPr>
-            <w:rStyle w:val="Hyperlink"/>
+            <w:rStyle w:val="Lienhypertexte"/>
             <w:noProof/>
           </w:rPr>
           <w:t>2. Chapitre2</w:t>
@@ -5688,7 +5643,7 @@
     </w:p>
     <w:p>
       <w:pPr>
-        <w:pStyle w:val="TOC2"/>
+        <w:pStyle w:val="TM2"/>
         <w:tabs>
           <w:tab w:val="right" w:leader="underscore" w:pos="9396"/>
         </w:tabs>
@@ -5706,7 +5661,7 @@
       <w:hyperlink w:anchor="_Toc185448595" w:history="1">
         <w:r>
           <w:rPr>
-            <w:rStyle w:val="Hyperlink"/>
+            <w:rStyle w:val="Lienhypertexte"/>
             <w:noProof/>
           </w:rPr>
           <w:t>3. Chapitre3</w:t>
@@ -5763,7 +5718,7 @@
     </w:p>
     <w:p>
       <w:pPr>
-        <w:pStyle w:val="TOC1"/>
+        <w:pStyle w:val="TM1"/>
         <w:tabs>
           <w:tab w:val="right" w:leader="underscore" w:pos="9396"/>
         </w:tabs>
@@ -5781,7 +5736,7 @@
       <w:hyperlink w:anchor="_Toc185448596" w:history="1">
         <w:r>
           <w:rPr>
-            <w:rStyle w:val="Hyperlink"/>
+            <w:rStyle w:val="Lienhypertexte"/>
             <w:noProof/>
           </w:rPr>
           <w:t>Conclusion Générale</w:t>
@@ -5838,7 +5793,7 @@
     </w:p>
     <w:p>
       <w:pPr>
-        <w:pStyle w:val="TOC1"/>
+        <w:pStyle w:val="TM1"/>
         <w:tabs>
           <w:tab w:val="right" w:leader="underscore" w:pos="9396"/>
         </w:tabs>
@@ -5856,7 +5811,7 @@
       <w:hyperlink w:anchor="_Toc185448597" w:history="1">
         <w:r>
           <w:rPr>
-            <w:rStyle w:val="Hyperlink"/>
+            <w:rStyle w:val="Lienhypertexte"/>
             <w:noProof/>
           </w:rPr>
           <w:t>Bibliographie</w:t>
@@ -5913,7 +5868,7 @@
     </w:p>
     <w:p>
       <w:pPr>
-        <w:pStyle w:val="TOC1"/>
+        <w:pStyle w:val="TM1"/>
         <w:tabs>
           <w:tab w:val="right" w:leader="underscore" w:pos="9396"/>
         </w:tabs>
@@ -5931,7 +5886,7 @@
       <w:hyperlink w:anchor="_Toc185448598" w:history="1">
         <w:r>
           <w:rPr>
-            <w:rStyle w:val="Hyperlink"/>
+            <w:rStyle w:val="Lienhypertexte"/>
             <w:noProof/>
           </w:rPr>
           <w:t>Table des matières</w:t>
@@ -5988,7 +5943,7 @@
     </w:p>
     <w:p>
       <w:pPr>
-        <w:pStyle w:val="TOC1"/>
+        <w:pStyle w:val="TM1"/>
         <w:tabs>
           <w:tab w:val="right" w:leader="underscore" w:pos="9396"/>
         </w:tabs>
@@ -6006,7 +5961,7 @@
       <w:hyperlink w:anchor="_Toc185448599" w:history="1">
         <w:r>
           <w:rPr>
-            <w:rStyle w:val="Hyperlink"/>
+            <w:rStyle w:val="Lienhypertexte"/>
             <w:noProof/>
           </w:rPr>
           <w:t>Annexes</w:t>
@@ -6084,16 +6039,16 @@
     </w:p>
     <w:p>
       <w:pPr>
-        <w:pStyle w:val="Heading1"/>
-      </w:pPr>
-      <w:bookmarkStart w:id="40" w:name="_Toc185448576"/>
-      <w:bookmarkStart w:id="41" w:name="_Toc185448599"/>
+        <w:pStyle w:val="Titre1"/>
+      </w:pPr>
+      <w:bookmarkStart w:id="39" w:name="_Toc185448576"/>
+      <w:bookmarkStart w:id="40" w:name="_Toc185448599"/>
       <w:r>
         <w:lastRenderedPageBreak/>
         <w:t>Annexes</w:t>
       </w:r>
+      <w:bookmarkEnd w:id="39"/>
       <w:bookmarkEnd w:id="40"/>
-      <w:bookmarkEnd w:id="41"/>
     </w:p>
     <w:p/>
     <w:p/>
@@ -6101,7 +6056,7 @@
     <w:p/>
     <w:p>
       <w:pPr>
-        <w:pStyle w:val="ListParagraph"/>
+        <w:pStyle w:val="Paragraphedeliste"/>
         <w:ind w:left="1440"/>
       </w:pPr>
       <w:r>
@@ -6122,7 +6077,7 @@
 </file>
 
 <file path=word/endnotes.xml><?xml version="1.0" encoding="utf-8"?>
-<w:endnotes xmlns:wpc="http://schemas.microsoft.com/office/word/2010/wordprocessingCanvas" xmlns:cx="http://schemas.microsoft.com/office/drawing/2014/chartex" xmlns:mc="http://schemas.openxmlformats.org/markup-compatibility/2006" xmlns:o="urn:schemas-microsoft-com:office:office" xmlns:r="http://schemas.openxmlformats.org/officeDocument/2006/relationships" xmlns:m="http://schemas.openxmlformats.org/officeDocument/2006/math" xmlns:v="urn:schemas-microsoft-com:vml" xmlns:wp14="http://schemas.microsoft.com/office/word/2010/wordprocessingDrawing" xmlns:wp="http://schemas.openxmlformats.org/drawingml/2006/wordprocessingDrawing" xmlns:w10="urn:schemas-microsoft-com:office:word" xmlns:w="http://schemas.openxmlformats.org/wordprocessingml/2006/main" xmlns:w14="http://schemas.microsoft.com/office/word/2010/wordml" xmlns:w15="http://schemas.microsoft.com/office/word/2012/wordml" xmlns:w16se="http://schemas.microsoft.com/office/word/2015/wordml/symex" xmlns:wpg="http://schemas.microsoft.com/office/word/2010/wordprocessingGroup" xmlns:wpi="http://schemas.microsoft.com/office/word/2010/wordprocessingInk" xmlns:wne="http://schemas.microsoft.com/office/word/2006/wordml" xmlns:wps="http://schemas.microsoft.com/office/word/2010/wordprocessingShape" mc:Ignorable="w14 w15 w16se wp14">
+<w:endnotes xmlns:wpc="http://schemas.microsoft.com/office/word/2010/wordprocessingCanvas" xmlns:cx="http://schemas.microsoft.com/office/drawing/2014/chartex" xmlns:cx1="http://schemas.microsoft.com/office/drawing/2015/9/8/chartex" xmlns:cx2="http://schemas.microsoft.com/office/drawing/2015/10/21/chartex" xmlns:cx3="http://schemas.microsoft.com/office/drawing/2016/5/9/chartex" xmlns:cx4="http://schemas.microsoft.com/office/drawing/2016/5/10/chartex" xmlns:cx5="http://schemas.microsoft.com/office/drawing/2016/5/11/chartex" xmlns:cx6="http://schemas.microsoft.com/office/drawing/2016/5/12/chartex" xmlns:cx7="http://schemas.microsoft.com/office/drawing/2016/5/13/chartex" xmlns:cx8="http://schemas.microsoft.com/office/drawing/2016/5/14/chartex" xmlns:mc="http://schemas.openxmlformats.org/markup-compatibility/2006" xmlns:aink="http://schemas.microsoft.com/office/drawing/2016/ink" xmlns:am3d="http://schemas.microsoft.com/office/drawing/2017/model3d" xmlns:o="urn:schemas-microsoft-com:office:office" xmlns:oel="http://schemas.microsoft.com/office/2019/extlst" xmlns:r="http://schemas.openxmlformats.org/officeDocument/2006/relationships" xmlns:m="http://schemas.openxmlformats.org/officeDocument/2006/math" xmlns:v="urn:schemas-microsoft-com:vml" xmlns:wp14="http://schemas.microsoft.com/office/word/2010/wordprocessingDrawing" xmlns:wp="http://schemas.openxmlformats.org/drawingml/2006/wordprocessingDrawing" xmlns:w10="urn:schemas-microsoft-com:office:word" xmlns:w="http://schemas.openxmlformats.org/wordprocessingml/2006/main" xmlns:w14="http://schemas.microsoft.com/office/word/2010/wordml" xmlns:w15="http://schemas.microsoft.com/office/word/2012/wordml" xmlns:w16cex="http://schemas.microsoft.com/office/word/2018/wordml/cex" xmlns:w16cid="http://schemas.microsoft.com/office/word/2016/wordml/cid" xmlns:w16="http://schemas.microsoft.com/office/word/2018/wordml" xmlns:w16du="http://schemas.microsoft.com/office/word/2023/wordml/word16du" xmlns:w16sdtdh="http://schemas.microsoft.com/office/word/2020/wordml/sdtdatahash" xmlns:w16sdtfl="http://schemas.microsoft.com/office/word/2024/wordml/sdtformatlock" xmlns:w16se="http://schemas.microsoft.com/office/word/2015/wordml/symex" xmlns:wpg="http://schemas.microsoft.com/office/word/2010/wordprocessingGroup" xmlns:wpi="http://schemas.microsoft.com/office/word/2010/wordprocessingInk" xmlns:wne="http://schemas.microsoft.com/office/word/2006/wordml" xmlns:wps="http://schemas.microsoft.com/office/word/2010/wordprocessingShape" mc:Ignorable="w14 w15 w16se w16cid w16 w16cex w16sdtdh w16sdtfl w16du wp14">
   <w:endnote w:type="separator" w:id="-1">
     <w:p>
       <w:pPr>
@@ -6147,7 +6102,7 @@
 </file>
 
 <file path=word/footer1.xml><?xml version="1.0" encoding="utf-8"?>
-<w:ftr xmlns:wpc="http://schemas.microsoft.com/office/word/2010/wordprocessingCanvas" xmlns:cx="http://schemas.microsoft.com/office/drawing/2014/chartex" xmlns:mc="http://schemas.openxmlformats.org/markup-compatibility/2006" xmlns:o="urn:schemas-microsoft-com:office:office" xmlns:r="http://schemas.openxmlformats.org/officeDocument/2006/relationships" xmlns:m="http://schemas.openxmlformats.org/officeDocument/2006/math" xmlns:v="urn:schemas-microsoft-com:vml" xmlns:wp14="http://schemas.microsoft.com/office/word/2010/wordprocessingDrawing" xmlns:wp="http://schemas.openxmlformats.org/drawingml/2006/wordprocessingDrawing" xmlns:w10="urn:schemas-microsoft-com:office:word" xmlns:w="http://schemas.openxmlformats.org/wordprocessingml/2006/main" xmlns:w14="http://schemas.microsoft.com/office/word/2010/wordml" xmlns:w15="http://schemas.microsoft.com/office/word/2012/wordml" xmlns:w16se="http://schemas.microsoft.com/office/word/2015/wordml/symex" xmlns:wpg="http://schemas.microsoft.com/office/word/2010/wordprocessingGroup" xmlns:wpi="http://schemas.microsoft.com/office/word/2010/wordprocessingInk" xmlns:wne="http://schemas.microsoft.com/office/word/2006/wordml" xmlns:wps="http://schemas.microsoft.com/office/word/2010/wordprocessingShape" mc:Ignorable="w14 w15 w16se wp14">
+<w:ftr xmlns:wpc="http://schemas.microsoft.com/office/word/2010/wordprocessingCanvas" xmlns:cx="http://schemas.microsoft.com/office/drawing/2014/chartex" xmlns:cx1="http://schemas.microsoft.com/office/drawing/2015/9/8/chartex" xmlns:cx2="http://schemas.microsoft.com/office/drawing/2015/10/21/chartex" xmlns:cx3="http://schemas.microsoft.com/office/drawing/2016/5/9/chartex" xmlns:cx4="http://schemas.microsoft.com/office/drawing/2016/5/10/chartex" xmlns:cx5="http://schemas.microsoft.com/office/drawing/2016/5/11/chartex" xmlns:cx6="http://schemas.microsoft.com/office/drawing/2016/5/12/chartex" xmlns:cx7="http://schemas.microsoft.com/office/drawing/2016/5/13/chartex" xmlns:cx8="http://schemas.microsoft.com/office/drawing/2016/5/14/chartex" xmlns:mc="http://schemas.openxmlformats.org/markup-compatibility/2006" xmlns:aink="http://schemas.microsoft.com/office/drawing/2016/ink" xmlns:am3d="http://schemas.microsoft.com/office/drawing/2017/model3d" xmlns:o="urn:schemas-microsoft-com:office:office" xmlns:oel="http://schemas.microsoft.com/office/2019/extlst" xmlns:r="http://schemas.openxmlformats.org/officeDocument/2006/relationships" xmlns:m="http://schemas.openxmlformats.org/officeDocument/2006/math" xmlns:v="urn:schemas-microsoft-com:vml" xmlns:wp14="http://schemas.microsoft.com/office/word/2010/wordprocessingDrawing" xmlns:wp="http://schemas.openxmlformats.org/drawingml/2006/wordprocessingDrawing" xmlns:w10="urn:schemas-microsoft-com:office:word" xmlns:w="http://schemas.openxmlformats.org/wordprocessingml/2006/main" xmlns:w14="http://schemas.microsoft.com/office/word/2010/wordml" xmlns:w15="http://schemas.microsoft.com/office/word/2012/wordml" xmlns:w16cex="http://schemas.microsoft.com/office/word/2018/wordml/cex" xmlns:w16cid="http://schemas.microsoft.com/office/word/2016/wordml/cid" xmlns:w16="http://schemas.microsoft.com/office/word/2018/wordml" xmlns:w16du="http://schemas.microsoft.com/office/word/2023/wordml/word16du" xmlns:w16sdtdh="http://schemas.microsoft.com/office/word/2020/wordml/sdtdatahash" xmlns:w16sdtfl="http://schemas.microsoft.com/office/word/2024/wordml/sdtformatlock" xmlns:w16se="http://schemas.microsoft.com/office/word/2015/wordml/symex" xmlns:wpg="http://schemas.microsoft.com/office/word/2010/wordprocessingGroup" xmlns:wpi="http://schemas.microsoft.com/office/word/2010/wordprocessingInk" xmlns:wne="http://schemas.microsoft.com/office/word/2006/wordml" xmlns:wps="http://schemas.microsoft.com/office/word/2010/wordprocessingShape" mc:Ignorable="w14 w15 w16se w16cid w16 w16cex w16sdtdh w16sdtfl w16du wp14">
   <w:tbl>
     <w:tblPr>
       <w:tblW w:w="0" w:type="auto"/>
@@ -6169,7 +6124,7 @@
         </w:tcPr>
         <w:p>
           <w:pPr>
-            <w:pStyle w:val="Header"/>
+            <w:pStyle w:val="En-tte"/>
             <w:ind w:left="-115"/>
             <w:jc w:val="left"/>
           </w:pPr>
@@ -6181,7 +6136,7 @@
         </w:tcPr>
         <w:p>
           <w:pPr>
-            <w:pStyle w:val="Header"/>
+            <w:pStyle w:val="En-tte"/>
             <w:jc w:val="center"/>
           </w:pPr>
         </w:p>
@@ -6198,10 +6153,10 @@
 </file>
 
 <file path=word/footer2.xml><?xml version="1.0" encoding="utf-8"?>
-<w:ftr xmlns:wpc="http://schemas.microsoft.com/office/word/2010/wordprocessingCanvas" xmlns:cx="http://schemas.microsoft.com/office/drawing/2014/chartex" xmlns:mc="http://schemas.openxmlformats.org/markup-compatibility/2006" xmlns:o="urn:schemas-microsoft-com:office:office" xmlns:r="http://schemas.openxmlformats.org/officeDocument/2006/relationships" xmlns:m="http://schemas.openxmlformats.org/officeDocument/2006/math" xmlns:v="urn:schemas-microsoft-com:vml" xmlns:wp14="http://schemas.microsoft.com/office/word/2010/wordprocessingDrawing" xmlns:wp="http://schemas.openxmlformats.org/drawingml/2006/wordprocessingDrawing" xmlns:w10="urn:schemas-microsoft-com:office:word" xmlns:w="http://schemas.openxmlformats.org/wordprocessingml/2006/main" xmlns:w14="http://schemas.microsoft.com/office/word/2010/wordml" xmlns:w15="http://schemas.microsoft.com/office/word/2012/wordml" xmlns:w16se="http://schemas.microsoft.com/office/word/2015/wordml/symex" xmlns:wpg="http://schemas.microsoft.com/office/word/2010/wordprocessingGroup" xmlns:wpi="http://schemas.microsoft.com/office/word/2010/wordprocessingInk" xmlns:wne="http://schemas.microsoft.com/office/word/2006/wordml" xmlns:wps="http://schemas.microsoft.com/office/word/2010/wordprocessingShape" mc:Ignorable="w14 w15 w16se wp14">
+<w:ftr xmlns:wpc="http://schemas.microsoft.com/office/word/2010/wordprocessingCanvas" xmlns:cx="http://schemas.microsoft.com/office/drawing/2014/chartex" xmlns:cx1="http://schemas.microsoft.com/office/drawing/2015/9/8/chartex" xmlns:cx2="http://schemas.microsoft.com/office/drawing/2015/10/21/chartex" xmlns:cx3="http://schemas.microsoft.com/office/drawing/2016/5/9/chartex" xmlns:cx4="http://schemas.microsoft.com/office/drawing/2016/5/10/chartex" xmlns:cx5="http://schemas.microsoft.com/office/drawing/2016/5/11/chartex" xmlns:cx6="http://schemas.microsoft.com/office/drawing/2016/5/12/chartex" xmlns:cx7="http://schemas.microsoft.com/office/drawing/2016/5/13/chartex" xmlns:cx8="http://schemas.microsoft.com/office/drawing/2016/5/14/chartex" xmlns:mc="http://schemas.openxmlformats.org/markup-compatibility/2006" xmlns:aink="http://schemas.microsoft.com/office/drawing/2016/ink" xmlns:am3d="http://schemas.microsoft.com/office/drawing/2017/model3d" xmlns:o="urn:schemas-microsoft-com:office:office" xmlns:oel="http://schemas.microsoft.com/office/2019/extlst" xmlns:r="http://schemas.openxmlformats.org/officeDocument/2006/relationships" xmlns:m="http://schemas.openxmlformats.org/officeDocument/2006/math" xmlns:v="urn:schemas-microsoft-com:vml" xmlns:wp14="http://schemas.microsoft.com/office/word/2010/wordprocessingDrawing" xmlns:wp="http://schemas.openxmlformats.org/drawingml/2006/wordprocessingDrawing" xmlns:w10="urn:schemas-microsoft-com:office:word" xmlns:w="http://schemas.openxmlformats.org/wordprocessingml/2006/main" xmlns:w14="http://schemas.microsoft.com/office/word/2010/wordml" xmlns:w15="http://schemas.microsoft.com/office/word/2012/wordml" xmlns:w16cex="http://schemas.microsoft.com/office/word/2018/wordml/cex" xmlns:w16cid="http://schemas.microsoft.com/office/word/2016/wordml/cid" xmlns:w16="http://schemas.microsoft.com/office/word/2018/wordml" xmlns:w16du="http://schemas.microsoft.com/office/word/2023/wordml/word16du" xmlns:w16sdtdh="http://schemas.microsoft.com/office/word/2020/wordml/sdtdatahash" xmlns:w16sdtfl="http://schemas.microsoft.com/office/word/2024/wordml/sdtformatlock" xmlns:w16se="http://schemas.microsoft.com/office/word/2015/wordml/symex" xmlns:wpg="http://schemas.microsoft.com/office/word/2010/wordprocessingGroup" xmlns:wpi="http://schemas.microsoft.com/office/word/2010/wordprocessingInk" xmlns:wne="http://schemas.microsoft.com/office/word/2006/wordml" xmlns:wps="http://schemas.microsoft.com/office/word/2010/wordprocessingShape" mc:Ignorable="w14 w15 w16se w16cid w16 w16cex w16sdtdh w16sdtfl w16du wp14">
   <w:p>
     <w:pPr>
-      <w:pStyle w:val="Footer"/>
+      <w:pStyle w:val="Pieddepage"/>
       <w:rPr>
         <w:lang w:val="fr-FR"/>
       </w:rPr>
@@ -6261,9 +6216,9 @@
             </wp:anchor>
           </w:drawing>
         </mc:Choice>
-        <mc:Fallback xmlns:a="http://schemas.openxmlformats.org/drawingml/2006/main" xmlns:w16sdtfl="http://schemas.microsoft.com/office/word/2024/wordml/sdtformatlock" xmlns:w16sdtdh="http://schemas.microsoft.com/office/word/2020/wordml/sdtdatahash" xmlns:w16du="http://schemas.microsoft.com/office/word/2023/wordml/word16du" xmlns:w16="http://schemas.microsoft.com/office/word/2018/wordml" xmlns:w16cid="http://schemas.microsoft.com/office/word/2016/wordml/cid" xmlns:w16cex="http://schemas.microsoft.com/office/word/2018/wordml/cex" xmlns:oel="http://schemas.microsoft.com/office/2019/extlst" xmlns:am3d="http://schemas.microsoft.com/office/drawing/2017/model3d" xmlns:aink="http://schemas.microsoft.com/office/drawing/2016/ink" xmlns:cx8="http://schemas.microsoft.com/office/drawing/2016/5/14/chartex" xmlns:cx7="http://schemas.microsoft.com/office/drawing/2016/5/13/chartex" xmlns:cx6="http://schemas.microsoft.com/office/drawing/2016/5/12/chartex" xmlns:cx5="http://schemas.microsoft.com/office/drawing/2016/5/11/chartex" xmlns:cx4="http://schemas.microsoft.com/office/drawing/2016/5/10/chartex" xmlns:cx3="http://schemas.microsoft.com/office/drawing/2016/5/9/chartex" xmlns:cx2="http://schemas.microsoft.com/office/drawing/2015/10/21/chartex" xmlns:cx1="http://schemas.microsoft.com/office/drawing/2015/9/8/chartex">
-          <w:pict w14:anchorId="135B5060">
-            <v:line id="Connecteur droit 5" style="position:absolute;z-index:251688960;visibility:visible;mso-wrap-style:square;mso-wrap-distance-left:9pt;mso-wrap-distance-top:0;mso-wrap-distance-right:9pt;mso-wrap-distance-bottom:0;mso-position-horizontal:absolute;mso-position-horizontal-relative:text;mso-position-vertical:absolute;mso-position-vertical-relative:text" o:spid="_x0000_s1026" strokecolor="#156082 [3204]" strokeweight=".5pt" from="0,-5.25pt" to="461.25pt,-4.5pt" w14:anchorId="761E5E65" o:gfxdata="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">
+        <mc:Fallback>
+          <w:pict>
+            <v:line w14:anchorId="7AAC3643" id="Connecteur droit 5" o:spid="_x0000_s1026" style="position:absolute;z-index:251688960;visibility:visible;mso-wrap-style:square;mso-wrap-distance-left:9pt;mso-wrap-distance-top:0;mso-wrap-distance-right:9pt;mso-wrap-distance-bottom:0;mso-position-horizontal:absolute;mso-position-horizontal-relative:text;mso-position-vertical:absolute;mso-position-vertical-relative:text" from="0,-5.25pt" to="461.25pt,-4.5pt" o:gfxdata="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" strokecolor="#156082 [3204]" strokeweight=".5pt">
               <v:stroke joinstyle="miter"/>
             </v:line>
           </w:pict>
@@ -6314,7 +6269,7 @@
                       <w:txbxContent>
                         <w:p>
                           <w:pPr>
-                            <w:pStyle w:val="NoSpacing"/>
+                            <w:pStyle w:val="Sansinterligne"/>
                             <w:rPr>
                               <w:sz w:val="22"/>
                             </w:rPr>
@@ -6330,7 +6285,6 @@
                                 <w:docPartUnique/>
                               </w:docPartObj>
                             </w:sdtPr>
-                            <w:sdtEndPr/>
                             <w:sdtContent>
                               <w:r>
                                 <w:rPr>
@@ -6392,12 +6346,12 @@
               <v:stroke joinstyle="miter"/>
               <v:path gradientshapeok="t" o:connecttype="rect"/>
             </v:shapetype>
-            <v:shape id="Zone de texte 4" o:spid="_x0000_s1027" type="#_x0000_t202" style="position:absolute;left:0;text-align:left;margin-left:420.4pt;margin-top:-1.4pt;width:107.25pt;height:33pt;z-index:251677696;visibility:visible;mso-wrap-style:square;mso-width-percent:0;mso-height-percent:0;mso-wrap-distance-left:9pt;mso-wrap-distance-top:0;mso-wrap-distance-right:9pt;mso-wrap-distance-bottom:0;mso-position-horizontal:absolute;mso-position-horizontal-relative:text;mso-position-vertical:absolute;mso-position-vertical-relative:text;mso-width-percent:0;mso-height-percent:0;mso-width-relative:margin;mso-height-relative:margin;v-text-anchor:top" o:gfxdata="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" fillcolor="white [3201]" stroked="f" strokeweight=".5pt">
+            <v:shape id="Zone de texte 4" o:spid="_x0000_s1027" type="#_x0000_t202" style="position:absolute;left:0;text-align:left;margin-left:420.4pt;margin-top:-1.4pt;width:107.25pt;height:33pt;z-index:251677696;visibility:visible;mso-wrap-style:square;mso-width-percent:0;mso-height-percent:0;mso-wrap-distance-left:9pt;mso-wrap-distance-top:0;mso-wrap-distance-right:9pt;mso-wrap-distance-bottom:0;mso-position-horizontal:absolute;mso-position-horizontal-relative:text;mso-position-vertical:absolute;mso-position-vertical-relative:text;mso-width-percent:0;mso-height-percent:0;mso-width-relative:margin;mso-height-relative:margin;v-text-anchor:top" o:gfxdata="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" fillcolor="white [3201]" stroked="f" strokeweight=".5pt">
               <v:textbox>
                 <w:txbxContent>
                   <w:p>
                     <w:pPr>
-                      <w:pStyle w:val="NoSpacing"/>
+                      <w:pStyle w:val="Sansinterligne"/>
                       <w:rPr>
                         <w:sz w:val="22"/>
                       </w:rPr>
@@ -6413,7 +6367,6 @@
                           <w:docPartUnique/>
                         </w:docPartObj>
                       </w:sdtPr>
-                      <w:sdtEndPr/>
                       <w:sdtContent>
                         <w:r>
                           <w:rPr>
@@ -6467,10 +6420,10 @@
 </file>
 
 <file path=word/footer3.xml><?xml version="1.0" encoding="utf-8"?>
-<w:ftr xmlns:wpc="http://schemas.microsoft.com/office/word/2010/wordprocessingCanvas" xmlns:cx="http://schemas.microsoft.com/office/drawing/2014/chartex" xmlns:mc="http://schemas.openxmlformats.org/markup-compatibility/2006" xmlns:o="urn:schemas-microsoft-com:office:office" xmlns:r="http://schemas.openxmlformats.org/officeDocument/2006/relationships" xmlns:m="http://schemas.openxmlformats.org/officeDocument/2006/math" xmlns:v="urn:schemas-microsoft-com:vml" xmlns:wp14="http://schemas.microsoft.com/office/word/2010/wordprocessingDrawing" xmlns:wp="http://schemas.openxmlformats.org/drawingml/2006/wordprocessingDrawing" xmlns:w10="urn:schemas-microsoft-com:office:word" xmlns:w="http://schemas.openxmlformats.org/wordprocessingml/2006/main" xmlns:w14="http://schemas.microsoft.com/office/word/2010/wordml" xmlns:w15="http://schemas.microsoft.com/office/word/2012/wordml" xmlns:w16se="http://schemas.microsoft.com/office/word/2015/wordml/symex" xmlns:wpg="http://schemas.microsoft.com/office/word/2010/wordprocessingGroup" xmlns:wpi="http://schemas.microsoft.com/office/word/2010/wordprocessingInk" xmlns:wne="http://schemas.microsoft.com/office/word/2006/wordml" xmlns:wps="http://schemas.microsoft.com/office/word/2010/wordprocessingShape" mc:Ignorable="w14 w15 w16se wp14">
+<w:ftr xmlns:wpc="http://schemas.microsoft.com/office/word/2010/wordprocessingCanvas" xmlns:cx="http://schemas.microsoft.com/office/drawing/2014/chartex" xmlns:cx1="http://schemas.microsoft.com/office/drawing/2015/9/8/chartex" xmlns:cx2="http://schemas.microsoft.com/office/drawing/2015/10/21/chartex" xmlns:cx3="http://schemas.microsoft.com/office/drawing/2016/5/9/chartex" xmlns:cx4="http://schemas.microsoft.com/office/drawing/2016/5/10/chartex" xmlns:cx5="http://schemas.microsoft.com/office/drawing/2016/5/11/chartex" xmlns:cx6="http://schemas.microsoft.com/office/drawing/2016/5/12/chartex" xmlns:cx7="http://schemas.microsoft.com/office/drawing/2016/5/13/chartex" xmlns:cx8="http://schemas.microsoft.com/office/drawing/2016/5/14/chartex" xmlns:mc="http://schemas.openxmlformats.org/markup-compatibility/2006" xmlns:aink="http://schemas.microsoft.com/office/drawing/2016/ink" xmlns:am3d="http://schemas.microsoft.com/office/drawing/2017/model3d" xmlns:o="urn:schemas-microsoft-com:office:office" xmlns:oel="http://schemas.microsoft.com/office/2019/extlst" xmlns:r="http://schemas.openxmlformats.org/officeDocument/2006/relationships" xmlns:m="http://schemas.openxmlformats.org/officeDocument/2006/math" xmlns:v="urn:schemas-microsoft-com:vml" xmlns:wp14="http://schemas.microsoft.com/office/word/2010/wordprocessingDrawing" xmlns:wp="http://schemas.openxmlformats.org/drawingml/2006/wordprocessingDrawing" xmlns:w10="urn:schemas-microsoft-com:office:word" xmlns:w="http://schemas.openxmlformats.org/wordprocessingml/2006/main" xmlns:w14="http://schemas.microsoft.com/office/word/2010/wordml" xmlns:w15="http://schemas.microsoft.com/office/word/2012/wordml" xmlns:w16cex="http://schemas.microsoft.com/office/word/2018/wordml/cex" xmlns:w16cid="http://schemas.microsoft.com/office/word/2016/wordml/cid" xmlns:w16="http://schemas.microsoft.com/office/word/2018/wordml" xmlns:w16du="http://schemas.microsoft.com/office/word/2023/wordml/word16du" xmlns:w16sdtdh="http://schemas.microsoft.com/office/word/2020/wordml/sdtdatahash" xmlns:w16sdtfl="http://schemas.microsoft.com/office/word/2024/wordml/sdtformatlock" xmlns:w16se="http://schemas.microsoft.com/office/word/2015/wordml/symex" xmlns:wpg="http://schemas.microsoft.com/office/word/2010/wordprocessingGroup" xmlns:wpi="http://schemas.microsoft.com/office/word/2010/wordprocessingInk" xmlns:wne="http://schemas.microsoft.com/office/word/2006/wordml" xmlns:wps="http://schemas.microsoft.com/office/word/2010/wordprocessingShape" mc:Ignorable="w14 w15 w16se w16cid w16 w16cex w16sdtdh w16sdtfl w16du wp14">
   <w:p>
     <w:pPr>
-      <w:pStyle w:val="Footer"/>
+      <w:pStyle w:val="Pieddepage"/>
       <w:rPr>
         <w:lang w:val="fr-FR"/>
       </w:rPr>
@@ -6530,9 +6483,9 @@
             </wp:anchor>
           </w:drawing>
         </mc:Choice>
-        <mc:Fallback xmlns:a="http://schemas.openxmlformats.org/drawingml/2006/main" xmlns:w16sdtfl="http://schemas.microsoft.com/office/word/2024/wordml/sdtformatlock" xmlns:w16sdtdh="http://schemas.microsoft.com/office/word/2020/wordml/sdtdatahash" xmlns:w16du="http://schemas.microsoft.com/office/word/2023/wordml/word16du" xmlns:w16="http://schemas.microsoft.com/office/word/2018/wordml" xmlns:w16cid="http://schemas.microsoft.com/office/word/2016/wordml/cid" xmlns:w16cex="http://schemas.microsoft.com/office/word/2018/wordml/cex" xmlns:oel="http://schemas.microsoft.com/office/2019/extlst" xmlns:am3d="http://schemas.microsoft.com/office/drawing/2017/model3d" xmlns:aink="http://schemas.microsoft.com/office/drawing/2016/ink" xmlns:cx8="http://schemas.microsoft.com/office/drawing/2016/5/14/chartex" xmlns:cx7="http://schemas.microsoft.com/office/drawing/2016/5/13/chartex" xmlns:cx6="http://schemas.microsoft.com/office/drawing/2016/5/12/chartex" xmlns:cx5="http://schemas.microsoft.com/office/drawing/2016/5/11/chartex" xmlns:cx4="http://schemas.microsoft.com/office/drawing/2016/5/10/chartex" xmlns:cx3="http://schemas.microsoft.com/office/drawing/2016/5/9/chartex" xmlns:cx2="http://schemas.microsoft.com/office/drawing/2015/10/21/chartex" xmlns:cx1="http://schemas.microsoft.com/office/drawing/2015/9/8/chartex">
-          <w:pict w14:anchorId="7CE01B28">
-            <v:line id="Connecteur droit 5" style="position:absolute;z-index:251686912;visibility:visible;mso-wrap-style:square;mso-wrap-distance-left:9pt;mso-wrap-distance-top:0;mso-wrap-distance-right:9pt;mso-wrap-distance-bottom:0;mso-position-horizontal:absolute;mso-position-horizontal-relative:margin;mso-position-vertical:absolute;mso-position-vertical-relative:text" o:spid="_x0000_s1026" strokecolor="#156082 [3204]" strokeweight=".5pt" from="0,-6.75pt" to="461.25pt,-6pt" w14:anchorId="4985D0FE" o:gfxdata="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">
+        <mc:Fallback>
+          <w:pict>
+            <v:line w14:anchorId="49AE10B5" id="Connecteur droit 5" o:spid="_x0000_s1026" style="position:absolute;z-index:251686912;visibility:visible;mso-wrap-style:square;mso-wrap-distance-left:9pt;mso-wrap-distance-top:0;mso-wrap-distance-right:9pt;mso-wrap-distance-bottom:0;mso-position-horizontal:absolute;mso-position-horizontal-relative:margin;mso-position-vertical:absolute;mso-position-vertical-relative:text" from="0,-6.75pt" to="461.25pt,-6pt" o:gfxdata="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" strokecolor="#156082 [3204]" strokeweight=".5pt">
               <v:stroke joinstyle="miter"/>
               <w10:wrap anchorx="margin"/>
             </v:line>
@@ -6584,7 +6537,7 @@
                       <w:txbxContent>
                         <w:p>
                           <w:pPr>
-                            <w:pStyle w:val="NoSpacing"/>
+                            <w:pStyle w:val="Sansinterligne"/>
                             <w:rPr>
                               <w:sz w:val="22"/>
                             </w:rPr>
@@ -6647,12 +6600,12 @@
               <v:stroke joinstyle="miter"/>
               <v:path gradientshapeok="t" o:connecttype="rect"/>
             </v:shapetype>
-            <v:shape id="_x0000_s1029" type="#_x0000_t202" style="position:absolute;left:0;text-align:left;margin-left:420.4pt;margin-top:-1.4pt;width:107.25pt;height:33pt;z-index:251679744;visibility:visible;mso-wrap-style:square;mso-width-percent:0;mso-height-percent:0;mso-wrap-distance-left:9pt;mso-wrap-distance-top:0;mso-wrap-distance-right:9pt;mso-wrap-distance-bottom:0;mso-position-horizontal:absolute;mso-position-horizontal-relative:text;mso-position-vertical:absolute;mso-position-vertical-relative:text;mso-width-percent:0;mso-height-percent:0;mso-width-relative:margin;mso-height-relative:margin;v-text-anchor:top" o:gfxdata="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" fillcolor="white [3201]" stroked="f" strokeweight=".5pt">
+            <v:shape id="_x0000_s1029" type="#_x0000_t202" style="position:absolute;left:0;text-align:left;margin-left:420.4pt;margin-top:-1.4pt;width:107.25pt;height:33pt;z-index:251679744;visibility:visible;mso-wrap-style:square;mso-width-percent:0;mso-height-percent:0;mso-wrap-distance-left:9pt;mso-wrap-distance-top:0;mso-wrap-distance-right:9pt;mso-wrap-distance-bottom:0;mso-position-horizontal:absolute;mso-position-horizontal-relative:text;mso-position-vertical:absolute;mso-position-vertical-relative:text;mso-width-percent:0;mso-height-percent:0;mso-width-relative:margin;mso-height-relative:margin;v-text-anchor:top" o:gfxdata="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" fillcolor="white [3201]" stroked="f" strokeweight=".5pt">
               <v:textbox>
                 <w:txbxContent>
                   <w:p>
                     <w:pPr>
-                      <w:pStyle w:val="NoSpacing"/>
+                      <w:pStyle w:val="Sansinterligne"/>
                       <w:rPr>
                         <w:sz w:val="22"/>
                       </w:rPr>
@@ -6705,7 +6658,7 @@
   </w:p>
   <w:p>
     <w:pPr>
-      <w:pStyle w:val="Footer"/>
+      <w:pStyle w:val="Pieddepage"/>
       <w:rPr>
         <w:lang w:val="fr-FR"/>
       </w:rPr>
@@ -6713,7 +6666,7 @@
   </w:p>
   <w:p>
     <w:pPr>
-      <w:pStyle w:val="Footer"/>
+      <w:pStyle w:val="Pieddepage"/>
       <w:rPr>
         <w:lang w:val="fr-FR"/>
       </w:rPr>
@@ -6723,10 +6676,10 @@
 </file>
 
 <file path=word/footer4.xml><?xml version="1.0" encoding="utf-8"?>
-<w:ftr xmlns:wpc="http://schemas.microsoft.com/office/word/2010/wordprocessingCanvas" xmlns:cx="http://schemas.microsoft.com/office/drawing/2014/chartex" xmlns:mc="http://schemas.openxmlformats.org/markup-compatibility/2006" xmlns:o="urn:schemas-microsoft-com:office:office" xmlns:r="http://schemas.openxmlformats.org/officeDocument/2006/relationships" xmlns:m="http://schemas.openxmlformats.org/officeDocument/2006/math" xmlns:v="urn:schemas-microsoft-com:vml" xmlns:wp14="http://schemas.microsoft.com/office/word/2010/wordprocessingDrawing" xmlns:wp="http://schemas.openxmlformats.org/drawingml/2006/wordprocessingDrawing" xmlns:w10="urn:schemas-microsoft-com:office:word" xmlns:w="http://schemas.openxmlformats.org/wordprocessingml/2006/main" xmlns:w14="http://schemas.microsoft.com/office/word/2010/wordml" xmlns:w15="http://schemas.microsoft.com/office/word/2012/wordml" xmlns:w16se="http://schemas.microsoft.com/office/word/2015/wordml/symex" xmlns:wpg="http://schemas.microsoft.com/office/word/2010/wordprocessingGroup" xmlns:wpi="http://schemas.microsoft.com/office/word/2010/wordprocessingInk" xmlns:wne="http://schemas.microsoft.com/office/word/2006/wordml" xmlns:wps="http://schemas.microsoft.com/office/word/2010/wordprocessingShape" mc:Ignorable="w14 w15 w16se wp14">
+<w:ftr xmlns:wpc="http://schemas.microsoft.com/office/word/2010/wordprocessingCanvas" xmlns:cx="http://schemas.microsoft.com/office/drawing/2014/chartex" xmlns:cx1="http://schemas.microsoft.com/office/drawing/2015/9/8/chartex" xmlns:cx2="http://schemas.microsoft.com/office/drawing/2015/10/21/chartex" xmlns:cx3="http://schemas.microsoft.com/office/drawing/2016/5/9/chartex" xmlns:cx4="http://schemas.microsoft.com/office/drawing/2016/5/10/chartex" xmlns:cx5="http://schemas.microsoft.com/office/drawing/2016/5/11/chartex" xmlns:cx6="http://schemas.microsoft.com/office/drawing/2016/5/12/chartex" xmlns:cx7="http://schemas.microsoft.com/office/drawing/2016/5/13/chartex" xmlns:cx8="http://schemas.microsoft.com/office/drawing/2016/5/14/chartex" xmlns:mc="http://schemas.openxmlformats.org/markup-compatibility/2006" xmlns:aink="http://schemas.microsoft.com/office/drawing/2016/ink" xmlns:am3d="http://schemas.microsoft.com/office/drawing/2017/model3d" xmlns:o="urn:schemas-microsoft-com:office:office" xmlns:oel="http://schemas.microsoft.com/office/2019/extlst" xmlns:r="http://schemas.openxmlformats.org/officeDocument/2006/relationships" xmlns:m="http://schemas.openxmlformats.org/officeDocument/2006/math" xmlns:v="urn:schemas-microsoft-com:vml" xmlns:wp14="http://schemas.microsoft.com/office/word/2010/wordprocessingDrawing" xmlns:wp="http://schemas.openxmlformats.org/drawingml/2006/wordprocessingDrawing" xmlns:w10="urn:schemas-microsoft-com:office:word" xmlns:w="http://schemas.openxmlformats.org/wordprocessingml/2006/main" xmlns:w14="http://schemas.microsoft.com/office/word/2010/wordml" xmlns:w15="http://schemas.microsoft.com/office/word/2012/wordml" xmlns:w16cex="http://schemas.microsoft.com/office/word/2018/wordml/cex" xmlns:w16cid="http://schemas.microsoft.com/office/word/2016/wordml/cid" xmlns:w16="http://schemas.microsoft.com/office/word/2018/wordml" xmlns:w16du="http://schemas.microsoft.com/office/word/2023/wordml/word16du" xmlns:w16sdtdh="http://schemas.microsoft.com/office/word/2020/wordml/sdtdatahash" xmlns:w16sdtfl="http://schemas.microsoft.com/office/word/2024/wordml/sdtformatlock" xmlns:w16se="http://schemas.microsoft.com/office/word/2015/wordml/symex" xmlns:wpg="http://schemas.microsoft.com/office/word/2010/wordprocessingGroup" xmlns:wpi="http://schemas.microsoft.com/office/word/2010/wordprocessingInk" xmlns:wne="http://schemas.microsoft.com/office/word/2006/wordml" xmlns:wps="http://schemas.microsoft.com/office/word/2010/wordprocessingShape" mc:Ignorable="w14 w15 w16se w16cid w16 w16cex w16sdtdh w16sdtfl w16du wp14">
   <w:p>
     <w:pPr>
-      <w:pStyle w:val="Footer"/>
+      <w:pStyle w:val="Pieddepage"/>
       <w:rPr>
         <w:lang w:val="fr-FR"/>
       </w:rPr>
@@ -6775,7 +6728,7 @@
                       <w:txbxContent>
                         <w:p>
                           <w:pPr>
-                            <w:pStyle w:val="NoSpacing"/>
+                            <w:pStyle w:val="Sansinterligne"/>
                             <w:rPr>
                               <w:sz w:val="22"/>
                             </w:rPr>
@@ -6838,12 +6791,12 @@
               <v:stroke joinstyle="miter"/>
               <v:path gradientshapeok="t" o:connecttype="rect"/>
             </v:shapetype>
-            <v:shape id="_x0000_s1031" type="#_x0000_t202" style="position:absolute;left:0;text-align:left;margin-left:420.4pt;margin-top:-1.4pt;width:107.25pt;height:33pt;z-index:251681792;visibility:visible;mso-wrap-style:square;mso-width-percent:0;mso-height-percent:0;mso-wrap-distance-left:9pt;mso-wrap-distance-top:0;mso-wrap-distance-right:9pt;mso-wrap-distance-bottom:0;mso-position-horizontal:absolute;mso-position-horizontal-relative:text;mso-position-vertical:absolute;mso-position-vertical-relative:text;mso-width-percent:0;mso-height-percent:0;mso-width-relative:margin;mso-height-relative:margin;v-text-anchor:top" o:gfxdata="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" fillcolor="white [3201]" stroked="f" strokeweight=".5pt">
+            <v:shape id="_x0000_s1031" type="#_x0000_t202" style="position:absolute;left:0;text-align:left;margin-left:420.4pt;margin-top:-1.4pt;width:107.25pt;height:33pt;z-index:251681792;visibility:visible;mso-wrap-style:square;mso-width-percent:0;mso-height-percent:0;mso-wrap-distance-left:9pt;mso-wrap-distance-top:0;mso-wrap-distance-right:9pt;mso-wrap-distance-bottom:0;mso-position-horizontal:absolute;mso-position-horizontal-relative:text;mso-position-vertical:absolute;mso-position-vertical-relative:text;mso-width-percent:0;mso-height-percent:0;mso-width-relative:margin;mso-height-relative:margin;v-text-anchor:top" o:gfxdata="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" fillcolor="white [3201]" stroked="f" strokeweight=".5pt">
               <v:textbox>
                 <w:txbxContent>
                   <w:p>
                     <w:pPr>
-                      <w:pStyle w:val="NoSpacing"/>
+                      <w:pStyle w:val="Sansinterligne"/>
                       <w:rPr>
                         <w:sz w:val="22"/>
                       </w:rPr>
@@ -6898,10 +6851,10 @@
 </file>
 
 <file path=word/footer5.xml><?xml version="1.0" encoding="utf-8"?>
-<w:ftr xmlns:wpc="http://schemas.microsoft.com/office/word/2010/wordprocessingCanvas" xmlns:cx="http://schemas.microsoft.com/office/drawing/2014/chartex" xmlns:mc="http://schemas.openxmlformats.org/markup-compatibility/2006" xmlns:o="urn:schemas-microsoft-com:office:office" xmlns:r="http://schemas.openxmlformats.org/officeDocument/2006/relationships" xmlns:m="http://schemas.openxmlformats.org/officeDocument/2006/math" xmlns:v="urn:schemas-microsoft-com:vml" xmlns:wp14="http://schemas.microsoft.com/office/word/2010/wordprocessingDrawing" xmlns:wp="http://schemas.openxmlformats.org/drawingml/2006/wordprocessingDrawing" xmlns:w10="urn:schemas-microsoft-com:office:word" xmlns:w="http://schemas.openxmlformats.org/wordprocessingml/2006/main" xmlns:w14="http://schemas.microsoft.com/office/word/2010/wordml" xmlns:w15="http://schemas.microsoft.com/office/word/2012/wordml" xmlns:w16se="http://schemas.microsoft.com/office/word/2015/wordml/symex" xmlns:wpg="http://schemas.microsoft.com/office/word/2010/wordprocessingGroup" xmlns:wpi="http://schemas.microsoft.com/office/word/2010/wordprocessingInk" xmlns:wne="http://schemas.microsoft.com/office/word/2006/wordml" xmlns:wps="http://schemas.microsoft.com/office/word/2010/wordprocessingShape" mc:Ignorable="w14 w15 w16se wp14">
+<w:ftr xmlns:wpc="http://schemas.microsoft.com/office/word/2010/wordprocessingCanvas" xmlns:cx="http://schemas.microsoft.com/office/drawing/2014/chartex" xmlns:cx1="http://schemas.microsoft.com/office/drawing/2015/9/8/chartex" xmlns:cx2="http://schemas.microsoft.com/office/drawing/2015/10/21/chartex" xmlns:cx3="http://schemas.microsoft.com/office/drawing/2016/5/9/chartex" xmlns:cx4="http://schemas.microsoft.com/office/drawing/2016/5/10/chartex" xmlns:cx5="http://schemas.microsoft.com/office/drawing/2016/5/11/chartex" xmlns:cx6="http://schemas.microsoft.com/office/drawing/2016/5/12/chartex" xmlns:cx7="http://schemas.microsoft.com/office/drawing/2016/5/13/chartex" xmlns:cx8="http://schemas.microsoft.com/office/drawing/2016/5/14/chartex" xmlns:mc="http://schemas.openxmlformats.org/markup-compatibility/2006" xmlns:aink="http://schemas.microsoft.com/office/drawing/2016/ink" xmlns:am3d="http://schemas.microsoft.com/office/drawing/2017/model3d" xmlns:o="urn:schemas-microsoft-com:office:office" xmlns:oel="http://schemas.microsoft.com/office/2019/extlst" xmlns:r="http://schemas.openxmlformats.org/officeDocument/2006/relationships" xmlns:m="http://schemas.openxmlformats.org/officeDocument/2006/math" xmlns:v="urn:schemas-microsoft-com:vml" xmlns:wp14="http://schemas.microsoft.com/office/word/2010/wordprocessingDrawing" xmlns:wp="http://schemas.openxmlformats.org/drawingml/2006/wordprocessingDrawing" xmlns:w10="urn:schemas-microsoft-com:office:word" xmlns:w="http://schemas.openxmlformats.org/wordprocessingml/2006/main" xmlns:w14="http://schemas.microsoft.com/office/word/2010/wordml" xmlns:w15="http://schemas.microsoft.com/office/word/2012/wordml" xmlns:w16cex="http://schemas.microsoft.com/office/word/2018/wordml/cex" xmlns:w16cid="http://schemas.microsoft.com/office/word/2016/wordml/cid" xmlns:w16="http://schemas.microsoft.com/office/word/2018/wordml" xmlns:w16du="http://schemas.microsoft.com/office/word/2023/wordml/word16du" xmlns:w16sdtdh="http://schemas.microsoft.com/office/word/2020/wordml/sdtdatahash" xmlns:w16sdtfl="http://schemas.microsoft.com/office/word/2024/wordml/sdtformatlock" xmlns:w16se="http://schemas.microsoft.com/office/word/2015/wordml/symex" xmlns:wpg="http://schemas.microsoft.com/office/word/2010/wordprocessingGroup" xmlns:wpi="http://schemas.microsoft.com/office/word/2010/wordprocessingInk" xmlns:wne="http://schemas.microsoft.com/office/word/2006/wordml" xmlns:wps="http://schemas.microsoft.com/office/word/2010/wordprocessingShape" mc:Ignorable="w14 w15 w16se w16cid w16 w16cex w16sdtdh w16sdtfl w16du wp14">
   <w:p>
     <w:pPr>
-      <w:pStyle w:val="Footer"/>
+      <w:pStyle w:val="Pieddepage"/>
       <w:rPr>
         <w:lang w:val="fr-FR"/>
       </w:rPr>
@@ -6961,9 +6914,9 @@
             </wp:anchor>
           </w:drawing>
         </mc:Choice>
-        <mc:Fallback xmlns:a="http://schemas.openxmlformats.org/drawingml/2006/main" xmlns:w16sdtfl="http://schemas.microsoft.com/office/word/2024/wordml/sdtformatlock" xmlns:w16sdtdh="http://schemas.microsoft.com/office/word/2020/wordml/sdtdatahash" xmlns:w16du="http://schemas.microsoft.com/office/word/2023/wordml/word16du" xmlns:w16="http://schemas.microsoft.com/office/word/2018/wordml" xmlns:w16cid="http://schemas.microsoft.com/office/word/2016/wordml/cid" xmlns:w16cex="http://schemas.microsoft.com/office/word/2018/wordml/cex" xmlns:oel="http://schemas.microsoft.com/office/2019/extlst" xmlns:am3d="http://schemas.microsoft.com/office/drawing/2017/model3d" xmlns:aink="http://schemas.microsoft.com/office/drawing/2016/ink" xmlns:cx8="http://schemas.microsoft.com/office/drawing/2016/5/14/chartex" xmlns:cx7="http://schemas.microsoft.com/office/drawing/2016/5/13/chartex" xmlns:cx6="http://schemas.microsoft.com/office/drawing/2016/5/12/chartex" xmlns:cx5="http://schemas.microsoft.com/office/drawing/2016/5/11/chartex" xmlns:cx4="http://schemas.microsoft.com/office/drawing/2016/5/10/chartex" xmlns:cx3="http://schemas.microsoft.com/office/drawing/2016/5/9/chartex" xmlns:cx2="http://schemas.microsoft.com/office/drawing/2015/10/21/chartex" xmlns:cx1="http://schemas.microsoft.com/office/drawing/2015/9/8/chartex">
-          <w:pict w14:anchorId="190AF882">
-            <v:line id="Connecteur droit 5" style="position:absolute;z-index:251684864;visibility:visible;mso-wrap-style:square;mso-wrap-distance-left:9pt;mso-wrap-distance-top:0;mso-wrap-distance-right:9pt;mso-wrap-distance-bottom:0;mso-position-horizontal:absolute;mso-position-horizontal-relative:text;mso-position-vertical:absolute;mso-position-vertical-relative:text" o:spid="_x0000_s1026" strokecolor="#156082 [3204]" strokeweight=".5pt" from="15.4pt,-9.65pt" to="476.65pt,-8.9pt" w14:anchorId="759DE286" o:gfxdata="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">
+        <mc:Fallback>
+          <w:pict>
+            <v:line w14:anchorId="42D19C77" id="Connecteur droit 5" o:spid="_x0000_s1026" style="position:absolute;z-index:251684864;visibility:visible;mso-wrap-style:square;mso-wrap-distance-left:9pt;mso-wrap-distance-top:0;mso-wrap-distance-right:9pt;mso-wrap-distance-bottom:0;mso-position-horizontal:absolute;mso-position-horizontal-relative:text;mso-position-vertical:absolute;mso-position-vertical-relative:text" from="15.4pt,-9.65pt" to="476.65pt,-8.9pt" o:gfxdata="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" strokecolor="#156082 [3204]" strokeweight=".5pt">
               <v:stroke joinstyle="miter"/>
             </v:line>
           </w:pict>
@@ -7014,7 +6967,7 @@
                       <w:txbxContent>
                         <w:p>
                           <w:pPr>
-                            <w:pStyle w:val="NoSpacing"/>
+                            <w:pStyle w:val="Sansinterligne"/>
                             <w:rPr>
                               <w:sz w:val="22"/>
                             </w:rPr>
@@ -7077,12 +7030,12 @@
               <v:stroke joinstyle="miter"/>
               <v:path gradientshapeok="t" o:connecttype="rect"/>
             </v:shapetype>
-            <v:shape id="_x0000_s1033" type="#_x0000_t202" style="position:absolute;left:0;text-align:left;margin-left:420.4pt;margin-top:-1.4pt;width:107.25pt;height:33pt;z-index:251683840;visibility:visible;mso-wrap-style:square;mso-width-percent:0;mso-height-percent:0;mso-wrap-distance-left:9pt;mso-wrap-distance-top:0;mso-wrap-distance-right:9pt;mso-wrap-distance-bottom:0;mso-position-horizontal:absolute;mso-position-horizontal-relative:text;mso-position-vertical:absolute;mso-position-vertical-relative:text;mso-width-percent:0;mso-height-percent:0;mso-width-relative:margin;mso-height-relative:margin;v-text-anchor:top" o:gfxdata="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" fillcolor="white [3201]" stroked="f" strokeweight=".5pt">
+            <v:shape id="_x0000_s1033" type="#_x0000_t202" style="position:absolute;left:0;text-align:left;margin-left:420.4pt;margin-top:-1.4pt;width:107.25pt;height:33pt;z-index:251683840;visibility:visible;mso-wrap-style:square;mso-width-percent:0;mso-height-percent:0;mso-wrap-distance-left:9pt;mso-wrap-distance-top:0;mso-wrap-distance-right:9pt;mso-wrap-distance-bottom:0;mso-position-horizontal:absolute;mso-position-horizontal-relative:text;mso-position-vertical:absolute;mso-position-vertical-relative:text;mso-width-percent:0;mso-height-percent:0;mso-width-relative:margin;mso-height-relative:margin;v-text-anchor:top" o:gfxdata="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" fillcolor="white [3201]" stroked="f" strokeweight=".5pt">
               <v:textbox>
                 <w:txbxContent>
                   <w:p>
                     <w:pPr>
-                      <w:pStyle w:val="NoSpacing"/>
+                      <w:pStyle w:val="Sansinterligne"/>
                       <w:rPr>
                         <w:sz w:val="22"/>
                       </w:rPr>
@@ -7137,7 +7090,7 @@
 </file>
 
 <file path=word/footnotes.xml><?xml version="1.0" encoding="utf-8"?>
-<w:footnotes xmlns:wpc="http://schemas.microsoft.com/office/word/2010/wordprocessingCanvas" xmlns:cx="http://schemas.microsoft.com/office/drawing/2014/chartex" xmlns:mc="http://schemas.openxmlformats.org/markup-compatibility/2006" xmlns:o="urn:schemas-microsoft-com:office:office" xmlns:r="http://schemas.openxmlformats.org/officeDocument/2006/relationships" xmlns:m="http://schemas.openxmlformats.org/officeDocument/2006/math" xmlns:v="urn:schemas-microsoft-com:vml" xmlns:wp14="http://schemas.microsoft.com/office/word/2010/wordprocessingDrawing" xmlns:wp="http://schemas.openxmlformats.org/drawingml/2006/wordprocessingDrawing" xmlns:w10="urn:schemas-microsoft-com:office:word" xmlns:w="http://schemas.openxmlformats.org/wordprocessingml/2006/main" xmlns:w14="http://schemas.microsoft.com/office/word/2010/wordml" xmlns:w15="http://schemas.microsoft.com/office/word/2012/wordml" xmlns:w16se="http://schemas.microsoft.com/office/word/2015/wordml/symex" xmlns:wpg="http://schemas.microsoft.com/office/word/2010/wordprocessingGroup" xmlns:wpi="http://schemas.microsoft.com/office/word/2010/wordprocessingInk" xmlns:wne="http://schemas.microsoft.com/office/word/2006/wordml" xmlns:wps="http://schemas.microsoft.com/office/word/2010/wordprocessingShape" mc:Ignorable="w14 w15 w16se wp14">
+<w:footnotes xmlns:wpc="http://schemas.microsoft.com/office/word/2010/wordprocessingCanvas" xmlns:cx="http://schemas.microsoft.com/office/drawing/2014/chartex" xmlns:cx1="http://schemas.microsoft.com/office/drawing/2015/9/8/chartex" xmlns:cx2="http://schemas.microsoft.com/office/drawing/2015/10/21/chartex" xmlns:cx3="http://schemas.microsoft.com/office/drawing/2016/5/9/chartex" xmlns:cx4="http://schemas.microsoft.com/office/drawing/2016/5/10/chartex" xmlns:cx5="http://schemas.microsoft.com/office/drawing/2016/5/11/chartex" xmlns:cx6="http://schemas.microsoft.com/office/drawing/2016/5/12/chartex" xmlns:cx7="http://schemas.microsoft.com/office/drawing/2016/5/13/chartex" xmlns:cx8="http://schemas.microsoft.com/office/drawing/2016/5/14/chartex" xmlns:mc="http://schemas.openxmlformats.org/markup-compatibility/2006" xmlns:aink="http://schemas.microsoft.com/office/drawing/2016/ink" xmlns:am3d="http://schemas.microsoft.com/office/drawing/2017/model3d" xmlns:o="urn:schemas-microsoft-com:office:office" xmlns:oel="http://schemas.microsoft.com/office/2019/extlst" xmlns:r="http://schemas.openxmlformats.org/officeDocument/2006/relationships" xmlns:m="http://schemas.openxmlformats.org/officeDocument/2006/math" xmlns:v="urn:schemas-microsoft-com:vml" xmlns:wp14="http://schemas.microsoft.com/office/word/2010/wordprocessingDrawing" xmlns:wp="http://schemas.openxmlformats.org/drawingml/2006/wordprocessingDrawing" xmlns:w10="urn:schemas-microsoft-com:office:word" xmlns:w="http://schemas.openxmlformats.org/wordprocessingml/2006/main" xmlns:w14="http://schemas.microsoft.com/office/word/2010/wordml" xmlns:w15="http://schemas.microsoft.com/office/word/2012/wordml" xmlns:w16cex="http://schemas.microsoft.com/office/word/2018/wordml/cex" xmlns:w16cid="http://schemas.microsoft.com/office/word/2016/wordml/cid" xmlns:w16="http://schemas.microsoft.com/office/word/2018/wordml" xmlns:w16du="http://schemas.microsoft.com/office/word/2023/wordml/word16du" xmlns:w16sdtdh="http://schemas.microsoft.com/office/word/2020/wordml/sdtdatahash" xmlns:w16sdtfl="http://schemas.microsoft.com/office/word/2024/wordml/sdtformatlock" xmlns:w16se="http://schemas.microsoft.com/office/word/2015/wordml/symex" xmlns:wpg="http://schemas.microsoft.com/office/word/2010/wordprocessingGroup" xmlns:wpi="http://schemas.microsoft.com/office/word/2010/wordprocessingInk" xmlns:wne="http://schemas.microsoft.com/office/word/2006/wordml" xmlns:wps="http://schemas.microsoft.com/office/word/2010/wordprocessingShape" mc:Ignorable="w14 w15 w16se w16cid w16 w16cex w16sdtdh w16sdtfl w16du wp14">
   <w:footnote w:type="separator" w:id="-1">
     <w:p>
       <w:pPr>
@@ -7162,7 +7115,7 @@
 </file>
 
 <file path=word/header1.xml><?xml version="1.0" encoding="utf-8"?>
-<w:hdr xmlns:wpc="http://schemas.microsoft.com/office/word/2010/wordprocessingCanvas" xmlns:cx="http://schemas.microsoft.com/office/drawing/2014/chartex" xmlns:mc="http://schemas.openxmlformats.org/markup-compatibility/2006" xmlns:o="urn:schemas-microsoft-com:office:office" xmlns:r="http://schemas.openxmlformats.org/officeDocument/2006/relationships" xmlns:m="http://schemas.openxmlformats.org/officeDocument/2006/math" xmlns:v="urn:schemas-microsoft-com:vml" xmlns:wp14="http://schemas.microsoft.com/office/word/2010/wordprocessingDrawing" xmlns:wp="http://schemas.openxmlformats.org/drawingml/2006/wordprocessingDrawing" xmlns:w10="urn:schemas-microsoft-com:office:word" xmlns:w="http://schemas.openxmlformats.org/wordprocessingml/2006/main" xmlns:w14="http://schemas.microsoft.com/office/word/2010/wordml" xmlns:w15="http://schemas.microsoft.com/office/word/2012/wordml" xmlns:w16se="http://schemas.microsoft.com/office/word/2015/wordml/symex" xmlns:wpg="http://schemas.microsoft.com/office/word/2010/wordprocessingGroup" xmlns:wpi="http://schemas.microsoft.com/office/word/2010/wordprocessingInk" xmlns:wne="http://schemas.microsoft.com/office/word/2006/wordml" xmlns:wps="http://schemas.microsoft.com/office/word/2010/wordprocessingShape" mc:Ignorable="w14 w15 w16se wp14">
+<w:hdr xmlns:wpc="http://schemas.microsoft.com/office/word/2010/wordprocessingCanvas" xmlns:cx="http://schemas.microsoft.com/office/drawing/2014/chartex" xmlns:cx1="http://schemas.microsoft.com/office/drawing/2015/9/8/chartex" xmlns:cx2="http://schemas.microsoft.com/office/drawing/2015/10/21/chartex" xmlns:cx3="http://schemas.microsoft.com/office/drawing/2016/5/9/chartex" xmlns:cx4="http://schemas.microsoft.com/office/drawing/2016/5/10/chartex" xmlns:cx5="http://schemas.microsoft.com/office/drawing/2016/5/11/chartex" xmlns:cx6="http://schemas.microsoft.com/office/drawing/2016/5/12/chartex" xmlns:cx7="http://schemas.microsoft.com/office/drawing/2016/5/13/chartex" xmlns:cx8="http://schemas.microsoft.com/office/drawing/2016/5/14/chartex" xmlns:mc="http://schemas.openxmlformats.org/markup-compatibility/2006" xmlns:aink="http://schemas.microsoft.com/office/drawing/2016/ink" xmlns:am3d="http://schemas.microsoft.com/office/drawing/2017/model3d" xmlns:o="urn:schemas-microsoft-com:office:office" xmlns:oel="http://schemas.microsoft.com/office/2019/extlst" xmlns:r="http://schemas.openxmlformats.org/officeDocument/2006/relationships" xmlns:m="http://schemas.openxmlformats.org/officeDocument/2006/math" xmlns:v="urn:schemas-microsoft-com:vml" xmlns:wp14="http://schemas.microsoft.com/office/word/2010/wordprocessingDrawing" xmlns:wp="http://schemas.openxmlformats.org/drawingml/2006/wordprocessingDrawing" xmlns:w10="urn:schemas-microsoft-com:office:word" xmlns:w="http://schemas.openxmlformats.org/wordprocessingml/2006/main" xmlns:w14="http://schemas.microsoft.com/office/word/2010/wordml" xmlns:w15="http://schemas.microsoft.com/office/word/2012/wordml" xmlns:w16cex="http://schemas.microsoft.com/office/word/2018/wordml/cex" xmlns:w16cid="http://schemas.microsoft.com/office/word/2016/wordml/cid" xmlns:w16="http://schemas.microsoft.com/office/word/2018/wordml" xmlns:w16du="http://schemas.microsoft.com/office/word/2023/wordml/word16du" xmlns:w16sdtdh="http://schemas.microsoft.com/office/word/2020/wordml/sdtdatahash" xmlns:w16sdtfl="http://schemas.microsoft.com/office/word/2024/wordml/sdtformatlock" xmlns:w16se="http://schemas.microsoft.com/office/word/2015/wordml/symex" xmlns:wpg="http://schemas.microsoft.com/office/word/2010/wordprocessingGroup" xmlns:wpi="http://schemas.microsoft.com/office/word/2010/wordprocessingInk" xmlns:wne="http://schemas.microsoft.com/office/word/2006/wordml" xmlns:wps="http://schemas.microsoft.com/office/word/2010/wordprocessingShape" mc:Ignorable="w14 w15 w16se w16cid w16 w16cex w16sdtdh w16sdtfl w16du wp14">
   <w:tbl>
     <w:tblPr>
       <w:tblW w:w="0" w:type="auto"/>
@@ -7184,7 +7137,7 @@
         </w:tcPr>
         <w:p>
           <w:pPr>
-            <w:pStyle w:val="Header"/>
+            <w:pStyle w:val="En-tte"/>
             <w:ind w:left="-115"/>
             <w:jc w:val="left"/>
           </w:pPr>
@@ -7196,7 +7149,7 @@
         </w:tcPr>
         <w:p>
           <w:pPr>
-            <w:pStyle w:val="Header"/>
+            <w:pStyle w:val="En-tte"/>
             <w:jc w:val="center"/>
           </w:pPr>
         </w:p>
@@ -7207,7 +7160,7 @@
         </w:tcPr>
         <w:p>
           <w:pPr>
-            <w:pStyle w:val="Header"/>
+            <w:pStyle w:val="En-tte"/>
             <w:ind w:right="-115"/>
             <w:jc w:val="right"/>
           </w:pPr>
@@ -7217,17 +7170,17 @@
   </w:tbl>
   <w:p>
     <w:pPr>
-      <w:pStyle w:val="Header"/>
+      <w:pStyle w:val="En-tte"/>
     </w:pPr>
   </w:p>
 </w:hdr>
 </file>
 
 <file path=word/header2.xml><?xml version="1.0" encoding="utf-8"?>
-<w:hdr xmlns:wpc="http://schemas.microsoft.com/office/word/2010/wordprocessingCanvas" xmlns:cx="http://schemas.microsoft.com/office/drawing/2014/chartex" xmlns:mc="http://schemas.openxmlformats.org/markup-compatibility/2006" xmlns:o="urn:schemas-microsoft-com:office:office" xmlns:r="http://schemas.openxmlformats.org/officeDocument/2006/relationships" xmlns:m="http://schemas.openxmlformats.org/officeDocument/2006/math" xmlns:v="urn:schemas-microsoft-com:vml" xmlns:wp14="http://schemas.microsoft.com/office/word/2010/wordprocessingDrawing" xmlns:wp="http://schemas.openxmlformats.org/drawingml/2006/wordprocessingDrawing" xmlns:w10="urn:schemas-microsoft-com:office:word" xmlns:w="http://schemas.openxmlformats.org/wordprocessingml/2006/main" xmlns:w14="http://schemas.microsoft.com/office/word/2010/wordml" xmlns:w15="http://schemas.microsoft.com/office/word/2012/wordml" xmlns:w16se="http://schemas.microsoft.com/office/word/2015/wordml/symex" xmlns:wpg="http://schemas.microsoft.com/office/word/2010/wordprocessingGroup" xmlns:wpi="http://schemas.microsoft.com/office/word/2010/wordprocessingInk" xmlns:wne="http://schemas.microsoft.com/office/word/2006/wordml" xmlns:wps="http://schemas.microsoft.com/office/word/2010/wordprocessingShape" mc:Ignorable="w14 w15 w16se wp14">
+<w:hdr xmlns:wpc="http://schemas.microsoft.com/office/word/2010/wordprocessingCanvas" xmlns:cx="http://schemas.microsoft.com/office/drawing/2014/chartex" xmlns:cx1="http://schemas.microsoft.com/office/drawing/2015/9/8/chartex" xmlns:cx2="http://schemas.microsoft.com/office/drawing/2015/10/21/chartex" xmlns:cx3="http://schemas.microsoft.com/office/drawing/2016/5/9/chartex" xmlns:cx4="http://schemas.microsoft.com/office/drawing/2016/5/10/chartex" xmlns:cx5="http://schemas.microsoft.com/office/drawing/2016/5/11/chartex" xmlns:cx6="http://schemas.microsoft.com/office/drawing/2016/5/12/chartex" xmlns:cx7="http://schemas.microsoft.com/office/drawing/2016/5/13/chartex" xmlns:cx8="http://schemas.microsoft.com/office/drawing/2016/5/14/chartex" xmlns:mc="http://schemas.openxmlformats.org/markup-compatibility/2006" xmlns:aink="http://schemas.microsoft.com/office/drawing/2016/ink" xmlns:am3d="http://schemas.microsoft.com/office/drawing/2017/model3d" xmlns:o="urn:schemas-microsoft-com:office:office" xmlns:oel="http://schemas.microsoft.com/office/2019/extlst" xmlns:r="http://schemas.openxmlformats.org/officeDocument/2006/relationships" xmlns:m="http://schemas.openxmlformats.org/officeDocument/2006/math" xmlns:v="urn:schemas-microsoft-com:vml" xmlns:wp14="http://schemas.microsoft.com/office/word/2010/wordprocessingDrawing" xmlns:wp="http://schemas.openxmlformats.org/drawingml/2006/wordprocessingDrawing" xmlns:w10="urn:schemas-microsoft-com:office:word" xmlns:w="http://schemas.openxmlformats.org/wordprocessingml/2006/main" xmlns:w14="http://schemas.microsoft.com/office/word/2010/wordml" xmlns:w15="http://schemas.microsoft.com/office/word/2012/wordml" xmlns:w16cex="http://schemas.microsoft.com/office/word/2018/wordml/cex" xmlns:w16cid="http://schemas.microsoft.com/office/word/2016/wordml/cid" xmlns:w16="http://schemas.microsoft.com/office/word/2018/wordml" xmlns:w16du="http://schemas.microsoft.com/office/word/2023/wordml/word16du" xmlns:w16sdtdh="http://schemas.microsoft.com/office/word/2020/wordml/sdtdatahash" xmlns:w16sdtfl="http://schemas.microsoft.com/office/word/2024/wordml/sdtformatlock" xmlns:w16se="http://schemas.microsoft.com/office/word/2015/wordml/symex" xmlns:wpg="http://schemas.microsoft.com/office/word/2010/wordprocessingGroup" xmlns:wpi="http://schemas.microsoft.com/office/word/2010/wordprocessingInk" xmlns:wne="http://schemas.microsoft.com/office/word/2006/wordml" xmlns:wps="http://schemas.microsoft.com/office/word/2010/wordprocessingShape" mc:Ignorable="w14 w15 w16se w16cid w16 w16cex w16sdtdh w16sdtfl w16du wp14">
   <w:p>
     <w:pPr>
-      <w:pStyle w:val="Header"/>
+      <w:pStyle w:val="En-tte"/>
       <w:rPr>
         <w:caps/>
         <w:sz w:val="22"/>
@@ -7279,7 +7232,7 @@
                       <w:txbxContent>
                         <w:p>
                           <w:pPr>
-                            <w:pStyle w:val="NoSpacing"/>
+                            <w:pStyle w:val="Sansinterligne"/>
                             <w:ind w:firstLine="0"/>
                             <w:rPr>
                               <w:sz w:val="22"/>
@@ -7320,12 +7273,12 @@
               <v:stroke joinstyle="miter"/>
               <v:path gradientshapeok="t" o:connecttype="rect"/>
             </v:shapetype>
-            <v:shape id="Zone de texte 2" o:spid="_x0000_s1026" type="#_x0000_t202" style="position:absolute;left:0;text-align:left;margin-left:347.45pt;margin-top:.4pt;width:40.2pt;height:18.55pt;z-index:251668480;visibility:visible;mso-wrap-style:square;mso-width-percent:0;mso-height-percent:0;mso-wrap-distance-left:9pt;mso-wrap-distance-top:0;mso-wrap-distance-right:9pt;mso-wrap-distance-bottom:0;mso-position-horizontal:absolute;mso-position-horizontal-relative:text;mso-position-vertical:absolute;mso-position-vertical-relative:text;mso-width-percent:0;mso-height-percent:0;mso-width-relative:margin;mso-height-relative:margin;v-text-anchor:top" o:gfxdata="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" fillcolor="white [3201]" stroked="f" strokeweight=".5pt">
+            <v:shape id="Zone de texte 2" o:spid="_x0000_s1026" type="#_x0000_t202" style="position:absolute;left:0;text-align:left;margin-left:347.45pt;margin-top:.4pt;width:40.2pt;height:18.55pt;z-index:251668480;visibility:visible;mso-wrap-style:square;mso-width-percent:0;mso-height-percent:0;mso-wrap-distance-left:9pt;mso-wrap-distance-top:0;mso-wrap-distance-right:9pt;mso-wrap-distance-bottom:0;mso-position-horizontal:absolute;mso-position-horizontal-relative:text;mso-position-vertical:absolute;mso-position-vertical-relative:text;mso-width-percent:0;mso-height-percent:0;mso-width-relative:margin;mso-height-relative:margin;v-text-anchor:top" o:gfxdata="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" fillcolor="white [3201]" stroked="f" strokeweight=".5pt">
               <v:textbox>
                 <w:txbxContent>
                   <w:p>
                     <w:pPr>
-                      <w:pStyle w:val="NoSpacing"/>
+                      <w:pStyle w:val="Sansinterligne"/>
                       <w:ind w:firstLine="0"/>
                       <w:rPr>
                         <w:sz w:val="22"/>
@@ -7407,9 +7360,9 @@
             </wp:anchor>
           </w:drawing>
         </mc:Choice>
-        <mc:Fallback xmlns:a="http://schemas.openxmlformats.org/drawingml/2006/main" xmlns:w16sdtfl="http://schemas.microsoft.com/office/word/2024/wordml/sdtformatlock" xmlns:w16sdtdh="http://schemas.microsoft.com/office/word/2020/wordml/sdtdatahash" xmlns:w16du="http://schemas.microsoft.com/office/word/2023/wordml/word16du" xmlns:w16="http://schemas.microsoft.com/office/word/2018/wordml" xmlns:w16cid="http://schemas.microsoft.com/office/word/2016/wordml/cid" xmlns:w16cex="http://schemas.microsoft.com/office/word/2018/wordml/cex" xmlns:oel="http://schemas.microsoft.com/office/2019/extlst" xmlns:am3d="http://schemas.microsoft.com/office/drawing/2017/model3d" xmlns:aink="http://schemas.microsoft.com/office/drawing/2016/ink" xmlns:cx8="http://schemas.microsoft.com/office/drawing/2016/5/14/chartex" xmlns:cx7="http://schemas.microsoft.com/office/drawing/2016/5/13/chartex" xmlns:cx6="http://schemas.microsoft.com/office/drawing/2016/5/12/chartex" xmlns:cx5="http://schemas.microsoft.com/office/drawing/2016/5/11/chartex" xmlns:cx4="http://schemas.microsoft.com/office/drawing/2016/5/10/chartex" xmlns:cx3="http://schemas.microsoft.com/office/drawing/2016/5/9/chartex" xmlns:cx2="http://schemas.microsoft.com/office/drawing/2015/10/21/chartex" xmlns:cx1="http://schemas.microsoft.com/office/drawing/2015/9/8/chartex">
-          <w:pict w14:anchorId="7F941FAB">
-            <v:line id="Connecteur droit 1" style="position:absolute;z-index:251661312;visibility:visible;mso-wrap-style:square;mso-height-percent:0;mso-wrap-distance-left:9pt;mso-wrap-distance-top:0;mso-wrap-distance-right:9pt;mso-wrap-distance-bottom:0;mso-position-horizontal:absolute;mso-position-horizontal-relative:text;mso-position-vertical:absolute;mso-position-vertical-relative:text;mso-height-percent:0;mso-height-relative:margin" o:spid="_x0000_s1026" strokecolor="#156082 [3204]" strokeweight=".5pt" from="36.05pt,20.7pt" to="365.55pt,20.7pt" w14:anchorId="74E657A7" o:gfxdata="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">
+        <mc:Fallback>
+          <w:pict>
+            <v:line w14:anchorId="5F5CE968" id="Connecteur droit 1" o:spid="_x0000_s1026" style="position:absolute;z-index:251661312;visibility:visible;mso-wrap-style:square;mso-height-percent:0;mso-wrap-distance-left:9pt;mso-wrap-distance-top:0;mso-wrap-distance-right:9pt;mso-wrap-distance-bottom:0;mso-position-horizontal:absolute;mso-position-horizontal-relative:text;mso-position-vertical:absolute;mso-position-vertical-relative:text;mso-height-percent:0;mso-height-relative:margin" from="36.05pt,20.7pt" to="365.55pt,20.7pt" o:gfxdata="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" strokecolor="#156082 [3204]" strokeweight=".5pt">
               <v:stroke joinstyle="miter"/>
             </v:line>
           </w:pict>
@@ -7445,7 +7398,7 @@
         <w:noProof/>
         <w:sz w:val="22"/>
       </w:rPr>
-      <w:t>Error! Use the Home tab to apply Titre 1 to the text that you want to appear here.</w:t>
+      <w:t>Abstract</w:t>
     </w:r>
     <w:r>
       <w:rPr>
@@ -7466,10 +7419,10 @@
 </file>
 
 <file path=word/header3.xml><?xml version="1.0" encoding="utf-8"?>
-<w:hdr xmlns:wpc="http://schemas.microsoft.com/office/word/2010/wordprocessingCanvas" xmlns:cx="http://schemas.microsoft.com/office/drawing/2014/chartex" xmlns:mc="http://schemas.openxmlformats.org/markup-compatibility/2006" xmlns:o="urn:schemas-microsoft-com:office:office" xmlns:r="http://schemas.openxmlformats.org/officeDocument/2006/relationships" xmlns:m="http://schemas.openxmlformats.org/officeDocument/2006/math" xmlns:v="urn:schemas-microsoft-com:vml" xmlns:wp14="http://schemas.microsoft.com/office/word/2010/wordprocessingDrawing" xmlns:wp="http://schemas.openxmlformats.org/drawingml/2006/wordprocessingDrawing" xmlns:w10="urn:schemas-microsoft-com:office:word" xmlns:w="http://schemas.openxmlformats.org/wordprocessingml/2006/main" xmlns:w14="http://schemas.microsoft.com/office/word/2010/wordml" xmlns:w15="http://schemas.microsoft.com/office/word/2012/wordml" xmlns:w16se="http://schemas.microsoft.com/office/word/2015/wordml/symex" xmlns:wpg="http://schemas.microsoft.com/office/word/2010/wordprocessingGroup" xmlns:wpi="http://schemas.microsoft.com/office/word/2010/wordprocessingInk" xmlns:wne="http://schemas.microsoft.com/office/word/2006/wordml" xmlns:wps="http://schemas.microsoft.com/office/word/2010/wordprocessingShape" mc:Ignorable="w14 w15 w16se wp14">
+<w:hdr xmlns:wpc="http://schemas.microsoft.com/office/word/2010/wordprocessingCanvas" xmlns:cx="http://schemas.microsoft.com/office/drawing/2014/chartex" xmlns:cx1="http://schemas.microsoft.com/office/drawing/2015/9/8/chartex" xmlns:cx2="http://schemas.microsoft.com/office/drawing/2015/10/21/chartex" xmlns:cx3="http://schemas.microsoft.com/office/drawing/2016/5/9/chartex" xmlns:cx4="http://schemas.microsoft.com/office/drawing/2016/5/10/chartex" xmlns:cx5="http://schemas.microsoft.com/office/drawing/2016/5/11/chartex" xmlns:cx6="http://schemas.microsoft.com/office/drawing/2016/5/12/chartex" xmlns:cx7="http://schemas.microsoft.com/office/drawing/2016/5/13/chartex" xmlns:cx8="http://schemas.microsoft.com/office/drawing/2016/5/14/chartex" xmlns:mc="http://schemas.openxmlformats.org/markup-compatibility/2006" xmlns:aink="http://schemas.microsoft.com/office/drawing/2016/ink" xmlns:am3d="http://schemas.microsoft.com/office/drawing/2017/model3d" xmlns:o="urn:schemas-microsoft-com:office:office" xmlns:oel="http://schemas.microsoft.com/office/2019/extlst" xmlns:r="http://schemas.openxmlformats.org/officeDocument/2006/relationships" xmlns:m="http://schemas.openxmlformats.org/officeDocument/2006/math" xmlns:v="urn:schemas-microsoft-com:vml" xmlns:wp14="http://schemas.microsoft.com/office/word/2010/wordprocessingDrawing" xmlns:wp="http://schemas.openxmlformats.org/drawingml/2006/wordprocessingDrawing" xmlns:w10="urn:schemas-microsoft-com:office:word" xmlns:w="http://schemas.openxmlformats.org/wordprocessingml/2006/main" xmlns:w14="http://schemas.microsoft.com/office/word/2010/wordml" xmlns:w15="http://schemas.microsoft.com/office/word/2012/wordml" xmlns:w16cex="http://schemas.microsoft.com/office/word/2018/wordml/cex" xmlns:w16cid="http://schemas.microsoft.com/office/word/2016/wordml/cid" xmlns:w16="http://schemas.microsoft.com/office/word/2018/wordml" xmlns:w16du="http://schemas.microsoft.com/office/word/2023/wordml/word16du" xmlns:w16sdtdh="http://schemas.microsoft.com/office/word/2020/wordml/sdtdatahash" xmlns:w16sdtfl="http://schemas.microsoft.com/office/word/2024/wordml/sdtformatlock" xmlns:w16se="http://schemas.microsoft.com/office/word/2015/wordml/symex" xmlns:wpg="http://schemas.microsoft.com/office/word/2010/wordprocessingGroup" xmlns:wpi="http://schemas.microsoft.com/office/word/2010/wordprocessingInk" xmlns:wne="http://schemas.microsoft.com/office/word/2006/wordml" xmlns:wps="http://schemas.microsoft.com/office/word/2010/wordprocessingShape" mc:Ignorable="w14 w15 w16se w16cid w16 w16cex w16sdtdh w16sdtfl w16du wp14">
   <w:p>
     <w:pPr>
-      <w:pStyle w:val="Header"/>
+      <w:pStyle w:val="En-tte"/>
       <w:rPr>
         <w:caps/>
         <w:sz w:val="22"/>
@@ -7521,7 +7474,7 @@
                       <w:txbxContent>
                         <w:p>
                           <w:pPr>
-                            <w:pStyle w:val="NoSpacing"/>
+                            <w:pStyle w:val="Sansinterligne"/>
                             <w:ind w:firstLine="0"/>
                             <w:rPr>
                               <w:sz w:val="22"/>
@@ -7562,12 +7515,12 @@
               <v:stroke joinstyle="miter"/>
               <v:path gradientshapeok="t" o:connecttype="rect"/>
             </v:shapetype>
-            <v:shape id="_x0000_s1028" type="#_x0000_t202" style="position:absolute;left:0;text-align:left;margin-left:329.1pt;margin-top:-3.15pt;width:40.2pt;height:18.55pt;z-index:251670528;visibility:visible;mso-wrap-style:square;mso-width-percent:0;mso-height-percent:0;mso-wrap-distance-left:9pt;mso-wrap-distance-top:0;mso-wrap-distance-right:9pt;mso-wrap-distance-bottom:0;mso-position-horizontal:absolute;mso-position-horizontal-relative:text;mso-position-vertical:absolute;mso-position-vertical-relative:text;mso-width-percent:0;mso-height-percent:0;mso-width-relative:margin;mso-height-relative:margin;v-text-anchor:top" o:gfxdata="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" fillcolor="white [3201]" stroked="f" strokeweight=".5pt">
+            <v:shape id="_x0000_s1028" type="#_x0000_t202" style="position:absolute;left:0;text-align:left;margin-left:329.1pt;margin-top:-3.15pt;width:40.2pt;height:18.55pt;z-index:251670528;visibility:visible;mso-wrap-style:square;mso-width-percent:0;mso-height-percent:0;mso-wrap-distance-left:9pt;mso-wrap-distance-top:0;mso-wrap-distance-right:9pt;mso-wrap-distance-bottom:0;mso-position-horizontal:absolute;mso-position-horizontal-relative:text;mso-position-vertical:absolute;mso-position-vertical-relative:text;mso-width-percent:0;mso-height-percent:0;mso-width-relative:margin;mso-height-relative:margin;v-text-anchor:top" o:gfxdata="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" fillcolor="white [3201]" stroked="f" strokeweight=".5pt">
               <v:textbox>
                 <w:txbxContent>
                   <w:p>
                     <w:pPr>
-                      <w:pStyle w:val="NoSpacing"/>
+                      <w:pStyle w:val="Sansinterligne"/>
                       <w:ind w:firstLine="0"/>
                       <w:rPr>
                         <w:sz w:val="22"/>
@@ -7649,9 +7602,9 @@
             </wp:anchor>
           </w:drawing>
         </mc:Choice>
-        <mc:Fallback xmlns:a="http://schemas.openxmlformats.org/drawingml/2006/main" xmlns:w16sdtfl="http://schemas.microsoft.com/office/word/2024/wordml/sdtformatlock" xmlns:w16sdtdh="http://schemas.microsoft.com/office/word/2020/wordml/sdtdatahash" xmlns:w16du="http://schemas.microsoft.com/office/word/2023/wordml/word16du" xmlns:w16="http://schemas.microsoft.com/office/word/2018/wordml" xmlns:w16cid="http://schemas.microsoft.com/office/word/2016/wordml/cid" xmlns:w16cex="http://schemas.microsoft.com/office/word/2018/wordml/cex" xmlns:oel="http://schemas.microsoft.com/office/2019/extlst" xmlns:am3d="http://schemas.microsoft.com/office/drawing/2017/model3d" xmlns:aink="http://schemas.microsoft.com/office/drawing/2016/ink" xmlns:cx8="http://schemas.microsoft.com/office/drawing/2016/5/14/chartex" xmlns:cx7="http://schemas.microsoft.com/office/drawing/2016/5/13/chartex" xmlns:cx6="http://schemas.microsoft.com/office/drawing/2016/5/12/chartex" xmlns:cx5="http://schemas.microsoft.com/office/drawing/2016/5/11/chartex" xmlns:cx4="http://schemas.microsoft.com/office/drawing/2016/5/10/chartex" xmlns:cx3="http://schemas.microsoft.com/office/drawing/2016/5/9/chartex" xmlns:cx2="http://schemas.microsoft.com/office/drawing/2015/10/21/chartex" xmlns:cx1="http://schemas.microsoft.com/office/drawing/2015/9/8/chartex">
-          <w:pict w14:anchorId="3AE6B4A6">
-            <v:line id="Connecteur droit 1" style="position:absolute;z-index:251663360;visibility:visible;mso-wrap-style:square;mso-height-percent:0;mso-wrap-distance-left:9pt;mso-wrap-distance-top:0;mso-wrap-distance-right:9pt;mso-wrap-distance-bottom:0;mso-position-horizontal:absolute;mso-position-horizontal-relative:text;mso-position-vertical:absolute;mso-position-vertical-relative:text;mso-height-percent:0;mso-height-relative:margin" o:spid="_x0000_s1026" strokecolor="#156082 [3204]" strokeweight=".5pt" from="36.05pt,20.7pt" to="365.55pt,20.7pt" w14:anchorId="605B6397" o:gfxdata="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">
+        <mc:Fallback>
+          <w:pict>
+            <v:line w14:anchorId="58DA2FB8" id="Connecteur droit 1" o:spid="_x0000_s1026" style="position:absolute;z-index:251663360;visibility:visible;mso-wrap-style:square;mso-height-percent:0;mso-wrap-distance-left:9pt;mso-wrap-distance-top:0;mso-wrap-distance-right:9pt;mso-wrap-distance-bottom:0;mso-position-horizontal:absolute;mso-position-horizontal-relative:text;mso-position-vertical:absolute;mso-position-vertical-relative:text;mso-height-percent:0;mso-height-relative:margin" from="36.05pt,20.7pt" to="365.55pt,20.7pt" o:gfxdata="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" strokecolor="#156082 [3204]" strokeweight=".5pt">
               <v:stroke joinstyle="miter"/>
             </v:line>
           </w:pict>
@@ -7687,7 +7640,7 @@
         <w:noProof/>
         <w:sz w:val="22"/>
       </w:rPr>
-      <w:t>Error! Use the Home tab to apply Titre 1 to the text that you want to appear here.</w:t>
+      <w:t>Introduction Générale</w:t>
     </w:r>
     <w:r>
       <w:rPr>
@@ -7701,10 +7654,10 @@
 </file>
 
 <file path=word/header4.xml><?xml version="1.0" encoding="utf-8"?>
-<w:hdr xmlns:wpc="http://schemas.microsoft.com/office/word/2010/wordprocessingCanvas" xmlns:cx="http://schemas.microsoft.com/office/drawing/2014/chartex" xmlns:mc="http://schemas.openxmlformats.org/markup-compatibility/2006" xmlns:o="urn:schemas-microsoft-com:office:office" xmlns:r="http://schemas.openxmlformats.org/officeDocument/2006/relationships" xmlns:m="http://schemas.openxmlformats.org/officeDocument/2006/math" xmlns:v="urn:schemas-microsoft-com:vml" xmlns:wp14="http://schemas.microsoft.com/office/word/2010/wordprocessingDrawing" xmlns:wp="http://schemas.openxmlformats.org/drawingml/2006/wordprocessingDrawing" xmlns:w10="urn:schemas-microsoft-com:office:word" xmlns:w="http://schemas.openxmlformats.org/wordprocessingml/2006/main" xmlns:w14="http://schemas.microsoft.com/office/word/2010/wordml" xmlns:w15="http://schemas.microsoft.com/office/word/2012/wordml" xmlns:w16se="http://schemas.microsoft.com/office/word/2015/wordml/symex" xmlns:wpg="http://schemas.microsoft.com/office/word/2010/wordprocessingGroup" xmlns:wpi="http://schemas.microsoft.com/office/word/2010/wordprocessingInk" xmlns:wne="http://schemas.microsoft.com/office/word/2006/wordml" xmlns:wps="http://schemas.microsoft.com/office/word/2010/wordprocessingShape" mc:Ignorable="w14 w15 w16se wp14">
+<w:hdr xmlns:wpc="http://schemas.microsoft.com/office/word/2010/wordprocessingCanvas" xmlns:cx="http://schemas.microsoft.com/office/drawing/2014/chartex" xmlns:cx1="http://schemas.microsoft.com/office/drawing/2015/9/8/chartex" xmlns:cx2="http://schemas.microsoft.com/office/drawing/2015/10/21/chartex" xmlns:cx3="http://schemas.microsoft.com/office/drawing/2016/5/9/chartex" xmlns:cx4="http://schemas.microsoft.com/office/drawing/2016/5/10/chartex" xmlns:cx5="http://schemas.microsoft.com/office/drawing/2016/5/11/chartex" xmlns:cx6="http://schemas.microsoft.com/office/drawing/2016/5/12/chartex" xmlns:cx7="http://schemas.microsoft.com/office/drawing/2016/5/13/chartex" xmlns:cx8="http://schemas.microsoft.com/office/drawing/2016/5/14/chartex" xmlns:mc="http://schemas.openxmlformats.org/markup-compatibility/2006" xmlns:aink="http://schemas.microsoft.com/office/drawing/2016/ink" xmlns:am3d="http://schemas.microsoft.com/office/drawing/2017/model3d" xmlns:o="urn:schemas-microsoft-com:office:office" xmlns:oel="http://schemas.microsoft.com/office/2019/extlst" xmlns:r="http://schemas.openxmlformats.org/officeDocument/2006/relationships" xmlns:m="http://schemas.openxmlformats.org/officeDocument/2006/math" xmlns:v="urn:schemas-microsoft-com:vml" xmlns:wp14="http://schemas.microsoft.com/office/word/2010/wordprocessingDrawing" xmlns:wp="http://schemas.openxmlformats.org/drawingml/2006/wordprocessingDrawing" xmlns:w10="urn:schemas-microsoft-com:office:word" xmlns:w="http://schemas.openxmlformats.org/wordprocessingml/2006/main" xmlns:w14="http://schemas.microsoft.com/office/word/2010/wordml" xmlns:w15="http://schemas.microsoft.com/office/word/2012/wordml" xmlns:w16cex="http://schemas.microsoft.com/office/word/2018/wordml/cex" xmlns:w16cid="http://schemas.microsoft.com/office/word/2016/wordml/cid" xmlns:w16="http://schemas.microsoft.com/office/word/2018/wordml" xmlns:w16du="http://schemas.microsoft.com/office/word/2023/wordml/word16du" xmlns:w16sdtdh="http://schemas.microsoft.com/office/word/2020/wordml/sdtdatahash" xmlns:w16sdtfl="http://schemas.microsoft.com/office/word/2024/wordml/sdtformatlock" xmlns:w16se="http://schemas.microsoft.com/office/word/2015/wordml/symex" xmlns:wpg="http://schemas.microsoft.com/office/word/2010/wordprocessingGroup" xmlns:wpi="http://schemas.microsoft.com/office/word/2010/wordprocessingInk" xmlns:wne="http://schemas.microsoft.com/office/word/2006/wordml" xmlns:wps="http://schemas.microsoft.com/office/word/2010/wordprocessingShape" mc:Ignorable="w14 w15 w16se w16cid w16 w16cex w16sdtdh w16sdtfl w16du wp14">
   <w:p>
     <w:pPr>
-      <w:pStyle w:val="Header"/>
+      <w:pStyle w:val="En-tte"/>
       <w:rPr>
         <w:caps/>
         <w:sz w:val="22"/>
@@ -7756,7 +7709,7 @@
                       <w:txbxContent>
                         <w:p>
                           <w:pPr>
-                            <w:pStyle w:val="NoSpacing"/>
+                            <w:pStyle w:val="Sansinterligne"/>
                             <w:ind w:firstLine="0"/>
                             <w:rPr>
                               <w:sz w:val="22"/>
@@ -7797,12 +7750,12 @@
               <v:stroke joinstyle="miter"/>
               <v:path gradientshapeok="t" o:connecttype="rect"/>
             </v:shapetype>
-            <v:shape id="_x0000_s1030" type="#_x0000_t202" style="position:absolute;left:0;text-align:left;margin-left:322pt;margin-top:.4pt;width:40.2pt;height:18.55pt;z-index:251674624;visibility:visible;mso-wrap-style:square;mso-width-percent:0;mso-height-percent:0;mso-wrap-distance-left:9pt;mso-wrap-distance-top:0;mso-wrap-distance-right:9pt;mso-wrap-distance-bottom:0;mso-position-horizontal:absolute;mso-position-horizontal-relative:text;mso-position-vertical:absolute;mso-position-vertical-relative:text;mso-width-percent:0;mso-height-percent:0;mso-width-relative:margin;mso-height-relative:margin;v-text-anchor:top" o:gfxdata="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" fillcolor="white [3201]" stroked="f" strokeweight=".5pt">
+            <v:shape id="_x0000_s1030" type="#_x0000_t202" style="position:absolute;left:0;text-align:left;margin-left:322pt;margin-top:.4pt;width:40.2pt;height:18.55pt;z-index:251674624;visibility:visible;mso-wrap-style:square;mso-width-percent:0;mso-height-percent:0;mso-wrap-distance-left:9pt;mso-wrap-distance-top:0;mso-wrap-distance-right:9pt;mso-wrap-distance-bottom:0;mso-position-horizontal:absolute;mso-position-horizontal-relative:text;mso-position-vertical:absolute;mso-position-vertical-relative:text;mso-width-percent:0;mso-height-percent:0;mso-width-relative:margin;mso-height-relative:margin;v-text-anchor:top" o:gfxdata="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" fillcolor="white [3201]" stroked="f" strokeweight=".5pt">
               <v:textbox>
                 <w:txbxContent>
                   <w:p>
                     <w:pPr>
-                      <w:pStyle w:val="NoSpacing"/>
+                      <w:pStyle w:val="Sansinterligne"/>
                       <w:ind w:firstLine="0"/>
                       <w:rPr>
                         <w:sz w:val="22"/>
@@ -7884,9 +7837,9 @@
             </wp:anchor>
           </w:drawing>
         </mc:Choice>
-        <mc:Fallback xmlns:a="http://schemas.openxmlformats.org/drawingml/2006/main" xmlns:w16sdtfl="http://schemas.microsoft.com/office/word/2024/wordml/sdtformatlock" xmlns:w16sdtdh="http://schemas.microsoft.com/office/word/2020/wordml/sdtdatahash" xmlns:w16du="http://schemas.microsoft.com/office/word/2023/wordml/word16du" xmlns:w16="http://schemas.microsoft.com/office/word/2018/wordml" xmlns:w16cid="http://schemas.microsoft.com/office/word/2016/wordml/cid" xmlns:w16cex="http://schemas.microsoft.com/office/word/2018/wordml/cex" xmlns:oel="http://schemas.microsoft.com/office/2019/extlst" xmlns:am3d="http://schemas.microsoft.com/office/drawing/2017/model3d" xmlns:aink="http://schemas.microsoft.com/office/drawing/2016/ink" xmlns:cx8="http://schemas.microsoft.com/office/drawing/2016/5/14/chartex" xmlns:cx7="http://schemas.microsoft.com/office/drawing/2016/5/13/chartex" xmlns:cx6="http://schemas.microsoft.com/office/drawing/2016/5/12/chartex" xmlns:cx5="http://schemas.microsoft.com/office/drawing/2016/5/11/chartex" xmlns:cx4="http://schemas.microsoft.com/office/drawing/2016/5/10/chartex" xmlns:cx3="http://schemas.microsoft.com/office/drawing/2016/5/9/chartex" xmlns:cx2="http://schemas.microsoft.com/office/drawing/2015/10/21/chartex" xmlns:cx1="http://schemas.microsoft.com/office/drawing/2015/9/8/chartex">
-          <w:pict w14:anchorId="3247DB72">
-            <v:line id="Connecteur droit 1" style="position:absolute;z-index:251665408;visibility:visible;mso-wrap-style:square;mso-height-percent:0;mso-wrap-distance-left:9pt;mso-wrap-distance-top:0;mso-wrap-distance-right:9pt;mso-wrap-distance-bottom:0;mso-position-horizontal:absolute;mso-position-horizontal-relative:text;mso-position-vertical:absolute;mso-position-vertical-relative:text;mso-height-percent:0;mso-height-relative:margin" o:spid="_x0000_s1026" strokecolor="#156082 [3204]" strokeweight=".5pt" from="36.05pt,20.7pt" to="365.55pt,20.7pt" w14:anchorId="3AFE4A97" o:gfxdata="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">
+        <mc:Fallback>
+          <w:pict>
+            <v:line w14:anchorId="28B6E8C0" id="Connecteur droit 1" o:spid="_x0000_s1026" style="position:absolute;z-index:251665408;visibility:visible;mso-wrap-style:square;mso-height-percent:0;mso-wrap-distance-left:9pt;mso-wrap-distance-top:0;mso-wrap-distance-right:9pt;mso-wrap-distance-bottom:0;mso-position-horizontal:absolute;mso-position-horizontal-relative:text;mso-position-vertical:absolute;mso-position-vertical-relative:text;mso-height-percent:0;mso-height-relative:margin" from="36.05pt,20.7pt" to="365.55pt,20.7pt" o:gfxdata="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" strokecolor="#156082 [3204]" strokeweight=".5pt">
               <v:stroke joinstyle="miter"/>
             </v:line>
           </w:pict>
@@ -7922,7 +7875,7 @@
         <w:noProof/>
         <w:sz w:val="22"/>
       </w:rPr>
-      <w:t>Error! Use the Home tab to apply Titre 2 to the text that you want to appear here.</w:t>
+      <w:t>Chapitre3</w:t>
     </w:r>
     <w:r>
       <w:rPr>
@@ -7936,10 +7889,10 @@
 </file>
 
 <file path=word/header5.xml><?xml version="1.0" encoding="utf-8"?>
-<w:hdr xmlns:wpc="http://schemas.microsoft.com/office/word/2010/wordprocessingCanvas" xmlns:cx="http://schemas.microsoft.com/office/drawing/2014/chartex" xmlns:mc="http://schemas.openxmlformats.org/markup-compatibility/2006" xmlns:o="urn:schemas-microsoft-com:office:office" xmlns:r="http://schemas.openxmlformats.org/officeDocument/2006/relationships" xmlns:m="http://schemas.openxmlformats.org/officeDocument/2006/math" xmlns:v="urn:schemas-microsoft-com:vml" xmlns:wp14="http://schemas.microsoft.com/office/word/2010/wordprocessingDrawing" xmlns:wp="http://schemas.openxmlformats.org/drawingml/2006/wordprocessingDrawing" xmlns:w10="urn:schemas-microsoft-com:office:word" xmlns:w="http://schemas.openxmlformats.org/wordprocessingml/2006/main" xmlns:w14="http://schemas.microsoft.com/office/word/2010/wordml" xmlns:w15="http://schemas.microsoft.com/office/word/2012/wordml" xmlns:w16se="http://schemas.microsoft.com/office/word/2015/wordml/symex" xmlns:wpg="http://schemas.microsoft.com/office/word/2010/wordprocessingGroup" xmlns:wpi="http://schemas.microsoft.com/office/word/2010/wordprocessingInk" xmlns:wne="http://schemas.microsoft.com/office/word/2006/wordml" xmlns:wps="http://schemas.microsoft.com/office/word/2010/wordprocessingShape" mc:Ignorable="w14 w15 w16se wp14">
+<w:hdr xmlns:wpc="http://schemas.microsoft.com/office/word/2010/wordprocessingCanvas" xmlns:cx="http://schemas.microsoft.com/office/drawing/2014/chartex" xmlns:cx1="http://schemas.microsoft.com/office/drawing/2015/9/8/chartex" xmlns:cx2="http://schemas.microsoft.com/office/drawing/2015/10/21/chartex" xmlns:cx3="http://schemas.microsoft.com/office/drawing/2016/5/9/chartex" xmlns:cx4="http://schemas.microsoft.com/office/drawing/2016/5/10/chartex" xmlns:cx5="http://schemas.microsoft.com/office/drawing/2016/5/11/chartex" xmlns:cx6="http://schemas.microsoft.com/office/drawing/2016/5/12/chartex" xmlns:cx7="http://schemas.microsoft.com/office/drawing/2016/5/13/chartex" xmlns:cx8="http://schemas.microsoft.com/office/drawing/2016/5/14/chartex" xmlns:mc="http://schemas.openxmlformats.org/markup-compatibility/2006" xmlns:aink="http://schemas.microsoft.com/office/drawing/2016/ink" xmlns:am3d="http://schemas.microsoft.com/office/drawing/2017/model3d" xmlns:o="urn:schemas-microsoft-com:office:office" xmlns:oel="http://schemas.microsoft.com/office/2019/extlst" xmlns:r="http://schemas.openxmlformats.org/officeDocument/2006/relationships" xmlns:m="http://schemas.openxmlformats.org/officeDocument/2006/math" xmlns:v="urn:schemas-microsoft-com:vml" xmlns:wp14="http://schemas.microsoft.com/office/word/2010/wordprocessingDrawing" xmlns:wp="http://schemas.openxmlformats.org/drawingml/2006/wordprocessingDrawing" xmlns:w10="urn:schemas-microsoft-com:office:word" xmlns:w="http://schemas.openxmlformats.org/wordprocessingml/2006/main" xmlns:w14="http://schemas.microsoft.com/office/word/2010/wordml" xmlns:w15="http://schemas.microsoft.com/office/word/2012/wordml" xmlns:w16cex="http://schemas.microsoft.com/office/word/2018/wordml/cex" xmlns:w16cid="http://schemas.microsoft.com/office/word/2016/wordml/cid" xmlns:w16="http://schemas.microsoft.com/office/word/2018/wordml" xmlns:w16du="http://schemas.microsoft.com/office/word/2023/wordml/word16du" xmlns:w16sdtdh="http://schemas.microsoft.com/office/word/2020/wordml/sdtdatahash" xmlns:w16sdtfl="http://schemas.microsoft.com/office/word/2024/wordml/sdtformatlock" xmlns:w16se="http://schemas.microsoft.com/office/word/2015/wordml/symex" xmlns:wpg="http://schemas.microsoft.com/office/word/2010/wordprocessingGroup" xmlns:wpi="http://schemas.microsoft.com/office/word/2010/wordprocessingInk" xmlns:wne="http://schemas.microsoft.com/office/word/2006/wordml" xmlns:wps="http://schemas.microsoft.com/office/word/2010/wordprocessingShape" mc:Ignorable="w14 w15 w16se w16cid w16 w16cex w16sdtdh w16sdtfl w16du wp14">
   <w:p>
     <w:pPr>
-      <w:pStyle w:val="Header"/>
+      <w:pStyle w:val="En-tte"/>
       <w:rPr>
         <w:caps/>
         <w:sz w:val="22"/>
@@ -7991,7 +7944,7 @@
                       <w:txbxContent>
                         <w:p>
                           <w:pPr>
-                            <w:pStyle w:val="NoSpacing"/>
+                            <w:pStyle w:val="Sansinterligne"/>
                             <w:ind w:firstLine="0"/>
                             <w:rPr>
                               <w:sz w:val="22"/>
@@ -8032,12 +7985,12 @@
               <v:stroke joinstyle="miter"/>
               <v:path gradientshapeok="t" o:connecttype="rect"/>
             </v:shapetype>
-            <v:shape id="_x0000_s1032" type="#_x0000_t202" style="position:absolute;left:0;text-align:left;margin-left:315.85pt;margin-top:-2.7pt;width:40.2pt;height:18.55pt;z-index:251672576;visibility:visible;mso-wrap-style:square;mso-width-percent:0;mso-height-percent:0;mso-wrap-distance-left:9pt;mso-wrap-distance-top:0;mso-wrap-distance-right:9pt;mso-wrap-distance-bottom:0;mso-position-horizontal:absolute;mso-position-horizontal-relative:text;mso-position-vertical:absolute;mso-position-vertical-relative:text;mso-width-percent:0;mso-height-percent:0;mso-width-relative:margin;mso-height-relative:margin;v-text-anchor:top" o:gfxdata="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" fillcolor="white [3201]" stroked="f" strokeweight=".5pt">
+            <v:shape id="_x0000_s1032" type="#_x0000_t202" style="position:absolute;left:0;text-align:left;margin-left:315.85pt;margin-top:-2.7pt;width:40.2pt;height:18.55pt;z-index:251672576;visibility:visible;mso-wrap-style:square;mso-width-percent:0;mso-height-percent:0;mso-wrap-distance-left:9pt;mso-wrap-distance-top:0;mso-wrap-distance-right:9pt;mso-wrap-distance-bottom:0;mso-position-horizontal:absolute;mso-position-horizontal-relative:text;mso-position-vertical:absolute;mso-position-vertical-relative:text;mso-width-percent:0;mso-height-percent:0;mso-width-relative:margin;mso-height-relative:margin;v-text-anchor:top" o:gfxdata="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" fillcolor="white [3201]" stroked="f" strokeweight=".5pt">
               <v:textbox>
                 <w:txbxContent>
                   <w:p>
                     <w:pPr>
-                      <w:pStyle w:val="NoSpacing"/>
+                      <w:pStyle w:val="Sansinterligne"/>
                       <w:ind w:firstLine="0"/>
                       <w:rPr>
                         <w:sz w:val="22"/>
@@ -8119,9 +8072,9 @@
             </wp:anchor>
           </w:drawing>
         </mc:Choice>
-        <mc:Fallback xmlns:a="http://schemas.openxmlformats.org/drawingml/2006/main" xmlns:w16sdtfl="http://schemas.microsoft.com/office/word/2024/wordml/sdtformatlock" xmlns:w16sdtdh="http://schemas.microsoft.com/office/word/2020/wordml/sdtdatahash" xmlns:w16du="http://schemas.microsoft.com/office/word/2023/wordml/word16du" xmlns:w16="http://schemas.microsoft.com/office/word/2018/wordml" xmlns:w16cid="http://schemas.microsoft.com/office/word/2016/wordml/cid" xmlns:w16cex="http://schemas.microsoft.com/office/word/2018/wordml/cex" xmlns:oel="http://schemas.microsoft.com/office/2019/extlst" xmlns:am3d="http://schemas.microsoft.com/office/drawing/2017/model3d" xmlns:aink="http://schemas.microsoft.com/office/drawing/2016/ink" xmlns:cx8="http://schemas.microsoft.com/office/drawing/2016/5/14/chartex" xmlns:cx7="http://schemas.microsoft.com/office/drawing/2016/5/13/chartex" xmlns:cx6="http://schemas.microsoft.com/office/drawing/2016/5/12/chartex" xmlns:cx5="http://schemas.microsoft.com/office/drawing/2016/5/11/chartex" xmlns:cx4="http://schemas.microsoft.com/office/drawing/2016/5/10/chartex" xmlns:cx3="http://schemas.microsoft.com/office/drawing/2016/5/9/chartex" xmlns:cx2="http://schemas.microsoft.com/office/drawing/2015/10/21/chartex" xmlns:cx1="http://schemas.microsoft.com/office/drawing/2015/9/8/chartex">
-          <w:pict w14:anchorId="7AFC514B">
-            <v:line id="Connecteur droit 1" style="position:absolute;z-index:251667456;visibility:visible;mso-wrap-style:square;mso-height-percent:0;mso-wrap-distance-left:9pt;mso-wrap-distance-top:0;mso-wrap-distance-right:9pt;mso-wrap-distance-bottom:0;mso-position-horizontal:absolute;mso-position-horizontal-relative:text;mso-position-vertical:absolute;mso-position-vertical-relative:text;mso-height-percent:0;mso-height-relative:margin" o:spid="_x0000_s1026" strokecolor="#156082 [3204]" strokeweight=".5pt" from="36.05pt,20.7pt" to="365.55pt,20.7pt" w14:anchorId="48372F2D" o:gfxdata="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">
+        <mc:Fallback>
+          <w:pict>
+            <v:line w14:anchorId="51CA6DDB" id="Connecteur droit 1" o:spid="_x0000_s1026" style="position:absolute;z-index:251667456;visibility:visible;mso-wrap-style:square;mso-height-percent:0;mso-wrap-distance-left:9pt;mso-wrap-distance-top:0;mso-wrap-distance-right:9pt;mso-wrap-distance-bottom:0;mso-position-horizontal:absolute;mso-position-horizontal-relative:text;mso-position-vertical:absolute;mso-position-vertical-relative:text;mso-height-percent:0;mso-height-relative:margin" from="36.05pt,20.7pt" to="365.55pt,20.7pt" o:gfxdata="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" strokecolor="#156082 [3204]" strokeweight=".5pt">
               <v:stroke joinstyle="miter"/>
             </v:line>
           </w:pict>
@@ -8157,7 +8110,7 @@
         <w:noProof/>
         <w:sz w:val="22"/>
       </w:rPr>
-      <w:t>Error! Use the Home tab to apply Titre 1 to the text that you want to appear here.</w:t>
+      <w:t>Annexes</w:t>
     </w:r>
     <w:r>
       <w:rPr>
@@ -8171,7 +8124,7 @@
 </file>
 
 <file path=word/numbering.xml><?xml version="1.0" encoding="utf-8"?>
-<w:numbering xmlns:wpc="http://schemas.microsoft.com/office/word/2010/wordprocessingCanvas" xmlns:cx="http://schemas.microsoft.com/office/drawing/2014/chartex" xmlns:mc="http://schemas.openxmlformats.org/markup-compatibility/2006" xmlns:o="urn:schemas-microsoft-com:office:office" xmlns:r="http://schemas.openxmlformats.org/officeDocument/2006/relationships" xmlns:m="http://schemas.openxmlformats.org/officeDocument/2006/math" xmlns:v="urn:schemas-microsoft-com:vml" xmlns:wp14="http://schemas.microsoft.com/office/word/2010/wordprocessingDrawing" xmlns:wp="http://schemas.openxmlformats.org/drawingml/2006/wordprocessingDrawing" xmlns:w10="urn:schemas-microsoft-com:office:word" xmlns:w="http://schemas.openxmlformats.org/wordprocessingml/2006/main" xmlns:w14="http://schemas.microsoft.com/office/word/2010/wordml" xmlns:w15="http://schemas.microsoft.com/office/word/2012/wordml" xmlns:w16se="http://schemas.microsoft.com/office/word/2015/wordml/symex" xmlns:wpg="http://schemas.microsoft.com/office/word/2010/wordprocessingGroup" xmlns:wpi="http://schemas.microsoft.com/office/word/2010/wordprocessingInk" xmlns:wne="http://schemas.microsoft.com/office/word/2006/wordml" xmlns:wps="http://schemas.microsoft.com/office/word/2010/wordprocessingShape" mc:Ignorable="w14 w15 w16se wp14">
+<w:numbering xmlns:wpc="http://schemas.microsoft.com/office/word/2010/wordprocessingCanvas" xmlns:cx="http://schemas.microsoft.com/office/drawing/2014/chartex" xmlns:cx1="http://schemas.microsoft.com/office/drawing/2015/9/8/chartex" xmlns:cx2="http://schemas.microsoft.com/office/drawing/2015/10/21/chartex" xmlns:cx3="http://schemas.microsoft.com/office/drawing/2016/5/9/chartex" xmlns:cx4="http://schemas.microsoft.com/office/drawing/2016/5/10/chartex" xmlns:cx5="http://schemas.microsoft.com/office/drawing/2016/5/11/chartex" xmlns:cx6="http://schemas.microsoft.com/office/drawing/2016/5/12/chartex" xmlns:cx7="http://schemas.microsoft.com/office/drawing/2016/5/13/chartex" xmlns:cx8="http://schemas.microsoft.com/office/drawing/2016/5/14/chartex" xmlns:mc="http://schemas.openxmlformats.org/markup-compatibility/2006" xmlns:aink="http://schemas.microsoft.com/office/drawing/2016/ink" xmlns:am3d="http://schemas.microsoft.com/office/drawing/2017/model3d" xmlns:o="urn:schemas-microsoft-com:office:office" xmlns:oel="http://schemas.microsoft.com/office/2019/extlst" xmlns:r="http://schemas.openxmlformats.org/officeDocument/2006/relationships" xmlns:m="http://schemas.openxmlformats.org/officeDocument/2006/math" xmlns:v="urn:schemas-microsoft-com:vml" xmlns:wp14="http://schemas.microsoft.com/office/word/2010/wordprocessingDrawing" xmlns:wp="http://schemas.openxmlformats.org/drawingml/2006/wordprocessingDrawing" xmlns:w10="urn:schemas-microsoft-com:office:word" xmlns:w="http://schemas.openxmlformats.org/wordprocessingml/2006/main" xmlns:w14="http://schemas.microsoft.com/office/word/2010/wordml" xmlns:w15="http://schemas.microsoft.com/office/word/2012/wordml" xmlns:w16cex="http://schemas.microsoft.com/office/word/2018/wordml/cex" xmlns:w16cid="http://schemas.microsoft.com/office/word/2016/wordml/cid" xmlns:w16="http://schemas.microsoft.com/office/word/2018/wordml" xmlns:w16du="http://schemas.microsoft.com/office/word/2023/wordml/word16du" xmlns:w16sdtdh="http://schemas.microsoft.com/office/word/2020/wordml/sdtdatahash" xmlns:w16sdtfl="http://schemas.microsoft.com/office/word/2024/wordml/sdtformatlock" xmlns:w16se="http://schemas.microsoft.com/office/word/2015/wordml/symex" xmlns:wpg="http://schemas.microsoft.com/office/word/2010/wordprocessingGroup" xmlns:wpi="http://schemas.microsoft.com/office/word/2010/wordprocessingInk" xmlns:wne="http://schemas.microsoft.com/office/word/2006/wordml" xmlns:wps="http://schemas.microsoft.com/office/word/2010/wordprocessingShape" mc:Ignorable="w14 w15 w16se w16cid w16 w16cex w16sdtdh w16sdtfl w16du wp14">
   <w:abstractNum w:abstractNumId="0" w15:restartNumberingAfterBreak="0">
     <w:nsid w:val="10C33BE2"/>
     <w:multiLevelType w:val="multilevel"/>
@@ -8671,7 +8624,7 @@
     <w:lvl w:ilvl="0">
       <w:start w:val="1"/>
       <w:numFmt w:val="none"/>
-      <w:pStyle w:val="Heading1"/>
+      <w:pStyle w:val="Titre1"/>
       <w:suff w:val="space"/>
       <w:lvlText w:val=""/>
       <w:lvlJc w:val="left"/>
@@ -8685,7 +8638,7 @@
     <w:lvl w:ilvl="1">
       <w:start w:val="1"/>
       <w:numFmt w:val="decimal"/>
-      <w:pStyle w:val="Heading2"/>
+      <w:pStyle w:val="Titre2"/>
       <w:suff w:val="space"/>
       <w:lvlText w:val="%2. "/>
       <w:lvlJc w:val="left"/>
@@ -8699,7 +8652,7 @@
     <w:lvl w:ilvl="2">
       <w:start w:val="1"/>
       <w:numFmt w:val="decimal"/>
-      <w:pStyle w:val="Heading3"/>
+      <w:pStyle w:val="Titre3"/>
       <w:suff w:val="space"/>
       <w:lvlText w:val="%2.%3."/>
       <w:lvlJc w:val="left"/>
@@ -8713,7 +8666,7 @@
     <w:lvl w:ilvl="3">
       <w:start w:val="1"/>
       <w:numFmt w:val="decimal"/>
-      <w:pStyle w:val="Heading4"/>
+      <w:pStyle w:val="Titre4"/>
       <w:suff w:val="space"/>
       <w:lvlText w:val="%2.%3.%4."/>
       <w:lvlJc w:val="left"/>
@@ -8727,7 +8680,7 @@
     <w:lvl w:ilvl="4">
       <w:start w:val="1"/>
       <w:numFmt w:val="decimal"/>
-      <w:pStyle w:val="Heading5"/>
+      <w:pStyle w:val="Titre5"/>
       <w:suff w:val="space"/>
       <w:lvlText w:val="%2.%3.%4.%5."/>
       <w:lvlJc w:val="left"/>
@@ -8741,7 +8694,7 @@
     <w:lvl w:ilvl="5">
       <w:start w:val="1"/>
       <w:numFmt w:val="decimal"/>
-      <w:pStyle w:val="Heading6"/>
+      <w:pStyle w:val="Titre6"/>
       <w:suff w:val="space"/>
       <w:lvlText w:val="%2.%3.%4.%5.%6."/>
       <w:lvlJc w:val="left"/>
@@ -8902,29 +8855,29 @@
       </w:rPr>
     </w:lvl>
   </w:abstractNum>
-  <w:num w:numId="1">
+  <w:num w:numId="1" w16cid:durableId="987780165">
     <w:abstractNumId w:val="5"/>
   </w:num>
-  <w:num w:numId="2">
+  <w:num w:numId="2" w16cid:durableId="2110998788">
     <w:abstractNumId w:val="3"/>
   </w:num>
-  <w:num w:numId="3">
+  <w:num w:numId="3" w16cid:durableId="1944065744">
     <w:abstractNumId w:val="4"/>
   </w:num>
-  <w:num w:numId="4">
+  <w:num w:numId="4" w16cid:durableId="1644000526">
     <w:abstractNumId w:val="1"/>
   </w:num>
-  <w:num w:numId="5">
+  <w:num w:numId="5" w16cid:durableId="358091426">
     <w:abstractNumId w:val="0"/>
   </w:num>
-  <w:num w:numId="6">
+  <w:num w:numId="6" w16cid:durableId="606618747">
     <w:abstractNumId w:val="2"/>
   </w:num>
 </w:numbering>
 </file>
 
 <file path=word/styles.xml><?xml version="1.0" encoding="utf-8"?>
-<w:styles xmlns:mc="http://schemas.openxmlformats.org/markup-compatibility/2006" xmlns:r="http://schemas.openxmlformats.org/officeDocument/2006/relationships" xmlns:w="http://schemas.openxmlformats.org/wordprocessingml/2006/main" xmlns:w14="http://schemas.microsoft.com/office/word/2010/wordml" xmlns:w15="http://schemas.microsoft.com/office/word/2012/wordml" xmlns:w16se="http://schemas.microsoft.com/office/word/2015/wordml/symex" mc:Ignorable="w14 w15 w16se">
+<w:styles xmlns:mc="http://schemas.openxmlformats.org/markup-compatibility/2006" xmlns:r="http://schemas.openxmlformats.org/officeDocument/2006/relationships" xmlns:w="http://schemas.openxmlformats.org/wordprocessingml/2006/main" xmlns:w14="http://schemas.microsoft.com/office/word/2010/wordml" xmlns:w15="http://schemas.microsoft.com/office/word/2012/wordml" xmlns:w16cex="http://schemas.microsoft.com/office/word/2018/wordml/cex" xmlns:w16cid="http://schemas.microsoft.com/office/word/2016/wordml/cid" xmlns:w16="http://schemas.microsoft.com/office/word/2018/wordml" xmlns:w16du="http://schemas.microsoft.com/office/word/2023/wordml/word16du" xmlns:w16sdtdh="http://schemas.microsoft.com/office/word/2020/wordml/sdtdatahash" xmlns:w16sdtfl="http://schemas.microsoft.com/office/word/2024/wordml/sdtformatlock" xmlns:w16se="http://schemas.microsoft.com/office/word/2015/wordml/symex" mc:Ignorable="w14 w15 w16se w16cid w16 w16cex w16sdtdh w16sdtfl w16du">
   <w:docDefaults>
     <w:rPrDefault>
       <w:rPr>
@@ -8940,7 +8893,7 @@
       </w:pPr>
     </w:pPrDefault>
   </w:docDefaults>
-  <w:latentStyles w:defLockedState="0" w:defUIPriority="99" w:defSemiHidden="0" w:defUnhideWhenUsed="0" w:defQFormat="0" w:count="371">
+  <w:latentStyles w:defLockedState="0" w:defUIPriority="99" w:defSemiHidden="0" w:defUnhideWhenUsed="0" w:defQFormat="0" w:count="376">
     <w:lsdException w:name="Normal" w:uiPriority="0" w:qFormat="1"/>
     <w:lsdException w:name="heading 1" w:uiPriority="9" w:qFormat="1"/>
     <w:lsdException w:name="heading 2" w:semiHidden="1" w:uiPriority="9" w:unhideWhenUsed="1" w:qFormat="1"/>
@@ -9312,6 +9265,11 @@
     <w:lsdException w:name="List Table 5 Dark Accent 6" w:uiPriority="50"/>
     <w:lsdException w:name="List Table 6 Colorful Accent 6" w:uiPriority="51"/>
     <w:lsdException w:name="List Table 7 Colorful Accent 6" w:uiPriority="52"/>
+    <w:lsdException w:name="Mention" w:semiHidden="1" w:unhideWhenUsed="1"/>
+    <w:lsdException w:name="Smart Hyperlink" w:semiHidden="1" w:unhideWhenUsed="1"/>
+    <w:lsdException w:name="Hashtag" w:semiHidden="1" w:unhideWhenUsed="1"/>
+    <w:lsdException w:name="Unresolved Mention" w:semiHidden="1" w:unhideWhenUsed="1"/>
+    <w:lsdException w:name="Smart Link" w:semiHidden="1" w:unhideWhenUsed="1"/>
   </w:latentStyles>
   <w:style w:type="paragraph" w:default="1" w:styleId="Normal">
     <w:name w:val="Normal"/>
@@ -9326,11 +9284,11 @@
       <w:sz w:val="26"/>
     </w:rPr>
   </w:style>
-  <w:style w:type="paragraph" w:styleId="Heading1">
+  <w:style w:type="paragraph" w:styleId="Titre1">
     <w:name w:val="heading 1"/>
     <w:basedOn w:val="Normal"/>
     <w:next w:val="Normal"/>
-    <w:link w:val="Heading1Char"/>
+    <w:link w:val="Titre1Car"/>
     <w:uiPriority w:val="9"/>
     <w:qFormat/>
     <w:rsid w:val="006675D0"/>
@@ -9352,11 +9310,11 @@
       <w:szCs w:val="40"/>
     </w:rPr>
   </w:style>
-  <w:style w:type="paragraph" w:styleId="Heading2">
+  <w:style w:type="paragraph" w:styleId="Titre2">
     <w:name w:val="heading 2"/>
     <w:basedOn w:val="Normal"/>
     <w:next w:val="Normal"/>
-    <w:link w:val="Heading2Char"/>
+    <w:link w:val="Titre2Car"/>
     <w:uiPriority w:val="9"/>
     <w:unhideWhenUsed/>
     <w:qFormat/>
@@ -9379,11 +9337,11 @@
       <w:szCs w:val="32"/>
     </w:rPr>
   </w:style>
-  <w:style w:type="paragraph" w:styleId="Heading3">
+  <w:style w:type="paragraph" w:styleId="Titre3">
     <w:name w:val="heading 3"/>
     <w:basedOn w:val="Normal"/>
     <w:next w:val="Normal"/>
-    <w:link w:val="Heading3Char"/>
+    <w:link w:val="Titre3Car"/>
     <w:uiPriority w:val="9"/>
     <w:unhideWhenUsed/>
     <w:qFormat/>
@@ -9406,11 +9364,11 @@
       <w:szCs w:val="28"/>
     </w:rPr>
   </w:style>
-  <w:style w:type="paragraph" w:styleId="Heading4">
+  <w:style w:type="paragraph" w:styleId="Titre4">
     <w:name w:val="heading 4"/>
     <w:basedOn w:val="Normal"/>
     <w:next w:val="Normal"/>
-    <w:link w:val="Heading4Char"/>
+    <w:link w:val="Titre4Car"/>
     <w:uiPriority w:val="9"/>
     <w:unhideWhenUsed/>
     <w:qFormat/>
@@ -9434,11 +9392,11 @@
       <w:sz w:val="28"/>
     </w:rPr>
   </w:style>
-  <w:style w:type="paragraph" w:styleId="Heading5">
+  <w:style w:type="paragraph" w:styleId="Titre5">
     <w:name w:val="heading 5"/>
     <w:basedOn w:val="Normal"/>
     <w:next w:val="Normal"/>
-    <w:link w:val="Heading5Char"/>
+    <w:link w:val="Titre5Car"/>
     <w:uiPriority w:val="9"/>
     <w:semiHidden/>
     <w:unhideWhenUsed/>
@@ -9459,11 +9417,11 @@
       <w:color w:val="0F4761" w:themeColor="accent1" w:themeShade="BF"/>
     </w:rPr>
   </w:style>
-  <w:style w:type="paragraph" w:styleId="Heading6">
+  <w:style w:type="paragraph" w:styleId="Titre6">
     <w:name w:val="heading 6"/>
     <w:basedOn w:val="Normal"/>
     <w:next w:val="Normal"/>
-    <w:link w:val="Heading6Char"/>
+    <w:link w:val="Titre6Car"/>
     <w:uiPriority w:val="9"/>
     <w:unhideWhenUsed/>
     <w:qFormat/>
@@ -9488,11 +9446,11 @@
       <w:sz w:val="28"/>
     </w:rPr>
   </w:style>
-  <w:style w:type="paragraph" w:styleId="Heading7">
+  <w:style w:type="paragraph" w:styleId="Titre7">
     <w:name w:val="heading 7"/>
     <w:basedOn w:val="Normal"/>
     <w:next w:val="Normal"/>
-    <w:link w:val="Heading7Char"/>
+    <w:link w:val="Titre7Car"/>
     <w:uiPriority w:val="9"/>
     <w:semiHidden/>
     <w:unhideWhenUsed/>
@@ -9509,11 +9467,11 @@
       <w:color w:val="595959" w:themeColor="text1" w:themeTint="A6"/>
     </w:rPr>
   </w:style>
-  <w:style w:type="paragraph" w:styleId="Heading8">
+  <w:style w:type="paragraph" w:styleId="Titre8">
     <w:name w:val="heading 8"/>
     <w:basedOn w:val="Normal"/>
     <w:next w:val="Normal"/>
-    <w:link w:val="Heading8Char"/>
+    <w:link w:val="Titre8Car"/>
     <w:uiPriority w:val="9"/>
     <w:semiHidden/>
     <w:unhideWhenUsed/>
@@ -9532,11 +9490,11 @@
       <w:color w:val="272727" w:themeColor="text1" w:themeTint="D8"/>
     </w:rPr>
   </w:style>
-  <w:style w:type="paragraph" w:styleId="Heading9">
+  <w:style w:type="paragraph" w:styleId="Titre9">
     <w:name w:val="heading 9"/>
     <w:basedOn w:val="Normal"/>
     <w:next w:val="Normal"/>
-    <w:link w:val="Heading9Char"/>
+    <w:link w:val="Titre9Car"/>
     <w:uiPriority w:val="9"/>
     <w:semiHidden/>
     <w:unhideWhenUsed/>
@@ -9553,13 +9511,12 @@
       <w:color w:val="272727" w:themeColor="text1" w:themeTint="D8"/>
     </w:rPr>
   </w:style>
-  <w:style w:type="character" w:default="1" w:styleId="DefaultParagraphFont">
+  <w:style w:type="character" w:default="1" w:styleId="Policepardfaut">
     <w:name w:val="Default Paragraph Font"/>
     <w:uiPriority w:val="1"/>
-    <w:semiHidden/>
     <w:unhideWhenUsed/>
   </w:style>
-  <w:style w:type="table" w:default="1" w:styleId="TableNormal">
+  <w:style w:type="table" w:default="1" w:styleId="TableauNormal">
     <w:name w:val="Normal Table"/>
     <w:uiPriority w:val="99"/>
     <w:semiHidden/>
@@ -9574,16 +9531,16 @@
       </w:tblCellMar>
     </w:tblPr>
   </w:style>
-  <w:style w:type="numbering" w:default="1" w:styleId="NoList">
+  <w:style w:type="numbering" w:default="1" w:styleId="Aucuneliste">
     <w:name w:val="No List"/>
     <w:uiPriority w:val="99"/>
     <w:semiHidden/>
     <w:unhideWhenUsed/>
   </w:style>
-  <w:style w:type="character" w:customStyle="1" w:styleId="Heading1Char">
-    <w:name w:val="Heading 1 Char"/>
-    <w:basedOn w:val="DefaultParagraphFont"/>
-    <w:link w:val="Heading1"/>
+  <w:style w:type="character" w:customStyle="1" w:styleId="Titre1Car">
+    <w:name w:val="Titre 1 Car"/>
+    <w:basedOn w:val="Policepardfaut"/>
+    <w:link w:val="Titre1"/>
     <w:uiPriority w:val="9"/>
     <w:rsid w:val="006675D0"/>
     <w:rPr>
@@ -9594,10 +9551,10 @@
       <w:szCs w:val="40"/>
     </w:rPr>
   </w:style>
-  <w:style w:type="character" w:customStyle="1" w:styleId="Heading2Char">
-    <w:name w:val="Heading 2 Char"/>
-    <w:basedOn w:val="DefaultParagraphFont"/>
-    <w:link w:val="Heading2"/>
+  <w:style w:type="character" w:customStyle="1" w:styleId="Titre2Car">
+    <w:name w:val="Titre 2 Car"/>
+    <w:basedOn w:val="Policepardfaut"/>
+    <w:link w:val="Titre2"/>
     <w:uiPriority w:val="9"/>
     <w:rsid w:val="006675D0"/>
     <w:rPr>
@@ -9608,10 +9565,10 @@
       <w:szCs w:val="32"/>
     </w:rPr>
   </w:style>
-  <w:style w:type="character" w:customStyle="1" w:styleId="Heading3Char">
-    <w:name w:val="Heading 3 Char"/>
-    <w:basedOn w:val="DefaultParagraphFont"/>
-    <w:link w:val="Heading3"/>
+  <w:style w:type="character" w:customStyle="1" w:styleId="Titre3Car">
+    <w:name w:val="Titre 3 Car"/>
+    <w:basedOn w:val="Policepardfaut"/>
+    <w:link w:val="Titre3"/>
     <w:uiPriority w:val="9"/>
     <w:rsid w:val="00386E65"/>
     <w:rPr>
@@ -9621,10 +9578,10 @@
       <w:szCs w:val="28"/>
     </w:rPr>
   </w:style>
-  <w:style w:type="character" w:customStyle="1" w:styleId="Heading4Char">
-    <w:name w:val="Heading 4 Char"/>
-    <w:basedOn w:val="DefaultParagraphFont"/>
-    <w:link w:val="Heading4"/>
+  <w:style w:type="character" w:customStyle="1" w:styleId="Titre4Car">
+    <w:name w:val="Titre 4 Car"/>
+    <w:basedOn w:val="Policepardfaut"/>
+    <w:link w:val="Titre4"/>
     <w:uiPriority w:val="9"/>
     <w:rsid w:val="00386E65"/>
     <w:rPr>
@@ -9635,10 +9592,10 @@
       <w:sz w:val="28"/>
     </w:rPr>
   </w:style>
-  <w:style w:type="character" w:customStyle="1" w:styleId="Heading5Char">
-    <w:name w:val="Heading 5 Char"/>
-    <w:basedOn w:val="DefaultParagraphFont"/>
-    <w:link w:val="Heading5"/>
+  <w:style w:type="character" w:customStyle="1" w:styleId="Titre5Car">
+    <w:name w:val="Titre 5 Car"/>
+    <w:basedOn w:val="Policepardfaut"/>
+    <w:link w:val="Titre5"/>
     <w:uiPriority w:val="9"/>
     <w:semiHidden/>
     <w:rsid w:val="00F92A2E"/>
@@ -9647,10 +9604,10 @@
       <w:color w:val="0F4761" w:themeColor="accent1" w:themeShade="BF"/>
     </w:rPr>
   </w:style>
-  <w:style w:type="character" w:customStyle="1" w:styleId="Heading6Char">
-    <w:name w:val="Heading 6 Char"/>
-    <w:basedOn w:val="DefaultParagraphFont"/>
-    <w:link w:val="Heading6"/>
+  <w:style w:type="character" w:customStyle="1" w:styleId="Titre6Car">
+    <w:name w:val="Titre 6 Car"/>
+    <w:basedOn w:val="Policepardfaut"/>
+    <w:link w:val="Titre6"/>
     <w:uiPriority w:val="9"/>
     <w:rsid w:val="00386E65"/>
     <w:rPr>
@@ -9662,10 +9619,10 @@
       <w:sz w:val="28"/>
     </w:rPr>
   </w:style>
-  <w:style w:type="character" w:customStyle="1" w:styleId="Heading7Char">
-    <w:name w:val="Heading 7 Char"/>
-    <w:basedOn w:val="DefaultParagraphFont"/>
-    <w:link w:val="Heading7"/>
+  <w:style w:type="character" w:customStyle="1" w:styleId="Titre7Car">
+    <w:name w:val="Titre 7 Car"/>
+    <w:basedOn w:val="Policepardfaut"/>
+    <w:link w:val="Titre7"/>
     <w:uiPriority w:val="9"/>
     <w:semiHidden/>
     <w:rsid w:val="00F92A2E"/>
@@ -9674,10 +9631,10 @@
       <w:color w:val="595959" w:themeColor="text1" w:themeTint="A6"/>
     </w:rPr>
   </w:style>
-  <w:style w:type="character" w:customStyle="1" w:styleId="Heading8Char">
-    <w:name w:val="Heading 8 Char"/>
-    <w:basedOn w:val="DefaultParagraphFont"/>
-    <w:link w:val="Heading8"/>
+  <w:style w:type="character" w:customStyle="1" w:styleId="Titre8Car">
+    <w:name w:val="Titre 8 Car"/>
+    <w:basedOn w:val="Policepardfaut"/>
+    <w:link w:val="Titre8"/>
     <w:uiPriority w:val="9"/>
     <w:semiHidden/>
     <w:rsid w:val="00F92A2E"/>
@@ -9688,10 +9645,10 @@
       <w:color w:val="272727" w:themeColor="text1" w:themeTint="D8"/>
     </w:rPr>
   </w:style>
-  <w:style w:type="character" w:customStyle="1" w:styleId="Heading9Char">
-    <w:name w:val="Heading 9 Char"/>
-    <w:basedOn w:val="DefaultParagraphFont"/>
-    <w:link w:val="Heading9"/>
+  <w:style w:type="character" w:customStyle="1" w:styleId="Titre9Car">
+    <w:name w:val="Titre 9 Car"/>
+    <w:basedOn w:val="Policepardfaut"/>
+    <w:link w:val="Titre9"/>
     <w:uiPriority w:val="9"/>
     <w:semiHidden/>
     <w:rsid w:val="00F92A2E"/>
@@ -9700,11 +9657,11 @@
       <w:color w:val="272727" w:themeColor="text1" w:themeTint="D8"/>
     </w:rPr>
   </w:style>
-  <w:style w:type="paragraph" w:styleId="Title">
+  <w:style w:type="paragraph" w:styleId="Titre">
     <w:name w:val="Title"/>
     <w:basedOn w:val="Normal"/>
     <w:next w:val="Normal"/>
-    <w:link w:val="TitleChar"/>
+    <w:link w:val="TitreCar"/>
     <w:uiPriority w:val="10"/>
     <w:qFormat/>
     <w:rsid w:val="00F92A2E"/>
@@ -9720,10 +9677,10 @@
       <w:szCs w:val="56"/>
     </w:rPr>
   </w:style>
-  <w:style w:type="character" w:customStyle="1" w:styleId="TitleChar">
-    <w:name w:val="Title Char"/>
-    <w:basedOn w:val="DefaultParagraphFont"/>
-    <w:link w:val="Title"/>
+  <w:style w:type="character" w:customStyle="1" w:styleId="TitreCar">
+    <w:name w:val="Titre Car"/>
+    <w:basedOn w:val="Policepardfaut"/>
+    <w:link w:val="Titre"/>
     <w:uiPriority w:val="10"/>
     <w:rsid w:val="00F92A2E"/>
     <w:rPr>
@@ -9734,11 +9691,11 @@
       <w:szCs w:val="56"/>
     </w:rPr>
   </w:style>
-  <w:style w:type="paragraph" w:styleId="Subtitle">
+  <w:style w:type="paragraph" w:styleId="Sous-titre">
     <w:name w:val="Subtitle"/>
     <w:basedOn w:val="Normal"/>
     <w:next w:val="Normal"/>
-    <w:link w:val="SubtitleChar"/>
+    <w:link w:val="Sous-titreCar"/>
     <w:uiPriority w:val="11"/>
     <w:qFormat/>
     <w:rsid w:val="00F92A2E"/>
@@ -9755,10 +9712,10 @@
       <w:szCs w:val="28"/>
     </w:rPr>
   </w:style>
-  <w:style w:type="character" w:customStyle="1" w:styleId="SubtitleChar">
-    <w:name w:val="Subtitle Char"/>
-    <w:basedOn w:val="DefaultParagraphFont"/>
-    <w:link w:val="Subtitle"/>
+  <w:style w:type="character" w:customStyle="1" w:styleId="Sous-titreCar">
+    <w:name w:val="Sous-titre Car"/>
+    <w:basedOn w:val="Policepardfaut"/>
+    <w:link w:val="Sous-titre"/>
     <w:uiPriority w:val="11"/>
     <w:rsid w:val="00F92A2E"/>
     <w:rPr>
@@ -9769,11 +9726,11 @@
       <w:szCs w:val="28"/>
     </w:rPr>
   </w:style>
-  <w:style w:type="paragraph" w:styleId="Quote">
+  <w:style w:type="paragraph" w:styleId="Citation">
     <w:name w:val="Quote"/>
     <w:basedOn w:val="Normal"/>
     <w:next w:val="Normal"/>
-    <w:link w:val="QuoteChar"/>
+    <w:link w:val="CitationCar"/>
     <w:uiPriority w:val="29"/>
     <w:qFormat/>
     <w:rsid w:val="00F92A2E"/>
@@ -9787,10 +9744,10 @@
       <w:color w:val="404040" w:themeColor="text1" w:themeTint="BF"/>
     </w:rPr>
   </w:style>
-  <w:style w:type="character" w:customStyle="1" w:styleId="QuoteChar">
-    <w:name w:val="Quote Char"/>
-    <w:basedOn w:val="DefaultParagraphFont"/>
-    <w:link w:val="Quote"/>
+  <w:style w:type="character" w:customStyle="1" w:styleId="CitationCar">
+    <w:name w:val="Citation Car"/>
+    <w:basedOn w:val="Policepardfaut"/>
+    <w:link w:val="Citation"/>
     <w:uiPriority w:val="29"/>
     <w:rsid w:val="00F92A2E"/>
     <w:rPr>
@@ -9799,7 +9756,7 @@
       <w:color w:val="404040" w:themeColor="text1" w:themeTint="BF"/>
     </w:rPr>
   </w:style>
-  <w:style w:type="paragraph" w:styleId="ListParagraph">
+  <w:style w:type="paragraph" w:styleId="Paragraphedeliste">
     <w:name w:val="List Paragraph"/>
     <w:basedOn w:val="Normal"/>
     <w:uiPriority w:val="34"/>
@@ -9810,9 +9767,9 @@
       <w:contextualSpacing/>
     </w:pPr>
   </w:style>
-  <w:style w:type="character" w:styleId="IntenseEmphasis">
+  <w:style w:type="character" w:styleId="Accentuationintense">
     <w:name w:val="Intense Emphasis"/>
-    <w:basedOn w:val="DefaultParagraphFont"/>
+    <w:basedOn w:val="Policepardfaut"/>
     <w:uiPriority w:val="21"/>
     <w:qFormat/>
     <w:rsid w:val="00F92A2E"/>
@@ -9822,11 +9779,11 @@
       <w:color w:val="0F4761" w:themeColor="accent1" w:themeShade="BF"/>
     </w:rPr>
   </w:style>
-  <w:style w:type="paragraph" w:styleId="IntenseQuote">
+  <w:style w:type="paragraph" w:styleId="Citationintense">
     <w:name w:val="Intense Quote"/>
     <w:basedOn w:val="Normal"/>
     <w:next w:val="Normal"/>
-    <w:link w:val="IntenseQuoteChar"/>
+    <w:link w:val="CitationintenseCar"/>
     <w:uiPriority w:val="30"/>
     <w:qFormat/>
     <w:rsid w:val="00F92A2E"/>
@@ -9845,10 +9802,10 @@
       <w:color w:val="0F4761" w:themeColor="accent1" w:themeShade="BF"/>
     </w:rPr>
   </w:style>
-  <w:style w:type="character" w:customStyle="1" w:styleId="IntenseQuoteChar">
-    <w:name w:val="Intense Quote Char"/>
-    <w:basedOn w:val="DefaultParagraphFont"/>
-    <w:link w:val="IntenseQuote"/>
+  <w:style w:type="character" w:customStyle="1" w:styleId="CitationintenseCar">
+    <w:name w:val="Citation intense Car"/>
+    <w:basedOn w:val="Policepardfaut"/>
+    <w:link w:val="Citationintense"/>
     <w:uiPriority w:val="30"/>
     <w:rsid w:val="00F92A2E"/>
     <w:rPr>
@@ -9857,9 +9814,9 @@
       <w:color w:val="0F4761" w:themeColor="accent1" w:themeShade="BF"/>
     </w:rPr>
   </w:style>
-  <w:style w:type="character" w:styleId="IntenseReference">
+  <w:style w:type="character" w:styleId="Rfrenceintense">
     <w:name w:val="Intense Reference"/>
-    <w:basedOn w:val="DefaultParagraphFont"/>
+    <w:basedOn w:val="Policepardfaut"/>
     <w:uiPriority w:val="32"/>
     <w:qFormat/>
     <w:rsid w:val="00F92A2E"/>
@@ -9871,10 +9828,10 @@
       <w:spacing w:val="5"/>
     </w:rPr>
   </w:style>
-  <w:style w:type="paragraph" w:styleId="Header">
+  <w:style w:type="paragraph" w:styleId="En-tte">
     <w:name w:val="header"/>
     <w:basedOn w:val="Normal"/>
-    <w:link w:val="HeaderChar"/>
+    <w:link w:val="En-tteCar"/>
     <w:uiPriority w:val="99"/>
     <w:unhideWhenUsed/>
     <w:rsid w:val="00550B89"/>
@@ -9886,10 +9843,10 @@
       <w:spacing w:before="0" w:after="0" w:line="240" w:lineRule="auto"/>
     </w:pPr>
   </w:style>
-  <w:style w:type="character" w:customStyle="1" w:styleId="HeaderChar">
-    <w:name w:val="Header Char"/>
-    <w:basedOn w:val="DefaultParagraphFont"/>
-    <w:link w:val="Header"/>
+  <w:style w:type="character" w:customStyle="1" w:styleId="En-tteCar">
+    <w:name w:val="En-tête Car"/>
+    <w:basedOn w:val="Policepardfaut"/>
+    <w:link w:val="En-tte"/>
     <w:uiPriority w:val="99"/>
     <w:rsid w:val="00550B89"/>
     <w:rPr>
@@ -9897,10 +9854,10 @@
       <w:sz w:val="26"/>
     </w:rPr>
   </w:style>
-  <w:style w:type="paragraph" w:styleId="Footer">
+  <w:style w:type="paragraph" w:styleId="Pieddepage">
     <w:name w:val="footer"/>
     <w:basedOn w:val="Normal"/>
-    <w:link w:val="FooterChar"/>
+    <w:link w:val="PieddepageCar"/>
     <w:uiPriority w:val="99"/>
     <w:unhideWhenUsed/>
     <w:rsid w:val="00550B89"/>
@@ -9912,10 +9869,10 @@
       <w:spacing w:before="0" w:after="0" w:line="240" w:lineRule="auto"/>
     </w:pPr>
   </w:style>
-  <w:style w:type="character" w:customStyle="1" w:styleId="FooterChar">
-    <w:name w:val="Footer Char"/>
-    <w:basedOn w:val="DefaultParagraphFont"/>
-    <w:link w:val="Footer"/>
+  <w:style w:type="character" w:customStyle="1" w:styleId="PieddepageCar">
+    <w:name w:val="Pied de page Car"/>
+    <w:basedOn w:val="Policepardfaut"/>
+    <w:link w:val="Pieddepage"/>
     <w:uiPriority w:val="99"/>
     <w:rsid w:val="00550B89"/>
     <w:rPr>
@@ -9923,7 +9880,7 @@
       <w:sz w:val="26"/>
     </w:rPr>
   </w:style>
-  <w:style w:type="paragraph" w:styleId="NoSpacing">
+  <w:style w:type="paragraph" w:styleId="Sansinterligne">
     <w:name w:val="No Spacing"/>
     <w:uiPriority w:val="1"/>
     <w:qFormat/>
@@ -9938,7 +9895,7 @@
       <w:sz w:val="26"/>
     </w:rPr>
   </w:style>
-  <w:style w:type="paragraph" w:styleId="Caption">
+  <w:style w:type="paragraph" w:styleId="Lgende">
     <w:name w:val="caption"/>
     <w:basedOn w:val="Normal"/>
     <w:next w:val="Normal"/>
@@ -9957,7 +9914,7 @@
       <w:szCs w:val="18"/>
     </w:rPr>
   </w:style>
-  <w:style w:type="paragraph" w:styleId="TableofFigures">
+  <w:style w:type="paragraph" w:styleId="Tabledesillustrations">
     <w:name w:val="table of figures"/>
     <w:basedOn w:val="Normal"/>
     <w:next w:val="Normal"/>
@@ -9976,9 +9933,9 @@
       <w:szCs w:val="20"/>
     </w:rPr>
   </w:style>
-  <w:style w:type="character" w:styleId="Hyperlink">
+  <w:style w:type="character" w:styleId="Lienhypertexte">
     <w:name w:val="Hyperlink"/>
-    <w:basedOn w:val="DefaultParagraphFont"/>
+    <w:basedOn w:val="Policepardfaut"/>
     <w:uiPriority w:val="99"/>
     <w:unhideWhenUsed/>
     <w:rsid w:val="00690538"/>
@@ -9987,9 +9944,9 @@
       <w:u w:val="single"/>
     </w:rPr>
   </w:style>
-  <w:style w:type="table" w:styleId="TableGrid">
+  <w:style w:type="table" w:styleId="Grilledutableau">
     <w:name w:val="Table Grid"/>
-    <w:basedOn w:val="TableNormal"/>
+    <w:basedOn w:val="TableauNormal"/>
     <w:uiPriority w:val="39"/>
     <w:rsid w:val="00690538"/>
     <w:pPr>
@@ -10006,7 +9963,7 @@
       </w:tblBorders>
     </w:tblPr>
   </w:style>
-  <w:style w:type="paragraph" w:styleId="TOC1">
+  <w:style w:type="paragraph" w:styleId="TM1">
     <w:name w:val="toc 1"/>
     <w:basedOn w:val="Normal"/>
     <w:next w:val="Normal"/>
@@ -10028,7 +9985,7 @@
       <w:szCs w:val="24"/>
     </w:rPr>
   </w:style>
-  <w:style w:type="paragraph" w:styleId="TOC2">
+  <w:style w:type="paragraph" w:styleId="TM2">
     <w:name w:val="toc 2"/>
     <w:basedOn w:val="Normal"/>
     <w:next w:val="Normal"/>
@@ -10048,7 +10005,7 @@
       <w:sz w:val="22"/>
     </w:rPr>
   </w:style>
-  <w:style w:type="paragraph" w:styleId="TOC3">
+  <w:style w:type="paragraph" w:styleId="TM3">
     <w:name w:val="toc 3"/>
     <w:basedOn w:val="Normal"/>
     <w:next w:val="Normal"/>
@@ -10067,7 +10024,7 @@
       <w:szCs w:val="20"/>
     </w:rPr>
   </w:style>
-  <w:style w:type="paragraph" w:styleId="TOC4">
+  <w:style w:type="paragraph" w:styleId="TM4">
     <w:name w:val="toc 4"/>
     <w:basedOn w:val="Normal"/>
     <w:next w:val="Normal"/>
@@ -10086,7 +10043,7 @@
       <w:szCs w:val="20"/>
     </w:rPr>
   </w:style>
-  <w:style w:type="paragraph" w:styleId="TOC5">
+  <w:style w:type="paragraph" w:styleId="TM5">
     <w:name w:val="toc 5"/>
     <w:basedOn w:val="Normal"/>
     <w:next w:val="Normal"/>
@@ -10105,7 +10062,7 @@
       <w:szCs w:val="20"/>
     </w:rPr>
   </w:style>
-  <w:style w:type="paragraph" w:styleId="TOC6">
+  <w:style w:type="paragraph" w:styleId="TM6">
     <w:name w:val="toc 6"/>
     <w:basedOn w:val="Normal"/>
     <w:next w:val="Normal"/>
@@ -10124,7 +10081,7 @@
       <w:szCs w:val="20"/>
     </w:rPr>
   </w:style>
-  <w:style w:type="paragraph" w:styleId="TOC7">
+  <w:style w:type="paragraph" w:styleId="TM7">
     <w:name w:val="toc 7"/>
     <w:basedOn w:val="Normal"/>
     <w:next w:val="Normal"/>
@@ -10143,7 +10100,7 @@
       <w:szCs w:val="20"/>
     </w:rPr>
   </w:style>
-  <w:style w:type="paragraph" w:styleId="TOC8">
+  <w:style w:type="paragraph" w:styleId="TM8">
     <w:name w:val="toc 8"/>
     <w:basedOn w:val="Normal"/>
     <w:next w:val="Normal"/>
@@ -10162,7 +10119,7 @@
       <w:szCs w:val="20"/>
     </w:rPr>
   </w:style>
-  <w:style w:type="paragraph" w:styleId="TOC9">
+  <w:style w:type="paragraph" w:styleId="TM9">
     <w:name w:val="toc 9"/>
     <w:basedOn w:val="Normal"/>
     <w:next w:val="Normal"/>
@@ -10181,10 +10138,10 @@
       <w:szCs w:val="20"/>
     </w:rPr>
   </w:style>
-  <w:style w:type="paragraph" w:styleId="EndnoteText">
+  <w:style w:type="paragraph" w:styleId="Notedefin">
     <w:name w:val="endnote text"/>
     <w:basedOn w:val="Normal"/>
-    <w:link w:val="EndnoteTextChar"/>
+    <w:link w:val="NotedefinCar"/>
     <w:uiPriority w:val="99"/>
     <w:semiHidden/>
     <w:unhideWhenUsed/>
@@ -10197,10 +10154,10 @@
       <w:szCs w:val="20"/>
     </w:rPr>
   </w:style>
-  <w:style w:type="character" w:customStyle="1" w:styleId="EndnoteTextChar">
-    <w:name w:val="Endnote Text Char"/>
-    <w:basedOn w:val="DefaultParagraphFont"/>
-    <w:link w:val="EndnoteText"/>
+  <w:style w:type="character" w:customStyle="1" w:styleId="NotedefinCar">
+    <w:name w:val="Note de fin Car"/>
+    <w:basedOn w:val="Policepardfaut"/>
+    <w:link w:val="Notedefin"/>
     <w:uiPriority w:val="99"/>
     <w:semiHidden/>
     <w:rsid w:val="00236126"/>
@@ -10210,9 +10167,9 @@
       <w:szCs w:val="20"/>
     </w:rPr>
   </w:style>
-  <w:style w:type="character" w:styleId="EndnoteReference">
+  <w:style w:type="character" w:styleId="Appeldenotedefin">
     <w:name w:val="endnote reference"/>
-    <w:basedOn w:val="DefaultParagraphFont"/>
+    <w:basedOn w:val="Policepardfaut"/>
     <w:uiPriority w:val="99"/>
     <w:semiHidden/>
     <w:unhideWhenUsed/>
@@ -10221,10 +10178,10 @@
       <w:vertAlign w:val="superscript"/>
     </w:rPr>
   </w:style>
-  <w:style w:type="paragraph" w:styleId="FootnoteText">
+  <w:style w:type="paragraph" w:styleId="Notedebasdepage">
     <w:name w:val="footnote text"/>
     <w:basedOn w:val="Normal"/>
-    <w:link w:val="FootnoteTextChar"/>
+    <w:link w:val="NotedebasdepageCar"/>
     <w:uiPriority w:val="99"/>
     <w:semiHidden/>
     <w:unhideWhenUsed/>
@@ -10237,10 +10194,10 @@
       <w:szCs w:val="20"/>
     </w:rPr>
   </w:style>
-  <w:style w:type="character" w:customStyle="1" w:styleId="FootnoteTextChar">
-    <w:name w:val="Footnote Text Char"/>
-    <w:basedOn w:val="DefaultParagraphFont"/>
-    <w:link w:val="FootnoteText"/>
+  <w:style w:type="character" w:customStyle="1" w:styleId="NotedebasdepageCar">
+    <w:name w:val="Note de bas de page Car"/>
+    <w:basedOn w:val="Policepardfaut"/>
+    <w:link w:val="Notedebasdepage"/>
     <w:uiPriority w:val="99"/>
     <w:semiHidden/>
     <w:rsid w:val="00FE399E"/>
@@ -10250,9 +10207,9 @@
       <w:szCs w:val="20"/>
     </w:rPr>
   </w:style>
-  <w:style w:type="character" w:styleId="FootnoteReference">
+  <w:style w:type="character" w:styleId="Appelnotedebasdep">
     <w:name w:val="footnote reference"/>
-    <w:basedOn w:val="DefaultParagraphFont"/>
+    <w:basedOn w:val="Policepardfaut"/>
     <w:uiPriority w:val="99"/>
     <w:semiHidden/>
     <w:unhideWhenUsed/>
@@ -10261,7 +10218,7 @@
       <w:vertAlign w:val="superscript"/>
     </w:rPr>
   </w:style>
-  <w:style w:type="paragraph" w:styleId="Bibliography">
+  <w:style w:type="paragraph" w:styleId="Bibliographie">
     <w:name w:val="Bibliography"/>
     <w:basedOn w:val="Normal"/>
     <w:next w:val="Normal"/>
@@ -10269,9 +10226,9 @@
     <w:unhideWhenUsed/>
     <w:rsid w:val="00910500"/>
   </w:style>
-  <w:style w:type="character" w:styleId="FollowedHyperlink">
+  <w:style w:type="character" w:styleId="Lienhypertextesuivivisit">
     <w:name w:val="FollowedHyperlink"/>
-    <w:basedOn w:val="DefaultParagraphFont"/>
+    <w:basedOn w:val="Policepardfaut"/>
     <w:uiPriority w:val="99"/>
     <w:semiHidden/>
     <w:unhideWhenUsed/>

</xml_diff>